<commit_message>
Paperback: rebuilt front matter, LEFT headings, reduced spacing, fixed bullets
</commit_message>
<xml_diff>
--- a/kdp-files/difficult_conversations_paperback.docx
+++ b/kdp-files/difficult_conversations_paperback.docx
@@ -4,1393 +4,1499 @@
   <w:body>
     <w:p>
       <w:pPr>
-        <w:spacing w:before="0" w:after="0"/>
-      </w:pPr>
-      <w:r>
-        <w:rPr>
-          <w:rFonts w:ascii="Georgia" w:hAnsi="Georgia" w:cs="Georgia"/>
-          <w:b w:val="0"/>
-          <w:i w:val="0"/>
-          <w:sz w:val="22"/>
-        </w:rPr>
-      </w:r>
-    </w:p>
-    <w:p>
-      <w:pPr>
-        <w:spacing w:before="0" w:after="0"/>
-      </w:pPr>
-      <w:r>
-        <w:rPr>
-          <w:rFonts w:ascii="Georgia" w:hAnsi="Georgia" w:cs="Georgia"/>
-          <w:b w:val="0"/>
-          <w:i w:val="0"/>
-          <w:sz w:val="22"/>
-        </w:rPr>
-      </w:r>
-    </w:p>
-    <w:p>
-      <w:pPr>
-        <w:spacing w:before="0" w:after="0"/>
-      </w:pPr>
-      <w:r>
-        <w:rPr>
-          <w:rFonts w:ascii="Georgia" w:hAnsi="Georgia" w:cs="Georgia"/>
-          <w:b w:val="0"/>
-          <w:i w:val="0"/>
-          <w:sz w:val="22"/>
-        </w:rPr>
-      </w:r>
-    </w:p>
-    <w:p>
-      <w:pPr>
-        <w:spacing w:before="0" w:after="0"/>
-      </w:pPr>
-      <w:r>
-        <w:rPr>
-          <w:rFonts w:ascii="Georgia" w:hAnsi="Georgia" w:cs="Georgia"/>
-          <w:b w:val="0"/>
-          <w:i w:val="0"/>
-          <w:sz w:val="22"/>
-        </w:rPr>
-      </w:r>
-    </w:p>
-    <w:p>
-      <w:pPr>
-        <w:spacing w:before="0" w:after="0"/>
-      </w:pPr>
-      <w:r>
-        <w:rPr>
-          <w:rFonts w:ascii="Georgia" w:hAnsi="Georgia" w:cs="Georgia"/>
-          <w:b w:val="0"/>
-          <w:i w:val="0"/>
-          <w:sz w:val="22"/>
-        </w:rPr>
-      </w:r>
-    </w:p>
-    <w:p>
-      <w:pPr>
-        <w:spacing w:before="0" w:after="0"/>
-      </w:pPr>
-      <w:r>
-        <w:rPr>
-          <w:rFonts w:ascii="Georgia" w:hAnsi="Georgia" w:cs="Georgia"/>
-          <w:b w:val="0"/>
-          <w:i w:val="0"/>
-          <w:sz w:val="22"/>
-        </w:rPr>
-      </w:r>
-    </w:p>
-    <w:p>
-      <w:pPr>
-        <w:spacing w:before="0" w:after="0"/>
-      </w:pPr>
-      <w:r>
-        <w:rPr>
-          <w:rFonts w:ascii="Georgia" w:hAnsi="Georgia" w:cs="Georgia"/>
-          <w:b w:val="0"/>
-          <w:i w:val="0"/>
-          <w:sz w:val="22"/>
-        </w:rPr>
-      </w:r>
-    </w:p>
-    <w:p>
-      <w:pPr>
-        <w:spacing w:before="0" w:after="0"/>
-      </w:pPr>
-      <w:r>
-        <w:rPr>
-          <w:rFonts w:ascii="Georgia" w:hAnsi="Georgia" w:cs="Georgia"/>
-          <w:b w:val="0"/>
-          <w:i w:val="0"/>
-          <w:sz w:val="22"/>
-        </w:rPr>
-      </w:r>
-    </w:p>
-    <w:p>
-      <w:pPr>
-        <w:spacing w:before="0" w:after="0" w:line="276" w:lineRule="auto"/>
-        <w:jc w:val="both"/>
-        <w:ind w:left="0" w:firstLine="288"/>
-      </w:pPr>
-      <w:r>
-        <w:rPr>
-          <w:rFonts w:ascii="Georgia" w:hAnsi="Georgia" w:cs="Georgia"/>
+        <w:rPr>
+          <w:sz w:val="12"/>
+          <w:szCs w:val="12"/>
+        </w:rPr>
+        <w:ind w:left="0" w:firstLine="0"/>
+        <w:spacing w:after="0" w:before="0" w:line="240" w:lineRule="auto"/>
+      </w:pPr>
+    </w:p>
+    <w:p>
+      <w:pPr>
+        <w:rPr>
+          <w:sz w:val="12"/>
+          <w:szCs w:val="12"/>
+        </w:rPr>
+        <w:ind w:left="0" w:firstLine="0"/>
+        <w:spacing w:after="0" w:before="0" w:line="240" w:lineRule="auto"/>
+      </w:pPr>
+    </w:p>
+    <w:p>
+      <w:pPr>
+        <w:rPr>
+          <w:sz w:val="12"/>
+          <w:szCs w:val="12"/>
+        </w:rPr>
+        <w:ind w:left="0" w:firstLine="0"/>
+        <w:spacing w:after="0" w:before="0" w:line="240" w:lineRule="auto"/>
+      </w:pPr>
+    </w:p>
+    <w:p>
+      <w:pPr>
+        <w:rPr>
+          <w:sz w:val="12"/>
+          <w:szCs w:val="12"/>
+        </w:rPr>
+        <w:ind w:left="0" w:firstLine="0"/>
+        <w:spacing w:after="0" w:before="0" w:line="240" w:lineRule="auto"/>
+      </w:pPr>
+    </w:p>
+    <w:p>
+      <w:pPr>
+        <w:rPr>
+          <w:sz w:val="12"/>
+          <w:szCs w:val="12"/>
+        </w:rPr>
+        <w:ind w:left="0" w:firstLine="0"/>
+        <w:spacing w:after="0" w:before="0" w:line="240" w:lineRule="auto"/>
+      </w:pPr>
+    </w:p>
+    <w:p>
+      <w:pPr>
+        <w:rPr>
+          <w:sz w:val="12"/>
+          <w:szCs w:val="12"/>
+        </w:rPr>
+        <w:ind w:left="0" w:firstLine="0"/>
+        <w:spacing w:after="0" w:before="0" w:line="240" w:lineRule="auto"/>
+      </w:pPr>
+    </w:p>
+    <w:p>
+      <w:pPr>
+        <w:rPr>
+          <w:sz w:val="12"/>
+          <w:szCs w:val="12"/>
+        </w:rPr>
+        <w:ind w:left="0" w:firstLine="0"/>
+        <w:spacing w:after="0" w:before="0" w:line="240" w:lineRule="auto"/>
+      </w:pPr>
+    </w:p>
+    <w:p>
+      <w:pPr>
+        <w:rPr>
+          <w:sz w:val="12"/>
+          <w:szCs w:val="12"/>
+        </w:rPr>
+        <w:ind w:left="0" w:firstLine="0"/>
+        <w:spacing w:after="0" w:before="0" w:line="240" w:lineRule="auto"/>
+      </w:pPr>
+    </w:p>
+    <w:p>
+      <w:pPr>
+        <w:rPr>
+          <w:sz w:val="12"/>
+          <w:szCs w:val="12"/>
+        </w:rPr>
+        <w:ind w:left="0" w:firstLine="0"/>
+        <w:spacing w:after="0" w:before="0" w:line="240" w:lineRule="auto"/>
+      </w:pPr>
+    </w:p>
+    <w:p>
+      <w:pPr>
+        <w:rPr>
+          <w:sz w:val="12"/>
+          <w:szCs w:val="12"/>
+        </w:rPr>
+        <w:ind w:left="0" w:firstLine="0"/>
+        <w:spacing w:after="0" w:before="0" w:line="240" w:lineRule="auto"/>
+      </w:pPr>
+    </w:p>
+    <w:p>
+      <w:pPr>
+        <w:rPr>
+          <w:sz w:val="12"/>
+          <w:szCs w:val="12"/>
+        </w:rPr>
+        <w:ind w:left="0" w:firstLine="0"/>
+        <w:spacing w:after="0" w:before="0" w:line="240" w:lineRule="auto"/>
+      </w:pPr>
+    </w:p>
+    <w:p>
+      <w:pPr>
+        <w:rPr>
+          <w:sz w:val="12"/>
+          <w:szCs w:val="12"/>
+        </w:rPr>
+        <w:ind w:left="0" w:firstLine="0"/>
+        <w:spacing w:after="0" w:before="0" w:line="240" w:lineRule="auto"/>
+      </w:pPr>
+    </w:p>
+    <w:p>
+      <w:pPr>
+        <w:rPr>
+          <w:sz w:val="12"/>
+          <w:szCs w:val="12"/>
+        </w:rPr>
+        <w:ind w:left="0" w:firstLine="0"/>
+        <w:spacing w:after="0" w:before="0" w:line="240" w:lineRule="auto"/>
+      </w:pPr>
+    </w:p>
+    <w:p>
+      <w:pPr>
+        <w:rPr>
+          <w:sz w:val="12"/>
+          <w:szCs w:val="12"/>
+        </w:rPr>
+        <w:ind w:left="0" w:firstLine="0"/>
+        <w:spacing w:after="0" w:before="0" w:line="240" w:lineRule="auto"/>
+      </w:pPr>
+    </w:p>
+    <w:p>
+      <w:pPr>
+        <w:rPr>
+          <w:sz w:val="12"/>
+          <w:szCs w:val="12"/>
+        </w:rPr>
+        <w:ind w:left="0" w:firstLine="0"/>
+        <w:spacing w:after="0" w:before="0" w:line="240" w:lineRule="auto"/>
+      </w:pPr>
+    </w:p>
+    <w:p>
+      <w:pPr>
+        <w:rPr>
+          <w:sz w:val="12"/>
+          <w:szCs w:val="12"/>
+        </w:rPr>
+        <w:ind w:left="0" w:firstLine="0"/>
+        <w:spacing w:after="0" w:before="0" w:line="240" w:lineRule="auto"/>
+      </w:pPr>
+    </w:p>
+    <w:p>
+      <w:pPr>
+        <w:rPr>
+          <w:sz w:val="12"/>
+          <w:szCs w:val="12"/>
+        </w:rPr>
+        <w:ind w:left="0" w:firstLine="0"/>
+        <w:spacing w:after="0" w:before="0" w:line="240" w:lineRule="auto"/>
+      </w:pPr>
+    </w:p>
+    <w:p>
+      <w:pPr>
+        <w:rPr>
+          <w:sz w:val="12"/>
+          <w:szCs w:val="12"/>
+        </w:rPr>
+        <w:ind w:left="0" w:firstLine="0"/>
+        <w:spacing w:after="0" w:before="0" w:line="240" w:lineRule="auto"/>
+      </w:pPr>
+    </w:p>
+    <w:p>
+      <w:pPr>
+        <w:jc w:val="center"/>
+        <w:ind w:left="0" w:firstLine="0"/>
+        <w:spacing w:after="0" w:before="0" w:line="240" w:lineRule="auto"/>
+      </w:pPr>
+      <w:r>
+        <w:rPr>
+          <w:rFonts w:ascii="Georgia" w:hAnsi="Georgia" w:cs="Georgia"/>
+          <w:sz w:val="32"/>
+          <w:szCs w:val="32"/>
           <w:b/>
-          <w:i w:val="0"/>
+          <w:bCs/>
+        </w:rPr>
+        <w:t xml:space="preserve">The Manager’s Guide to Difficult Conversations</w:t>
+      </w:r>
+    </w:p>
+    <w:p>
+      <w:pPr>
+        <w:ind w:left="0" w:firstLine="0"/>
+        <w:spacing w:after="0" w:before="0" w:line="240" w:lineRule="auto"/>
+      </w:pPr>
+      <w:r>
+        <w:br w:type="page"/>
+      </w:r>
+    </w:p>
+    <w:p>
+      <w:pPr>
+        <w:rPr>
+          <w:sz w:val="12"/>
+          <w:szCs w:val="12"/>
+        </w:rPr>
+        <w:ind w:left="0" w:firstLine="0"/>
+        <w:spacing w:after="0" w:before="0" w:line="240" w:lineRule="auto"/>
+      </w:pPr>
+    </w:p>
+    <w:p>
+      <w:pPr>
+        <w:rPr>
+          <w:sz w:val="12"/>
+          <w:szCs w:val="12"/>
+        </w:rPr>
+        <w:ind w:left="0" w:firstLine="0"/>
+        <w:spacing w:after="0" w:before="0" w:line="240" w:lineRule="auto"/>
+      </w:pPr>
+    </w:p>
+    <w:p>
+      <w:pPr>
+        <w:rPr>
+          <w:sz w:val="12"/>
+          <w:szCs w:val="12"/>
+        </w:rPr>
+        <w:ind w:left="0" w:firstLine="0"/>
+        <w:spacing w:after="0" w:before="0" w:line="240" w:lineRule="auto"/>
+      </w:pPr>
+    </w:p>
+    <w:p>
+      <w:pPr>
+        <w:rPr>
+          <w:sz w:val="12"/>
+          <w:szCs w:val="12"/>
+        </w:rPr>
+        <w:ind w:left="0" w:firstLine="0"/>
+        <w:spacing w:after="0" w:before="0" w:line="240" w:lineRule="auto"/>
+      </w:pPr>
+    </w:p>
+    <w:p>
+      <w:pPr>
+        <w:rPr>
+          <w:sz w:val="12"/>
+          <w:szCs w:val="12"/>
+        </w:rPr>
+        <w:ind w:left="0" w:firstLine="0"/>
+        <w:spacing w:after="0" w:before="0" w:line="240" w:lineRule="auto"/>
+      </w:pPr>
+    </w:p>
+    <w:p>
+      <w:pPr>
+        <w:rPr>
+          <w:sz w:val="12"/>
+          <w:szCs w:val="12"/>
+        </w:rPr>
+        <w:ind w:left="0" w:firstLine="0"/>
+        <w:spacing w:after="0" w:before="0" w:line="240" w:lineRule="auto"/>
+      </w:pPr>
+    </w:p>
+    <w:p>
+      <w:pPr>
+        <w:rPr>
+          <w:sz w:val="12"/>
+          <w:szCs w:val="12"/>
+        </w:rPr>
+        <w:ind w:left="0" w:firstLine="0"/>
+        <w:spacing w:after="0" w:before="0" w:line="240" w:lineRule="auto"/>
+      </w:pPr>
+    </w:p>
+    <w:p>
+      <w:pPr>
+        <w:rPr>
+          <w:sz w:val="12"/>
+          <w:szCs w:val="12"/>
+        </w:rPr>
+        <w:ind w:left="0" w:firstLine="0"/>
+        <w:spacing w:after="0" w:before="0" w:line="240" w:lineRule="auto"/>
+      </w:pPr>
+    </w:p>
+    <w:p>
+      <w:pPr>
+        <w:rPr>
+          <w:sz w:val="12"/>
+          <w:szCs w:val="12"/>
+        </w:rPr>
+        <w:ind w:left="0" w:firstLine="0"/>
+        <w:spacing w:after="0" w:before="0" w:line="240" w:lineRule="auto"/>
+      </w:pPr>
+    </w:p>
+    <w:p>
+      <w:pPr>
+        <w:rPr>
+          <w:sz w:val="12"/>
+          <w:szCs w:val="12"/>
+        </w:rPr>
+        <w:ind w:left="0" w:firstLine="0"/>
+        <w:spacing w:after="0" w:before="0" w:line="240" w:lineRule="auto"/>
+      </w:pPr>
+    </w:p>
+    <w:p>
+      <w:pPr>
+        <w:rPr>
+          <w:sz w:val="12"/>
+          <w:szCs w:val="12"/>
+        </w:rPr>
+        <w:ind w:left="0" w:firstLine="0"/>
+        <w:spacing w:after="0" w:before="0" w:line="240" w:lineRule="auto"/>
+      </w:pPr>
+    </w:p>
+    <w:p>
+      <w:pPr>
+        <w:rPr>
+          <w:sz w:val="12"/>
+          <w:szCs w:val="12"/>
+        </w:rPr>
+        <w:ind w:left="0" w:firstLine="0"/>
+        <w:spacing w:after="0" w:before="0" w:line="240" w:lineRule="auto"/>
+      </w:pPr>
+    </w:p>
+    <w:p>
+      <w:pPr>
+        <w:jc w:val="center"/>
+        <w:ind w:left="0" w:firstLine="0"/>
+        <w:spacing w:after="0" w:before="0" w:line="240" w:lineRule="auto"/>
+      </w:pPr>
+      <w:r>
+        <w:rPr>
+          <w:rFonts w:ascii="Georgia" w:hAnsi="Georgia" w:cs="Georgia"/>
           <w:sz w:val="40"/>
-        </w:rPr>
-        <w:t>The Manager's Guide to Difficult Conversations</w:t>
-      </w:r>
-    </w:p>
-    <w:p>
+          <w:szCs w:val="40"/>
+          <w:b/>
+          <w:bCs/>
+        </w:rPr>
+        <w:t xml:space="preserve">The Manager’s Guide to Difficult Conversations</w:t>
+      </w:r>
+    </w:p>
+    <w:p>
+      <w:pPr>
+        <w:rPr>
+          <w:sz w:val="24"/>
+          <w:szCs w:val="24"/>
+        </w:rPr>
+        <w:ind w:left="0" w:firstLine="0"/>
+        <w:spacing w:after="0" w:before="0" w:line="240" w:lineRule="auto"/>
+      </w:pPr>
+    </w:p>
+    <w:p>
+      <w:pPr>
+        <w:jc w:val="center"/>
+        <w:ind w:left="0" w:firstLine="0"/>
+        <w:spacing w:after="0" w:before="0" w:line="240" w:lineRule="auto"/>
+      </w:pPr>
+      <w:r>
+        <w:rPr>
+          <w:rFonts w:ascii="Georgia" w:hAnsi="Georgia" w:cs="Georgia"/>
+          <w:sz w:val="24"/>
+          <w:szCs w:val="24"/>
+        </w:rPr>
+        <w:t xml:space="preserve">Word-for-Word Scripts and Neuroscience Strategies for Remote, Hybrid, and In-Person Teams</w:t>
+      </w:r>
+    </w:p>
+    <w:p>
+      <w:pPr>
+        <w:rPr>
+          <w:sz w:val="12"/>
+          <w:szCs w:val="12"/>
+        </w:rPr>
+        <w:ind w:left="0" w:firstLine="0"/>
+        <w:spacing w:after="0" w:before="0" w:line="240" w:lineRule="auto"/>
+      </w:pPr>
+    </w:p>
+    <w:p>
+      <w:pPr>
+        <w:rPr>
+          <w:sz w:val="12"/>
+          <w:szCs w:val="12"/>
+        </w:rPr>
+        <w:ind w:left="0" w:firstLine="0"/>
+        <w:spacing w:after="0" w:before="0" w:line="240" w:lineRule="auto"/>
+      </w:pPr>
+    </w:p>
+    <w:p>
+      <w:pPr>
+        <w:rPr>
+          <w:sz w:val="12"/>
+          <w:szCs w:val="12"/>
+        </w:rPr>
+        <w:ind w:left="0" w:firstLine="0"/>
+        <w:spacing w:after="0" w:before="0" w:line="240" w:lineRule="auto"/>
+      </w:pPr>
+    </w:p>
+    <w:p>
+      <w:pPr>
+        <w:rPr>
+          <w:sz w:val="12"/>
+          <w:szCs w:val="12"/>
+        </w:rPr>
+        <w:ind w:left="0" w:firstLine="0"/>
+        <w:spacing w:after="0" w:before="0" w:line="240" w:lineRule="auto"/>
+      </w:pPr>
+    </w:p>
+    <w:p>
+      <w:pPr>
+        <w:rPr>
+          <w:sz w:val="12"/>
+          <w:szCs w:val="12"/>
+        </w:rPr>
+        <w:ind w:left="0" w:firstLine="0"/>
+        <w:spacing w:after="0" w:before="0" w:line="240" w:lineRule="auto"/>
+      </w:pPr>
+    </w:p>
+    <w:p>
+      <w:pPr>
+        <w:rPr>
+          <w:sz w:val="12"/>
+          <w:szCs w:val="12"/>
+        </w:rPr>
+        <w:ind w:left="0" w:firstLine="0"/>
+        <w:spacing w:after="0" w:before="0" w:line="240" w:lineRule="auto"/>
+      </w:pPr>
+    </w:p>
+    <w:p>
+      <w:pPr>
+        <w:rPr>
+          <w:sz w:val="12"/>
+          <w:szCs w:val="12"/>
+        </w:rPr>
+        <w:ind w:left="0" w:firstLine="0"/>
+        <w:spacing w:after="0" w:before="0" w:line="240" w:lineRule="auto"/>
+      </w:pPr>
+    </w:p>
+    <w:p>
+      <w:pPr>
+        <w:rPr>
+          <w:sz w:val="12"/>
+          <w:szCs w:val="12"/>
+        </w:rPr>
+        <w:ind w:left="0" w:firstLine="0"/>
+        <w:spacing w:after="0" w:before="0" w:line="240" w:lineRule="auto"/>
+      </w:pPr>
+    </w:p>
+    <w:p>
+      <w:pPr>
+        <w:rPr>
+          <w:sz w:val="12"/>
+          <w:szCs w:val="12"/>
+        </w:rPr>
+        <w:ind w:left="0" w:firstLine="0"/>
+        <w:spacing w:after="0" w:before="0" w:line="240" w:lineRule="auto"/>
+      </w:pPr>
+    </w:p>
+    <w:p>
+      <w:pPr>
+        <w:rPr>
+          <w:sz w:val="12"/>
+          <w:szCs w:val="12"/>
+        </w:rPr>
+        <w:ind w:left="0" w:firstLine="0"/>
+        <w:spacing w:after="0" w:before="0" w:line="240" w:lineRule="auto"/>
+      </w:pPr>
+    </w:p>
+    <w:p>
+      <w:pPr>
+        <w:rPr>
+          <w:sz w:val="12"/>
+          <w:szCs w:val="12"/>
+        </w:rPr>
+        <w:ind w:left="0" w:firstLine="0"/>
+        <w:spacing w:after="0" w:before="0" w:line="240" w:lineRule="auto"/>
+      </w:pPr>
+    </w:p>
+    <w:p>
+      <w:pPr>
+        <w:rPr>
+          <w:sz w:val="12"/>
+          <w:szCs w:val="12"/>
+        </w:rPr>
+        <w:ind w:left="0" w:firstLine="0"/>
+        <w:spacing w:after="0" w:before="0" w:line="240" w:lineRule="auto"/>
+      </w:pPr>
+    </w:p>
+    <w:p>
+      <w:pPr>
+        <w:jc w:val="center"/>
+        <w:ind w:left="0" w:firstLine="0"/>
+        <w:spacing w:after="0" w:before="0" w:line="240" w:lineRule="auto"/>
+      </w:pPr>
+      <w:r>
+        <w:rPr>
+          <w:rFonts w:ascii="Georgia" w:hAnsi="Georgia" w:cs="Georgia"/>
+          <w:sz w:val="28"/>
+          <w:szCs w:val="28"/>
+        </w:rPr>
+        <w:t xml:space="preserve">Lana Wray</w:t>
+      </w:r>
+    </w:p>
+    <w:p>
+      <w:pPr>
+        <w:ind w:left="0" w:firstLine="0"/>
+        <w:spacing w:after="0" w:before="0" w:line="240" w:lineRule="auto"/>
+      </w:pPr>
       <w:r>
         <w:br w:type="page"/>
       </w:r>
     </w:p>
     <w:p>
       <w:pPr>
-        <w:spacing w:before="0" w:after="0"/>
-      </w:pPr>
-      <w:r>
-        <w:rPr>
-          <w:rFonts w:ascii="Georgia" w:hAnsi="Georgia" w:cs="Georgia"/>
-          <w:b w:val="0"/>
-          <w:i w:val="0"/>
-          <w:sz w:val="22"/>
-        </w:rPr>
-      </w:r>
-    </w:p>
-    <w:p>
-      <w:pPr>
-        <w:spacing w:before="0" w:after="0"/>
-      </w:pPr>
-      <w:r>
-        <w:rPr>
-          <w:rFonts w:ascii="Georgia" w:hAnsi="Georgia" w:cs="Georgia"/>
-          <w:b w:val="0"/>
-          <w:i w:val="0"/>
-          <w:sz w:val="22"/>
-        </w:rPr>
-      </w:r>
-    </w:p>
-    <w:p>
-      <w:pPr>
-        <w:spacing w:before="0" w:after="0"/>
-      </w:pPr>
-      <w:r>
-        <w:rPr>
-          <w:rFonts w:ascii="Georgia" w:hAnsi="Georgia" w:cs="Georgia"/>
-          <w:b w:val="0"/>
-          <w:i w:val="0"/>
-          <w:sz w:val="22"/>
-        </w:rPr>
-      </w:r>
-    </w:p>
-    <w:p>
-      <w:pPr>
-        <w:spacing w:before="0" w:after="0"/>
-      </w:pPr>
-      <w:r>
-        <w:rPr>
-          <w:rFonts w:ascii="Georgia" w:hAnsi="Georgia" w:cs="Georgia"/>
-          <w:b w:val="0"/>
-          <w:i w:val="0"/>
-          <w:sz w:val="22"/>
-        </w:rPr>
-      </w:r>
-    </w:p>
-    <w:p>
-      <w:pPr>
-        <w:spacing w:before="0" w:after="0"/>
-      </w:pPr>
-      <w:r>
-        <w:rPr>
-          <w:rFonts w:ascii="Georgia" w:hAnsi="Georgia" w:cs="Georgia"/>
-          <w:b w:val="0"/>
-          <w:i w:val="0"/>
-          <w:sz w:val="22"/>
-        </w:rPr>
-      </w:r>
-    </w:p>
-    <w:p>
-      <w:pPr>
-        <w:spacing w:before="0" w:after="240" w:line="276" w:lineRule="auto"/>
-        <w:jc w:val="both"/>
-        <w:ind w:left="0" w:firstLine="288"/>
-      </w:pPr>
-      <w:r>
-        <w:rPr>
-          <w:rFonts w:ascii="Georgia" w:hAnsi="Georgia" w:cs="Georgia"/>
+        <w:rPr>
+          <w:sz w:val="12"/>
+          <w:szCs w:val="12"/>
+        </w:rPr>
+        <w:ind w:left="0" w:firstLine="0"/>
+        <w:spacing w:after="0" w:before="0" w:line="240" w:lineRule="auto"/>
+      </w:pPr>
+    </w:p>
+    <w:p>
+      <w:pPr>
+        <w:rPr>
+          <w:sz w:val="12"/>
+          <w:szCs w:val="12"/>
+        </w:rPr>
+        <w:ind w:left="0" w:firstLine="0"/>
+        <w:spacing w:after="0" w:before="0" w:line="240" w:lineRule="auto"/>
+      </w:pPr>
+    </w:p>
+    <w:p>
+      <w:pPr>
+        <w:rPr>
+          <w:sz w:val="12"/>
+          <w:szCs w:val="12"/>
+        </w:rPr>
+        <w:ind w:left="0" w:firstLine="0"/>
+        <w:spacing w:after="0" w:before="0" w:line="240" w:lineRule="auto"/>
+      </w:pPr>
+    </w:p>
+    <w:p>
+      <w:pPr>
+        <w:rPr>
+          <w:sz w:val="12"/>
+          <w:szCs w:val="12"/>
+        </w:rPr>
+        <w:ind w:left="0" w:firstLine="0"/>
+        <w:spacing w:after="0" w:before="0" w:line="240" w:lineRule="auto"/>
+      </w:pPr>
+    </w:p>
+    <w:p>
+      <w:pPr>
+        <w:rPr>
+          <w:sz w:val="12"/>
+          <w:szCs w:val="12"/>
+        </w:rPr>
+        <w:ind w:left="0" w:firstLine="0"/>
+        <w:spacing w:after="0" w:before="0" w:line="240" w:lineRule="auto"/>
+      </w:pPr>
+    </w:p>
+    <w:p>
+      <w:pPr>
+        <w:rPr>
+          <w:sz w:val="12"/>
+          <w:szCs w:val="12"/>
+        </w:rPr>
+        <w:ind w:left="0" w:firstLine="0"/>
+        <w:spacing w:after="0" w:before="0" w:line="240" w:lineRule="auto"/>
+      </w:pPr>
+    </w:p>
+    <w:p>
+      <w:pPr>
+        <w:rPr>
+          <w:sz w:val="12"/>
+          <w:szCs w:val="12"/>
+        </w:rPr>
+        <w:ind w:left="0" w:firstLine="0"/>
+        <w:spacing w:after="0" w:before="0" w:line="240" w:lineRule="auto"/>
+      </w:pPr>
+    </w:p>
+    <w:p>
+      <w:pPr>
+        <w:rPr>
+          <w:sz w:val="12"/>
+          <w:szCs w:val="12"/>
+        </w:rPr>
+        <w:ind w:left="0" w:firstLine="0"/>
+        <w:spacing w:after="0" w:before="0" w:line="240" w:lineRule="auto"/>
+      </w:pPr>
+    </w:p>
+    <w:p>
+      <w:pPr>
+        <w:rPr>
+          <w:sz w:val="12"/>
+          <w:szCs w:val="12"/>
+        </w:rPr>
+        <w:ind w:left="0" w:firstLine="0"/>
+        <w:spacing w:after="0" w:before="0" w:line="240" w:lineRule="auto"/>
+      </w:pPr>
+    </w:p>
+    <w:p>
+      <w:pPr>
+        <w:rPr>
+          <w:sz w:val="12"/>
+          <w:szCs w:val="12"/>
+        </w:rPr>
+        <w:ind w:left="0" w:firstLine="0"/>
+        <w:spacing w:after="0" w:before="0" w:line="240" w:lineRule="auto"/>
+      </w:pPr>
+    </w:p>
+    <w:p>
+      <w:pPr>
+        <w:rPr>
+          <w:sz w:val="12"/>
+          <w:szCs w:val="12"/>
+        </w:rPr>
+        <w:ind w:left="0" w:firstLine="0"/>
+        <w:spacing w:after="0" w:before="0" w:line="240" w:lineRule="auto"/>
+      </w:pPr>
+    </w:p>
+    <w:p>
+      <w:pPr>
+        <w:rPr>
+          <w:sz w:val="12"/>
+          <w:szCs w:val="12"/>
+        </w:rPr>
+        <w:ind w:left="0" w:firstLine="0"/>
+        <w:spacing w:after="0" w:before="0" w:line="240" w:lineRule="auto"/>
+      </w:pPr>
+    </w:p>
+    <w:p>
+      <w:pPr>
+        <w:rPr>
+          <w:sz w:val="12"/>
+          <w:szCs w:val="12"/>
+        </w:rPr>
+        <w:ind w:left="0" w:firstLine="0"/>
+        <w:spacing w:after="0" w:before="0" w:line="240" w:lineRule="auto"/>
+      </w:pPr>
+    </w:p>
+    <w:p>
+      <w:pPr>
+        <w:rPr>
+          <w:sz w:val="12"/>
+          <w:szCs w:val="12"/>
+        </w:rPr>
+        <w:ind w:left="0" w:firstLine="0"/>
+        <w:spacing w:after="0" w:before="0" w:line="240" w:lineRule="auto"/>
+      </w:pPr>
+    </w:p>
+    <w:p>
+      <w:pPr>
+        <w:rPr>
+          <w:sz w:val="12"/>
+          <w:szCs w:val="12"/>
+        </w:rPr>
+        <w:ind w:left="0" w:firstLine="0"/>
+        <w:spacing w:after="0" w:before="0" w:line="240" w:lineRule="auto"/>
+      </w:pPr>
+    </w:p>
+    <w:p>
+      <w:pPr>
+        <w:rPr>
+          <w:sz w:val="12"/>
+          <w:szCs w:val="12"/>
+        </w:rPr>
+        <w:ind w:left="0" w:firstLine="0"/>
+        <w:spacing w:after="0" w:before="0" w:line="240" w:lineRule="auto"/>
+      </w:pPr>
+    </w:p>
+    <w:p>
+      <w:pPr>
+        <w:rPr>
+          <w:sz w:val="12"/>
+          <w:szCs w:val="12"/>
+        </w:rPr>
+        <w:ind w:left="0" w:firstLine="0"/>
+        <w:spacing w:after="0" w:before="0" w:line="240" w:lineRule="auto"/>
+      </w:pPr>
+    </w:p>
+    <w:p>
+      <w:pPr>
+        <w:rPr>
+          <w:sz w:val="12"/>
+          <w:szCs w:val="12"/>
+        </w:rPr>
+        <w:ind w:left="0" w:firstLine="0"/>
+        <w:spacing w:after="0" w:before="0" w:line="240" w:lineRule="auto"/>
+      </w:pPr>
+    </w:p>
+    <w:p>
+      <w:pPr>
+        <w:rPr>
+          <w:sz w:val="12"/>
+          <w:szCs w:val="12"/>
+        </w:rPr>
+        <w:ind w:left="0" w:firstLine="0"/>
+        <w:spacing w:after="0" w:before="0" w:line="240" w:lineRule="auto"/>
+      </w:pPr>
+    </w:p>
+    <w:p>
+      <w:pPr>
+        <w:rPr>
+          <w:sz w:val="12"/>
+          <w:szCs w:val="12"/>
+        </w:rPr>
+        <w:ind w:left="0" w:firstLine="0"/>
+        <w:spacing w:after="0" w:before="0" w:line="240" w:lineRule="auto"/>
+      </w:pPr>
+    </w:p>
+    <w:p>
+      <w:pPr>
+        <w:rPr>
+          <w:sz w:val="12"/>
+          <w:szCs w:val="12"/>
+        </w:rPr>
+        <w:ind w:left="0" w:firstLine="0"/>
+        <w:spacing w:after="0" w:before="0" w:line="240" w:lineRule="auto"/>
+      </w:pPr>
+    </w:p>
+    <w:p>
+      <w:pPr>
+        <w:rPr>
+          <w:sz w:val="12"/>
+          <w:szCs w:val="12"/>
+        </w:rPr>
+        <w:ind w:left="0" w:firstLine="0"/>
+        <w:spacing w:after="0" w:before="0" w:line="240" w:lineRule="auto"/>
+      </w:pPr>
+    </w:p>
+    <w:p>
+      <w:pPr>
+        <w:rPr>
+          <w:sz w:val="12"/>
+          <w:szCs w:val="12"/>
+        </w:rPr>
+        <w:ind w:left="0" w:firstLine="0"/>
+        <w:spacing w:after="0" w:before="0" w:line="240" w:lineRule="auto"/>
+      </w:pPr>
+    </w:p>
+    <w:p>
+      <w:pPr>
+        <w:rPr>
+          <w:sz w:val="12"/>
+          <w:szCs w:val="12"/>
+        </w:rPr>
+        <w:ind w:left="0" w:firstLine="0"/>
+        <w:spacing w:after="0" w:before="0" w:line="240" w:lineRule="auto"/>
+      </w:pPr>
+    </w:p>
+    <w:p>
+      <w:pPr>
+        <w:rPr>
+          <w:sz w:val="12"/>
+          <w:szCs w:val="12"/>
+        </w:rPr>
+        <w:ind w:left="0" w:firstLine="0"/>
+        <w:spacing w:after="0" w:before="0" w:line="240" w:lineRule="auto"/>
+      </w:pPr>
+    </w:p>
+    <w:p>
+      <w:pPr>
+        <w:rPr>
+          <w:sz w:val="12"/>
+          <w:szCs w:val="12"/>
+        </w:rPr>
+        <w:ind w:left="0" w:firstLine="0"/>
+        <w:spacing w:after="0" w:before="0" w:line="240" w:lineRule="auto"/>
+      </w:pPr>
+    </w:p>
+    <w:p>
+      <w:pPr>
+        <w:rPr>
+          <w:sz w:val="12"/>
+          <w:szCs w:val="12"/>
+        </w:rPr>
+        <w:ind w:left="0" w:firstLine="0"/>
+        <w:spacing w:after="0" w:before="0" w:line="240" w:lineRule="auto"/>
+      </w:pPr>
+    </w:p>
+    <w:p>
+      <w:pPr>
+        <w:rPr>
+          <w:sz w:val="12"/>
+          <w:szCs w:val="12"/>
+        </w:rPr>
+        <w:ind w:left="0" w:firstLine="0"/>
+        <w:spacing w:after="0" w:before="0" w:line="240" w:lineRule="auto"/>
+      </w:pPr>
+    </w:p>
+    <w:p>
+      <w:pPr>
+        <w:rPr>
+          <w:sz w:val="12"/>
+          <w:szCs w:val="12"/>
+        </w:rPr>
+        <w:ind w:left="0" w:firstLine="0"/>
+        <w:spacing w:after="0" w:before="0" w:line="240" w:lineRule="auto"/>
+      </w:pPr>
+    </w:p>
+    <w:p>
+      <w:pPr>
+        <w:rPr>
+          <w:sz w:val="12"/>
+          <w:szCs w:val="12"/>
+        </w:rPr>
+        <w:ind w:left="0" w:firstLine="0"/>
+        <w:spacing w:after="0" w:before="0" w:line="240" w:lineRule="auto"/>
+      </w:pPr>
+    </w:p>
+    <w:p>
+      <w:pPr>
+        <w:rPr>
+          <w:sz w:val="12"/>
+          <w:szCs w:val="12"/>
+        </w:rPr>
+        <w:ind w:left="0" w:firstLine="0"/>
+        <w:spacing w:after="0" w:before="0" w:line="240" w:lineRule="auto"/>
+      </w:pPr>
+    </w:p>
+    <w:p>
+      <w:pPr>
+        <w:rPr>
+          <w:sz w:val="12"/>
+          <w:szCs w:val="12"/>
+        </w:rPr>
+        <w:ind w:left="0" w:firstLine="0"/>
+        <w:spacing w:after="0" w:before="0" w:line="240" w:lineRule="auto"/>
+      </w:pPr>
+    </w:p>
+    <w:p>
+      <w:pPr>
+        <w:rPr>
+          <w:sz w:val="12"/>
+          <w:szCs w:val="12"/>
+        </w:rPr>
+        <w:ind w:left="0" w:firstLine="0"/>
+        <w:spacing w:after="0" w:before="0" w:line="240" w:lineRule="auto"/>
+      </w:pPr>
+    </w:p>
+    <w:p>
+      <w:pPr>
+        <w:rPr>
+          <w:sz w:val="12"/>
+          <w:szCs w:val="12"/>
+        </w:rPr>
+        <w:ind w:left="0" w:firstLine="0"/>
+        <w:spacing w:after="0" w:before="0" w:line="240" w:lineRule="auto"/>
+      </w:pPr>
+    </w:p>
+    <w:p>
+      <w:pPr>
+        <w:rPr>
+          <w:sz w:val="12"/>
+          <w:szCs w:val="12"/>
+        </w:rPr>
+        <w:ind w:left="0" w:firstLine="0"/>
+        <w:spacing w:after="0" w:before="0" w:line="240" w:lineRule="auto"/>
+      </w:pPr>
+    </w:p>
+    <w:p>
+      <w:pPr>
+        <w:rPr>
+          <w:sz w:val="12"/>
+          <w:szCs w:val="12"/>
+        </w:rPr>
+        <w:ind w:left="0" w:firstLine="0"/>
+        <w:spacing w:after="0" w:before="0" w:line="240" w:lineRule="auto"/>
+      </w:pPr>
+    </w:p>
+    <w:p>
+      <w:pPr>
+        <w:rPr>
+          <w:sz w:val="12"/>
+          <w:szCs w:val="12"/>
+        </w:rPr>
+        <w:ind w:left="0" w:firstLine="0"/>
+        <w:spacing w:after="0" w:before="0" w:line="240" w:lineRule="auto"/>
+      </w:pPr>
+    </w:p>
+    <w:p>
+      <w:pPr>
+        <w:rPr>
+          <w:sz w:val="12"/>
+          <w:szCs w:val="12"/>
+        </w:rPr>
+        <w:ind w:left="0" w:firstLine="0"/>
+        <w:spacing w:after="0" w:before="0" w:line="240" w:lineRule="auto"/>
+      </w:pPr>
+    </w:p>
+    <w:p>
+      <w:pPr>
+        <w:jc w:val="center"/>
+        <w:ind w:left="0" w:firstLine="0"/>
+        <w:spacing w:after="0" w:before="0" w:line="240" w:lineRule="auto"/>
+      </w:pPr>
+      <w:r>
+        <w:rPr>
+          <w:rFonts w:ascii="Georgia" w:hAnsi="Georgia" w:cs="Georgia"/>
+          <w:sz w:val="18"/>
+          <w:szCs w:val="18"/>
+        </w:rPr>
+        <w:t xml:space="preserve">Copyright © 2026 Lana Wray</w:t>
+      </w:r>
+    </w:p>
+    <w:p>
+      <w:pPr>
+        <w:jc w:val="center"/>
+        <w:ind w:left="0" w:firstLine="0"/>
+        <w:spacing w:after="0" w:before="0" w:line="240" w:lineRule="auto"/>
+      </w:pPr>
+      <w:r>
+        <w:rPr>
+          <w:rFonts w:ascii="Georgia" w:hAnsi="Georgia" w:cs="Georgia"/>
+          <w:sz w:val="18"/>
+          <w:szCs w:val="18"/>
+        </w:rPr>
+        <w:t xml:space="preserve">All rights reserved.</w:t>
+      </w:r>
+    </w:p>
+    <w:p>
+      <w:pPr>
+        <w:rPr>
+          <w:sz w:val="18"/>
+          <w:szCs w:val="18"/>
+        </w:rPr>
+        <w:ind w:left="0" w:firstLine="0"/>
+        <w:spacing w:after="0" w:before="0" w:line="240" w:lineRule="auto"/>
+      </w:pPr>
+    </w:p>
+    <w:p>
+      <w:pPr>
+        <w:jc w:val="center"/>
+        <w:ind w:left="0" w:firstLine="0"/>
+        <w:spacing w:after="0" w:before="0" w:line="240" w:lineRule="auto"/>
+      </w:pPr>
+      <w:r>
+        <w:rPr>
+          <w:rFonts w:ascii="Georgia" w:hAnsi="Georgia" w:cs="Georgia"/>
+          <w:sz w:val="18"/>
+          <w:szCs w:val="18"/>
+        </w:rPr>
+        <w:t xml:space="preserve">No part of this book may be reproduced, stored in a retrieval system, or transmitted in any form or by any means without the prior written permission of the author.</w:t>
+      </w:r>
+    </w:p>
+    <w:p>
+      <w:pPr>
+        <w:rPr>
+          <w:sz w:val="18"/>
+          <w:szCs w:val="18"/>
+        </w:rPr>
+        <w:ind w:left="0" w:firstLine="0"/>
+        <w:spacing w:after="0" w:before="0" w:line="240" w:lineRule="auto"/>
+      </w:pPr>
+    </w:p>
+    <w:p>
+      <w:pPr>
+        <w:jc w:val="center"/>
+        <w:ind w:left="0" w:firstLine="0"/>
+        <w:spacing w:after="0" w:before="0" w:line="240" w:lineRule="auto"/>
+      </w:pPr>
+      <w:r>
+        <w:rPr>
+          <w:rFonts w:ascii="Georgia" w:hAnsi="Georgia" w:cs="Georgia"/>
+          <w:sz w:val="18"/>
+          <w:szCs w:val="18"/>
+        </w:rPr>
+        <w:t xml:space="preserve">Published via Amazon Kindle Direct Publishing</w:t>
+      </w:r>
+    </w:p>
+    <w:p>
+      <w:pPr>
+        <w:jc w:val="center"/>
+        <w:ind w:left="0" w:firstLine="0"/>
+        <w:spacing w:after="0" w:before="0" w:line="240" w:lineRule="auto"/>
+      </w:pPr>
+      <w:r>
+        <w:rPr>
+          <w:rFonts w:ascii="Georgia" w:hAnsi="Georgia" w:cs="Georgia"/>
+          <w:sz w:val="18"/>
+          <w:szCs w:val="18"/>
+        </w:rPr>
+        <w:t xml:space="preserve">First edition, 2026</w:t>
+      </w:r>
+    </w:p>
+    <w:p>
+      <w:pPr>
+        <w:ind w:left="0" w:firstLine="0"/>
+        <w:spacing w:after="0" w:before="0" w:line="240" w:lineRule="auto"/>
+      </w:pPr>
+      <w:r>
+        <w:br w:type="page"/>
+      </w:r>
+    </w:p>
+    <w:p>
+      <w:pPr>
+        <w:rPr>
+          <w:sz w:val="12"/>
+          <w:szCs w:val="12"/>
+        </w:rPr>
+        <w:ind w:left="0" w:firstLine="0"/>
+        <w:spacing w:after="0" w:before="0" w:line="240" w:lineRule="auto"/>
+      </w:pPr>
+    </w:p>
+    <w:p>
+      <w:pPr>
+        <w:rPr>
+          <w:sz w:val="12"/>
+          <w:szCs w:val="12"/>
+        </w:rPr>
+        <w:ind w:left="0" w:firstLine="0"/>
+        <w:spacing w:after="0" w:before="0" w:line="240" w:lineRule="auto"/>
+      </w:pPr>
+    </w:p>
+    <w:p>
+      <w:pPr>
+        <w:rPr>
+          <w:sz w:val="12"/>
+          <w:szCs w:val="12"/>
+        </w:rPr>
+        <w:ind w:left="0" w:firstLine="0"/>
+        <w:spacing w:after="0" w:before="0" w:line="240" w:lineRule="auto"/>
+      </w:pPr>
+    </w:p>
+    <w:p>
+      <w:pPr>
+        <w:rPr>
+          <w:sz w:val="12"/>
+          <w:szCs w:val="12"/>
+        </w:rPr>
+        <w:ind w:left="0" w:firstLine="0"/>
+        <w:spacing w:after="0" w:before="0" w:line="240" w:lineRule="auto"/>
+      </w:pPr>
+    </w:p>
+    <w:p>
+      <w:pPr>
+        <w:rPr>
+          <w:sz w:val="12"/>
+          <w:szCs w:val="12"/>
+        </w:rPr>
+        <w:ind w:left="0" w:firstLine="0"/>
+        <w:spacing w:after="0" w:before="0" w:line="240" w:lineRule="auto"/>
+      </w:pPr>
+    </w:p>
+    <w:p>
+      <w:pPr>
+        <w:rPr>
+          <w:sz w:val="12"/>
+          <w:szCs w:val="12"/>
+        </w:rPr>
+        <w:ind w:left="0" w:firstLine="0"/>
+        <w:spacing w:after="0" w:before="0" w:line="240" w:lineRule="auto"/>
+      </w:pPr>
+    </w:p>
+    <w:p>
+      <w:pPr>
+        <w:rPr>
+          <w:sz w:val="12"/>
+          <w:szCs w:val="12"/>
+        </w:rPr>
+        <w:ind w:left="0" w:firstLine="0"/>
+        <w:spacing w:after="0" w:before="0" w:line="240" w:lineRule="auto"/>
+      </w:pPr>
+    </w:p>
+    <w:p>
+      <w:pPr>
+        <w:rPr>
+          <w:sz w:val="12"/>
+          <w:szCs w:val="12"/>
+        </w:rPr>
+        <w:ind w:left="0" w:firstLine="0"/>
+        <w:spacing w:after="0" w:before="0" w:line="240" w:lineRule="auto"/>
+      </w:pPr>
+    </w:p>
+    <w:p>
+      <w:pPr>
+        <w:rPr>
+          <w:sz w:val="12"/>
+          <w:szCs w:val="12"/>
+        </w:rPr>
+        <w:ind w:left="0" w:firstLine="0"/>
+        <w:spacing w:after="0" w:before="0" w:line="240" w:lineRule="auto"/>
+      </w:pPr>
+    </w:p>
+    <w:p>
+      <w:pPr>
+        <w:rPr>
+          <w:sz w:val="12"/>
+          <w:szCs w:val="12"/>
+        </w:rPr>
+        <w:ind w:left="0" w:firstLine="0"/>
+        <w:spacing w:after="0" w:before="0" w:line="240" w:lineRule="auto"/>
+      </w:pPr>
+    </w:p>
+    <w:p>
+      <w:pPr>
+        <w:rPr>
+          <w:sz w:val="12"/>
+          <w:szCs w:val="12"/>
+        </w:rPr>
+        <w:ind w:left="0" w:firstLine="0"/>
+        <w:spacing w:after="0" w:before="0" w:line="240" w:lineRule="auto"/>
+      </w:pPr>
+    </w:p>
+    <w:p>
+      <w:pPr>
+        <w:rPr>
+          <w:sz w:val="12"/>
+          <w:szCs w:val="12"/>
+        </w:rPr>
+        <w:ind w:left="0" w:firstLine="0"/>
+        <w:spacing w:after="0" w:before="0" w:line="240" w:lineRule="auto"/>
+      </w:pPr>
+    </w:p>
+    <w:p>
+      <w:pPr>
+        <w:rPr>
+          <w:sz w:val="12"/>
+          <w:szCs w:val="12"/>
+        </w:rPr>
+        <w:ind w:left="0" w:firstLine="0"/>
+        <w:spacing w:after="0" w:before="0" w:line="240" w:lineRule="auto"/>
+      </w:pPr>
+    </w:p>
+    <w:p>
+      <w:pPr>
+        <w:rPr>
+          <w:sz w:val="12"/>
+          <w:szCs w:val="12"/>
+        </w:rPr>
+        <w:ind w:left="0" w:firstLine="0"/>
+        <w:spacing w:after="0" w:before="0" w:line="240" w:lineRule="auto"/>
+      </w:pPr>
+    </w:p>
+    <w:p>
+      <w:pPr>
+        <w:rPr>
+          <w:sz w:val="12"/>
+          <w:szCs w:val="12"/>
+        </w:rPr>
+        <w:ind w:left="0" w:firstLine="0"/>
+        <w:spacing w:after="0" w:before="0" w:line="240" w:lineRule="auto"/>
+      </w:pPr>
+    </w:p>
+    <w:p>
+      <w:pPr>
+        <w:rPr>
+          <w:sz w:val="12"/>
+          <w:szCs w:val="12"/>
+        </w:rPr>
+        <w:ind w:left="0" w:firstLine="0"/>
+        <w:spacing w:after="0" w:before="0" w:line="240" w:lineRule="auto"/>
+      </w:pPr>
+    </w:p>
+    <w:p>
+      <w:pPr>
+        <w:rPr>
+          <w:sz w:val="12"/>
+          <w:szCs w:val="12"/>
+        </w:rPr>
+        <w:ind w:left="0" w:firstLine="0"/>
+        <w:spacing w:after="0" w:before="0" w:line="240" w:lineRule="auto"/>
+      </w:pPr>
+    </w:p>
+    <w:p>
+      <w:pPr>
+        <w:rPr>
+          <w:sz w:val="12"/>
+          <w:szCs w:val="12"/>
+        </w:rPr>
+        <w:ind w:left="0" w:firstLine="0"/>
+        <w:spacing w:after="0" w:before="0" w:line="240" w:lineRule="auto"/>
+      </w:pPr>
+    </w:p>
+    <w:p>
+      <w:pPr>
+        <w:jc w:val="center"/>
+        <w:ind w:left="0" w:firstLine="0"/>
+        <w:spacing w:after="0" w:before="0" w:line="240" w:lineRule="auto"/>
+      </w:pPr>
+      <w:r>
+        <w:rPr>
+          <w:rFonts w:ascii="Georgia" w:hAnsi="Georgia" w:cs="Georgia"/>
+          <w:sz w:val="24"/>
+          <w:szCs w:val="24"/>
+          <w:i/>
+          <w:iCs/>
+        </w:rPr>
+        <w:t xml:space="preserve">For every manager who chose courage over comfort.</w:t>
+      </w:r>
+    </w:p>
+    <w:p>
+      <w:pPr>
+        <w:ind w:left="0" w:firstLine="0"/>
+        <w:spacing w:after="0" w:before="0" w:line="240" w:lineRule="auto"/>
+      </w:pPr>
+      <w:r>
+        <w:br w:type="page"/>
+      </w:r>
+    </w:p>
+    <w:p>
+      <w:pPr>
+        <w:jc w:val="center"/>
+        <w:ind w:left="0" w:firstLine="0"/>
+        <w:spacing w:after="0" w:before="0" w:line="240" w:lineRule="auto"/>
+      </w:pPr>
+      <w:r>
+        <w:rPr>
+          <w:rFonts w:ascii="Georgia" w:hAnsi="Georgia" w:cs="Georgia"/>
+          <w:sz w:val="28"/>
+          <w:szCs w:val="28"/>
           <w:b/>
-          <w:i w:val="0"/>
-          <w:sz w:val="40"/>
-        </w:rPr>
-        <w:t>The Manager's Guide to Difficult Conversations</w:t>
-      </w:r>
-    </w:p>
-    <w:p>
-      <w:pPr>
-        <w:spacing w:before="0" w:after="0" w:line="276" w:lineRule="auto"/>
-        <w:jc w:val="both"/>
-        <w:ind w:left="0" w:firstLine="288"/>
-      </w:pPr>
-      <w:r>
-        <w:rPr>
-          <w:rFonts w:ascii="Georgia" w:hAnsi="Georgia" w:cs="Georgia"/>
-          <w:b w:val="0"/>
-          <w:i w:val="0"/>
-          <w:sz w:val="24"/>
-        </w:rPr>
-        <w:t>Word-for-Word Scripts and Neuroscience Strategies for Remote, Hybrid, and In-Person Teams</w:t>
-      </w:r>
-    </w:p>
-    <w:p>
-      <w:pPr>
-        <w:spacing w:before="0" w:after="0"/>
-      </w:pPr>
-      <w:r>
-        <w:rPr>
-          <w:rFonts w:ascii="Georgia" w:hAnsi="Georgia" w:cs="Georgia"/>
-          <w:b w:val="0"/>
-          <w:i w:val="0"/>
-          <w:sz w:val="22"/>
-        </w:rPr>
-      </w:r>
-    </w:p>
-    <w:p>
-      <w:pPr>
-        <w:spacing w:before="0" w:after="0"/>
-      </w:pPr>
-      <w:r>
-        <w:rPr>
-          <w:rFonts w:ascii="Georgia" w:hAnsi="Georgia" w:cs="Georgia"/>
-          <w:b w:val="0"/>
-          <w:i w:val="0"/>
-          <w:sz w:val="22"/>
-        </w:rPr>
-      </w:r>
-    </w:p>
-    <w:p>
-      <w:pPr>
-        <w:spacing w:before="0" w:after="0"/>
-      </w:pPr>
-      <w:r>
-        <w:rPr>
-          <w:rFonts w:ascii="Georgia" w:hAnsi="Georgia" w:cs="Georgia"/>
-          <w:b w:val="0"/>
-          <w:i w:val="0"/>
-          <w:sz w:val="22"/>
-        </w:rPr>
-      </w:r>
-    </w:p>
-    <w:p>
-      <w:pPr>
-        <w:spacing w:before="0" w:after="0" w:line="276" w:lineRule="auto"/>
-        <w:jc w:val="both"/>
-        <w:ind w:left="0" w:firstLine="288"/>
-      </w:pPr>
-      <w:r>
-        <w:rPr>
-          <w:rFonts w:ascii="Georgia" w:hAnsi="Georgia" w:cs="Georgia"/>
-          <w:b w:val="0"/>
-          <w:i w:val="0"/>
-          <w:sz w:val="28"/>
-        </w:rPr>
-        <w:t>Lana Wray</w:t>
-      </w:r>
-    </w:p>
-    <w:p>
+          <w:bCs/>
+        </w:rPr>
+        <w:t xml:space="preserve">A Note on the Scripts</w:t>
+      </w:r>
+    </w:p>
+    <w:p>
+      <w:pPr>
+        <w:rPr>
+          <w:sz w:val="22"/>
+          <w:szCs w:val="22"/>
+        </w:rPr>
+        <w:ind w:left="0" w:firstLine="0"/>
+        <w:spacing w:after="0" w:before="0" w:line="240" w:lineRule="auto"/>
+      </w:pPr>
+    </w:p>
+    <w:p>
+      <w:pPr>
+        <w:jc w:val="both"/>
+        <w:ind w:left="0" w:firstLine="0"/>
+        <w:spacing w:after="0" w:before="0" w:line="240" w:lineRule="auto"/>
+      </w:pPr>
+      <w:r>
+        <w:rPr>
+          <w:rFonts w:ascii="Georgia" w:hAnsi="Georgia" w:cs="Georgia"/>
+          <w:sz w:val="22"/>
+          <w:szCs w:val="22"/>
+        </w:rPr>
+        <w:t xml:space="preserve">The scripts in this book are starting points, not rigid formulas. Adapt the language to your voice, your relationship with the employee, and your organizational culture. What matters is the structure and the intention behind each phrase.</w:t>
+      </w:r>
+    </w:p>
+    <w:p>
+      <w:pPr>
+        <w:ind w:left="0" w:firstLine="0"/>
+        <w:spacing w:after="0" w:before="0" w:line="240" w:lineRule="auto"/>
+      </w:pPr>
       <w:r>
         <w:br w:type="page"/>
       </w:r>
     </w:p>
     <w:p>
       <w:pPr>
-        <w:spacing w:before="0" w:after="0"/>
-      </w:pPr>
-      <w:r>
-        <w:rPr>
-          <w:rFonts w:ascii="Georgia" w:hAnsi="Georgia" w:cs="Georgia"/>
-          <w:b w:val="0"/>
-          <w:i w:val="0"/>
-          <w:sz w:val="22"/>
-        </w:rPr>
-      </w:r>
-    </w:p>
-    <w:p>
-      <w:pPr>
-        <w:spacing w:before="0" w:after="0"/>
-      </w:pPr>
-      <w:r>
-        <w:rPr>
-          <w:rFonts w:ascii="Georgia" w:hAnsi="Georgia" w:cs="Georgia"/>
-          <w:b w:val="0"/>
-          <w:i w:val="0"/>
-          <w:sz w:val="22"/>
-        </w:rPr>
-      </w:r>
-    </w:p>
-    <w:p>
-      <w:pPr>
-        <w:spacing w:before="0" w:after="0"/>
-      </w:pPr>
-      <w:r>
-        <w:rPr>
-          <w:rFonts w:ascii="Georgia" w:hAnsi="Georgia" w:cs="Georgia"/>
-          <w:b w:val="0"/>
-          <w:i w:val="0"/>
-          <w:sz w:val="22"/>
-        </w:rPr>
-      </w:r>
-    </w:p>
-    <w:p>
-      <w:pPr>
-        <w:spacing w:before="0" w:after="0"/>
-      </w:pPr>
-      <w:r>
-        <w:rPr>
-          <w:rFonts w:ascii="Georgia" w:hAnsi="Georgia" w:cs="Georgia"/>
-          <w:b w:val="0"/>
-          <w:i w:val="0"/>
-          <w:sz w:val="22"/>
-        </w:rPr>
-      </w:r>
-    </w:p>
-    <w:p>
-      <w:pPr>
-        <w:spacing w:before="0" w:after="0"/>
-      </w:pPr>
-      <w:r>
-        <w:rPr>
-          <w:rFonts w:ascii="Georgia" w:hAnsi="Georgia" w:cs="Georgia"/>
-          <w:b w:val="0"/>
-          <w:i w:val="0"/>
-          <w:sz w:val="22"/>
-        </w:rPr>
-      </w:r>
-    </w:p>
-    <w:p>
-      <w:pPr>
-        <w:spacing w:before="0" w:after="0"/>
-      </w:pPr>
-      <w:r>
-        <w:rPr>
-          <w:rFonts w:ascii="Georgia" w:hAnsi="Georgia" w:cs="Georgia"/>
-          <w:b w:val="0"/>
-          <w:i w:val="0"/>
-          <w:sz w:val="22"/>
-        </w:rPr>
-      </w:r>
-    </w:p>
-    <w:p>
-      <w:pPr>
-        <w:spacing w:before="0" w:after="0"/>
-      </w:pPr>
-      <w:r>
-        <w:rPr>
-          <w:rFonts w:ascii="Georgia" w:hAnsi="Georgia" w:cs="Georgia"/>
-          <w:b w:val="0"/>
-          <w:i w:val="0"/>
-          <w:sz w:val="22"/>
-        </w:rPr>
-      </w:r>
-    </w:p>
-    <w:p>
-      <w:pPr>
-        <w:spacing w:before="0" w:after="0"/>
-      </w:pPr>
-      <w:r>
-        <w:rPr>
-          <w:rFonts w:ascii="Georgia" w:hAnsi="Georgia" w:cs="Georgia"/>
-          <w:b w:val="0"/>
-          <w:i w:val="0"/>
-          <w:sz w:val="22"/>
-        </w:rPr>
-      </w:r>
-    </w:p>
-    <w:p>
-      <w:pPr>
-        <w:spacing w:before="0" w:after="0"/>
-      </w:pPr>
-      <w:r>
-        <w:rPr>
-          <w:rFonts w:ascii="Georgia" w:hAnsi="Georgia" w:cs="Georgia"/>
-          <w:b w:val="0"/>
-          <w:i w:val="0"/>
-          <w:sz w:val="22"/>
-        </w:rPr>
-      </w:r>
-    </w:p>
-    <w:p>
-      <w:pPr>
-        <w:spacing w:before="0" w:after="0"/>
-      </w:pPr>
-      <w:r>
-        <w:rPr>
-          <w:rFonts w:ascii="Georgia" w:hAnsi="Georgia" w:cs="Georgia"/>
-          <w:b w:val="0"/>
-          <w:i w:val="0"/>
-          <w:sz w:val="22"/>
-        </w:rPr>
-      </w:r>
-    </w:p>
-    <w:p>
-      <w:pPr>
-        <w:spacing w:before="0" w:after="0"/>
-      </w:pPr>
-      <w:r>
-        <w:rPr>
-          <w:rFonts w:ascii="Georgia" w:hAnsi="Georgia" w:cs="Georgia"/>
-          <w:b w:val="0"/>
-          <w:i w:val="0"/>
-          <w:sz w:val="22"/>
-        </w:rPr>
-      </w:r>
-    </w:p>
-    <w:p>
-      <w:pPr>
-        <w:spacing w:before="0" w:after="0"/>
-      </w:pPr>
-      <w:r>
-        <w:rPr>
-          <w:rFonts w:ascii="Georgia" w:hAnsi="Georgia" w:cs="Georgia"/>
-          <w:b w:val="0"/>
-          <w:i w:val="0"/>
-          <w:sz w:val="22"/>
-        </w:rPr>
-      </w:r>
-    </w:p>
-    <w:p>
-      <w:pPr>
-        <w:spacing w:before="0" w:after="0"/>
-      </w:pPr>
-      <w:r>
-        <w:rPr>
-          <w:rFonts w:ascii="Georgia" w:hAnsi="Georgia" w:cs="Georgia"/>
-          <w:b w:val="0"/>
-          <w:i w:val="0"/>
-          <w:sz w:val="22"/>
-        </w:rPr>
-      </w:r>
-    </w:p>
-    <w:p>
-      <w:pPr>
-        <w:spacing w:before="0" w:after="0"/>
-      </w:pPr>
-      <w:r>
-        <w:rPr>
-          <w:rFonts w:ascii="Georgia" w:hAnsi="Georgia" w:cs="Georgia"/>
-          <w:b w:val="0"/>
-          <w:i w:val="0"/>
-          <w:sz w:val="22"/>
-        </w:rPr>
-      </w:r>
-    </w:p>
-    <w:p>
-      <w:pPr>
-        <w:spacing w:before="0" w:after="0"/>
-      </w:pPr>
-      <w:r>
-        <w:rPr>
-          <w:rFonts w:ascii="Georgia" w:hAnsi="Georgia" w:cs="Georgia"/>
-          <w:b w:val="0"/>
-          <w:i w:val="0"/>
-          <w:sz w:val="22"/>
-        </w:rPr>
-      </w:r>
-    </w:p>
-    <w:p>
-      <w:pPr>
-        <w:spacing w:before="0" w:after="0"/>
-      </w:pPr>
-      <w:r>
-        <w:rPr>
-          <w:rFonts w:ascii="Georgia" w:hAnsi="Georgia" w:cs="Georgia"/>
-          <w:b w:val="0"/>
-          <w:i w:val="0"/>
-          <w:sz w:val="22"/>
-        </w:rPr>
-      </w:r>
-    </w:p>
-    <w:p>
-      <w:pPr>
-        <w:spacing w:before="0" w:after="0"/>
-      </w:pPr>
-      <w:r>
-        <w:rPr>
-          <w:rFonts w:ascii="Georgia" w:hAnsi="Georgia" w:cs="Georgia"/>
-          <w:b w:val="0"/>
-          <w:i w:val="0"/>
-          <w:sz w:val="22"/>
-        </w:rPr>
-      </w:r>
-    </w:p>
-    <w:p>
-      <w:pPr>
-        <w:spacing w:before="0" w:after="0"/>
-      </w:pPr>
-      <w:r>
-        <w:rPr>
-          <w:rFonts w:ascii="Georgia" w:hAnsi="Georgia" w:cs="Georgia"/>
-          <w:b w:val="0"/>
-          <w:i w:val="0"/>
-          <w:sz w:val="22"/>
-        </w:rPr>
-      </w:r>
-    </w:p>
-    <w:p>
-      <w:pPr>
-        <w:spacing w:before="0" w:after="0"/>
-      </w:pPr>
-      <w:r>
-        <w:rPr>
-          <w:rFonts w:ascii="Georgia" w:hAnsi="Georgia" w:cs="Georgia"/>
-          <w:b w:val="0"/>
-          <w:i w:val="0"/>
-          <w:sz w:val="22"/>
-        </w:rPr>
-      </w:r>
-    </w:p>
-    <w:p>
-      <w:pPr>
-        <w:spacing w:before="0" w:after="0"/>
-      </w:pPr>
-      <w:r>
-        <w:rPr>
-          <w:rFonts w:ascii="Georgia" w:hAnsi="Georgia" w:cs="Georgia"/>
-          <w:b w:val="0"/>
-          <w:i w:val="0"/>
-          <w:sz w:val="22"/>
-        </w:rPr>
-      </w:r>
-    </w:p>
-    <w:p>
-      <w:pPr>
-        <w:spacing w:before="0" w:after="40" w:line="276" w:lineRule="auto"/>
-        <w:jc w:val="both"/>
-        <w:ind w:left="0" w:firstLine="288"/>
-      </w:pPr>
-      <w:r>
-        <w:rPr>
-          <w:rFonts w:ascii="Georgia" w:hAnsi="Georgia" w:cs="Georgia"/>
-          <w:b w:val="0"/>
-          <w:i w:val="0"/>
-          <w:sz w:val="18"/>
-        </w:rPr>
-        <w:t>Copyright © 2026 Lana Wray</w:t>
-      </w:r>
-    </w:p>
-    <w:p>
-      <w:pPr>
-        <w:spacing w:before="0" w:after="160" w:line="276" w:lineRule="auto"/>
-        <w:jc w:val="both"/>
-        <w:ind w:left="0" w:firstLine="288"/>
-      </w:pPr>
-      <w:r>
-        <w:rPr>
-          <w:rFonts w:ascii="Georgia" w:hAnsi="Georgia" w:cs="Georgia"/>
-          <w:b w:val="0"/>
-          <w:i w:val="0"/>
-          <w:sz w:val="18"/>
-        </w:rPr>
-        <w:t>All rights reserved.</w:t>
-      </w:r>
-    </w:p>
-    <w:p>
-      <w:pPr>
-        <w:spacing w:before="0" w:after="160" w:line="276" w:lineRule="auto"/>
-        <w:jc w:val="both"/>
-        <w:ind w:left="0" w:firstLine="288"/>
-      </w:pPr>
-      <w:r>
-        <w:rPr>
-          <w:rFonts w:ascii="Georgia" w:hAnsi="Georgia" w:cs="Georgia"/>
-          <w:b w:val="0"/>
-          <w:i w:val="0"/>
-          <w:sz w:val="18"/>
-        </w:rPr>
-        <w:t>No part of this book may be reproduced, stored in a retrieval system, or transmitted in any form or by any means without the prior written permission of the author.</w:t>
-      </w:r>
-    </w:p>
-    <w:p>
-      <w:pPr>
-        <w:spacing w:before="0" w:after="40" w:line="276" w:lineRule="auto"/>
-        <w:jc w:val="both"/>
-        <w:ind w:left="0" w:firstLine="288"/>
-      </w:pPr>
-      <w:r>
-        <w:rPr>
-          <w:rFonts w:ascii="Georgia" w:hAnsi="Georgia" w:cs="Georgia"/>
-          <w:b w:val="0"/>
-          <w:i w:val="0"/>
-          <w:sz w:val="18"/>
-        </w:rPr>
-        <w:t>Published via Amazon Kindle Direct Publishing</w:t>
-      </w:r>
-    </w:p>
-    <w:p>
-      <w:pPr>
-        <w:spacing w:before="0" w:after="0" w:line="276" w:lineRule="auto"/>
-        <w:jc w:val="both"/>
-        <w:ind w:left="0" w:firstLine="288"/>
-      </w:pPr>
-      <w:r>
-        <w:rPr>
-          <w:rFonts w:ascii="Georgia" w:hAnsi="Georgia" w:cs="Georgia"/>
-          <w:b w:val="0"/>
-          <w:i w:val="0"/>
-          <w:sz w:val="18"/>
-        </w:rPr>
-        <w:t>First edition, 2026</w:t>
-      </w:r>
-    </w:p>
-    <w:p>
-      <w:r>
-        <w:br w:type="page"/>
-      </w:r>
-    </w:p>
-    <w:p>
-      <w:pPr>
-        <w:spacing w:before="0" w:after="0"/>
-      </w:pPr>
-      <w:r>
-        <w:rPr>
-          <w:rFonts w:ascii="Georgia" w:hAnsi="Georgia" w:cs="Georgia"/>
-          <w:b w:val="0"/>
-          <w:i w:val="0"/>
-          <w:sz w:val="22"/>
-        </w:rPr>
-      </w:r>
-    </w:p>
-    <w:p>
-      <w:pPr>
-        <w:spacing w:before="0" w:after="0"/>
-      </w:pPr>
-      <w:r>
-        <w:rPr>
-          <w:rFonts w:ascii="Georgia" w:hAnsi="Georgia" w:cs="Georgia"/>
-          <w:b w:val="0"/>
-          <w:i w:val="0"/>
-          <w:sz w:val="22"/>
-        </w:rPr>
-      </w:r>
-    </w:p>
-    <w:p>
-      <w:pPr>
-        <w:spacing w:before="0" w:after="0"/>
-      </w:pPr>
-      <w:r>
-        <w:rPr>
-          <w:rFonts w:ascii="Georgia" w:hAnsi="Georgia" w:cs="Georgia"/>
-          <w:b w:val="0"/>
-          <w:i w:val="0"/>
-          <w:sz w:val="22"/>
-        </w:rPr>
-      </w:r>
-    </w:p>
-    <w:p>
-      <w:pPr>
-        <w:spacing w:before="0" w:after="0"/>
-      </w:pPr>
-      <w:r>
-        <w:rPr>
-          <w:rFonts w:ascii="Georgia" w:hAnsi="Georgia" w:cs="Georgia"/>
-          <w:b w:val="0"/>
-          <w:i w:val="0"/>
-          <w:sz w:val="22"/>
-        </w:rPr>
-      </w:r>
-    </w:p>
-    <w:p>
-      <w:pPr>
-        <w:spacing w:before="0" w:after="0"/>
-      </w:pPr>
-      <w:r>
-        <w:rPr>
-          <w:rFonts w:ascii="Georgia" w:hAnsi="Georgia" w:cs="Georgia"/>
-          <w:b w:val="0"/>
-          <w:i w:val="0"/>
-          <w:sz w:val="22"/>
-        </w:rPr>
-      </w:r>
-    </w:p>
-    <w:p>
-      <w:pPr>
-        <w:spacing w:before="0" w:after="0"/>
-      </w:pPr>
-      <w:r>
-        <w:rPr>
-          <w:rFonts w:ascii="Georgia" w:hAnsi="Georgia" w:cs="Georgia"/>
-          <w:b w:val="0"/>
-          <w:i w:val="0"/>
-          <w:sz w:val="22"/>
-        </w:rPr>
-      </w:r>
-    </w:p>
-    <w:p>
-      <w:pPr>
-        <w:spacing w:before="0" w:after="0"/>
-      </w:pPr>
-      <w:r>
-        <w:rPr>
-          <w:rFonts w:ascii="Georgia" w:hAnsi="Georgia" w:cs="Georgia"/>
-          <w:b w:val="0"/>
-          <w:i w:val="0"/>
-          <w:sz w:val="22"/>
-        </w:rPr>
-      </w:r>
-    </w:p>
-    <w:p>
-      <w:pPr>
-        <w:spacing w:before="0" w:after="0"/>
-      </w:pPr>
-      <w:r>
-        <w:rPr>
-          <w:rFonts w:ascii="Georgia" w:hAnsi="Georgia" w:cs="Georgia"/>
-          <w:b w:val="0"/>
-          <w:i w:val="0"/>
-          <w:sz w:val="22"/>
-        </w:rPr>
-      </w:r>
-    </w:p>
-    <w:p>
-      <w:pPr>
-        <w:spacing w:before="0" w:after="0"/>
-      </w:pPr>
-      <w:r>
-        <w:rPr>
-          <w:rFonts w:ascii="Georgia" w:hAnsi="Georgia" w:cs="Georgia"/>
-          <w:b w:val="0"/>
-          <w:i w:val="0"/>
-          <w:sz w:val="22"/>
-        </w:rPr>
-      </w:r>
-    </w:p>
-    <w:p>
-      <w:pPr>
-        <w:spacing w:before="0" w:after="0"/>
-      </w:pPr>
-      <w:r>
-        <w:rPr>
-          <w:rFonts w:ascii="Georgia" w:hAnsi="Georgia" w:cs="Georgia"/>
-          <w:b w:val="0"/>
-          <w:i w:val="0"/>
-          <w:sz w:val="22"/>
-        </w:rPr>
-      </w:r>
-    </w:p>
-    <w:p>
-      <w:pPr>
-        <w:spacing w:before="0" w:after="0" w:line="276" w:lineRule="auto"/>
-        <w:jc w:val="both"/>
-        <w:ind w:left="0" w:firstLine="288"/>
-      </w:pPr>
-      <w:r>
-        <w:rPr>
-          <w:rFonts w:ascii="Georgia" w:hAnsi="Georgia" w:cs="Georgia"/>
-          <w:b w:val="0"/>
-          <w:i/>
-          <w:sz w:val="24"/>
-        </w:rPr>
-        <w:t>For every manager who chose courage over comfort.</w:t>
-      </w:r>
-    </w:p>
-    <w:p>
-      <w:r>
-        <w:br w:type="page"/>
-      </w:r>
-    </w:p>
-    <w:p>
-      <w:pPr>
-        <w:keepNext/>
-        <w:spacing w:before="720" w:after="360" w:line="276" w:lineRule="auto"/>
-        <w:jc w:val="both"/>
-        <w:ind w:left="0" w:firstLine="288"/>
-      </w:pPr>
-      <w:r>
-        <w:rPr>
-          <w:rFonts w:ascii="Georgia" w:hAnsi="Georgia" w:cs="Georgia"/>
+        <w:jc w:val="center"/>
+        <w:ind w:left="0" w:firstLine="0"/>
+        <w:spacing w:after="0" w:before="0" w:line="240" w:lineRule="auto"/>
+      </w:pPr>
+      <w:r>
+        <w:rPr>
+          <w:rFonts w:ascii="Georgia" w:hAnsi="Georgia" w:cs="Georgia"/>
+          <w:sz w:val="32"/>
+          <w:szCs w:val="32"/>
           <w:b/>
-          <w:i w:val="0"/>
-          <w:sz w:val="36"/>
-        </w:rPr>
-        <w:t>A Note on the Scripts</w:t>
-      </w:r>
-    </w:p>
-    <w:p>
-      <w:pPr>
-        <w:spacing w:before="0" w:after="120" w:line="276" w:lineRule="auto"/>
-        <w:jc w:val="both"/>
-        <w:ind w:left="0" w:firstLine="288"/>
-      </w:pPr>
-      <w:r>
-        <w:rPr>
-          <w:rFonts w:ascii="Georgia" w:hAnsi="Georgia" w:cs="Georgia"/>
-          <w:b w:val="0"/>
-          <w:i w:val="0"/>
-          <w:sz w:val="22"/>
-        </w:rPr>
-        <w:t>The scripts in this book are starting points, not rigid formulas. Adapt the language to your voice, your relationship with the employee, and your organizational culture. What matters is the structure and the intention behind each phrase.</w:t>
-      </w:r>
-    </w:p>
-    <w:p>
-      <w:r>
-        <w:br w:type="page"/>
-      </w:r>
-    </w:p>
-    <w:p>
-      <w:pPr>
-        <w:keepNext/>
-        <w:spacing w:before="720" w:after="360" w:line="276" w:lineRule="auto"/>
-        <w:jc w:val="both"/>
-        <w:ind w:left="0" w:firstLine="288"/>
-      </w:pPr>
-      <w:r>
-        <w:rPr>
-          <w:rFonts w:ascii="Georgia" w:hAnsi="Georgia" w:cs="Georgia"/>
-          <w:b/>
-          <w:i w:val="0"/>
-          <w:sz w:val="36"/>
-        </w:rPr>
-        <w:t>Contents</w:t>
-      </w:r>
-    </w:p>
-    <w:p>
-      <w:pPr>
-        <w:tabs>
-          <w:tab w:pos="6480" w:val="right" w:leader="dot"/>
-        </w:tabs>
-        <w:spacing w:before="40" w:after="80" w:line="312" w:lineRule="auto"/>
-        <w:jc w:val="both"/>
-        <w:ind w:left="0" w:firstLine="288"/>
-      </w:pPr>
-      <w:r>
-        <w:rPr>
-          <w:rFonts w:ascii="Georgia" w:hAnsi="Georgia" w:cs="Georgia"/>
-          <w:b w:val="0"/>
-          <w:i w:val="0"/>
-          <w:sz w:val="22"/>
-        </w:rPr>
-        <w:t>Chapter 1: Introduction: Why Difficult Conversations Feel So Hard</w:t>
-      </w:r>
-      <w:r>
-        <w:rPr>
-          <w:rFonts w:ascii="Georgia" w:hAnsi="Georgia" w:cs="Georgia"/>
-          <w:b w:val="0"/>
-          <w:i w:val="0"/>
-          <w:sz w:val="22"/>
-        </w:rPr>
-        <w:tab/>
-      </w:r>
-      <w:r>
-        <w:rPr>
-          <w:rFonts w:ascii="Georgia" w:hAnsi="Georgia" w:cs="Georgia"/>
-          <w:b w:val="0"/>
-          <w:i w:val="0"/>
-          <w:sz w:val="22"/>
-        </w:rPr>
-        <w:t>00</w:t>
-      </w:r>
-    </w:p>
-    <w:p>
-      <w:pPr>
-        <w:tabs>
-          <w:tab w:pos="6480" w:val="right" w:leader="dot"/>
-        </w:tabs>
-        <w:spacing w:before="40" w:after="80" w:line="312" w:lineRule="auto"/>
-        <w:jc w:val="both"/>
-        <w:ind w:left="0" w:firstLine="288"/>
-      </w:pPr>
-      <w:r>
-        <w:rPr>
-          <w:rFonts w:ascii="Georgia" w:hAnsi="Georgia" w:cs="Georgia"/>
-          <w:b w:val="0"/>
-          <w:i w:val="0"/>
-          <w:sz w:val="22"/>
-        </w:rPr>
-        <w:t>Chapter 2: The CLEAR Framework</w:t>
-      </w:r>
-      <w:r>
-        <w:rPr>
-          <w:rFonts w:ascii="Georgia" w:hAnsi="Georgia" w:cs="Georgia"/>
-          <w:b w:val="0"/>
-          <w:i w:val="0"/>
-          <w:sz w:val="22"/>
-        </w:rPr>
-        <w:tab/>
-      </w:r>
-      <w:r>
-        <w:rPr>
-          <w:rFonts w:ascii="Georgia" w:hAnsi="Georgia" w:cs="Georgia"/>
-          <w:b w:val="0"/>
-          <w:i w:val="0"/>
-          <w:sz w:val="22"/>
-        </w:rPr>
-        <w:t>00</w:t>
-      </w:r>
-    </w:p>
-    <w:p>
-      <w:pPr>
-        <w:tabs>
-          <w:tab w:pos="6480" w:val="right" w:leader="dot"/>
-        </w:tabs>
-        <w:spacing w:before="40" w:after="80" w:line="312" w:lineRule="auto"/>
-        <w:jc w:val="both"/>
-        <w:ind w:left="0" w:firstLine="288"/>
-      </w:pPr>
-      <w:r>
-        <w:rPr>
-          <w:rFonts w:ascii="Georgia" w:hAnsi="Georgia" w:cs="Georgia"/>
-          <w:b w:val="0"/>
-          <w:i w:val="0"/>
-          <w:sz w:val="22"/>
-        </w:rPr>
-        <w:t>Chapter 3: Script: The Performance Improvement Conversation</w:t>
-      </w:r>
-      <w:r>
-        <w:rPr>
-          <w:rFonts w:ascii="Georgia" w:hAnsi="Georgia" w:cs="Georgia"/>
-          <w:b w:val="0"/>
-          <w:i w:val="0"/>
-          <w:sz w:val="22"/>
-        </w:rPr>
-        <w:tab/>
-      </w:r>
-      <w:r>
-        <w:rPr>
-          <w:rFonts w:ascii="Georgia" w:hAnsi="Georgia" w:cs="Georgia"/>
-          <w:b w:val="0"/>
-          <w:i w:val="0"/>
-          <w:sz w:val="22"/>
-        </w:rPr>
-        <w:t>00</w:t>
-      </w:r>
-    </w:p>
-    <w:p>
-      <w:pPr>
-        <w:tabs>
-          <w:tab w:pos="6480" w:val="right" w:leader="dot"/>
-        </w:tabs>
-        <w:spacing w:before="40" w:after="80" w:line="312" w:lineRule="auto"/>
-        <w:jc w:val="both"/>
-        <w:ind w:left="0" w:firstLine="288"/>
-      </w:pPr>
-      <w:r>
-        <w:rPr>
-          <w:rFonts w:ascii="Georgia" w:hAnsi="Georgia" w:cs="Georgia"/>
-          <w:b w:val="0"/>
-          <w:i w:val="0"/>
-          <w:sz w:val="22"/>
-        </w:rPr>
-        <w:t>Chapter 4: Script: Delivering Negative Feedback</w:t>
-      </w:r>
-      <w:r>
-        <w:rPr>
-          <w:rFonts w:ascii="Georgia" w:hAnsi="Georgia" w:cs="Georgia"/>
-          <w:b w:val="0"/>
-          <w:i w:val="0"/>
-          <w:sz w:val="22"/>
-        </w:rPr>
-        <w:tab/>
-      </w:r>
-      <w:r>
-        <w:rPr>
-          <w:rFonts w:ascii="Georgia" w:hAnsi="Georgia" w:cs="Georgia"/>
-          <w:b w:val="0"/>
-          <w:i w:val="0"/>
-          <w:sz w:val="22"/>
-        </w:rPr>
-        <w:t>00</w:t>
-      </w:r>
-    </w:p>
-    <w:p>
-      <w:pPr>
-        <w:tabs>
-          <w:tab w:pos="6480" w:val="right" w:leader="dot"/>
-        </w:tabs>
-        <w:spacing w:before="40" w:after="80" w:line="312" w:lineRule="auto"/>
-        <w:jc w:val="both"/>
-        <w:ind w:left="0" w:firstLine="288"/>
-      </w:pPr>
-      <w:r>
-        <w:rPr>
-          <w:rFonts w:ascii="Georgia" w:hAnsi="Georgia" w:cs="Georgia"/>
-          <w:b w:val="0"/>
-          <w:i w:val="0"/>
-          <w:sz w:val="22"/>
-        </w:rPr>
-        <w:t>Chapter 5: Script: Addressing Attendance and Behavior Issues</w:t>
-      </w:r>
-      <w:r>
-        <w:rPr>
-          <w:rFonts w:ascii="Georgia" w:hAnsi="Georgia" w:cs="Georgia"/>
-          <w:b w:val="0"/>
-          <w:i w:val="0"/>
-          <w:sz w:val="22"/>
-        </w:rPr>
-        <w:tab/>
-      </w:r>
-      <w:r>
-        <w:rPr>
-          <w:rFonts w:ascii="Georgia" w:hAnsi="Georgia" w:cs="Georgia"/>
-          <w:b w:val="0"/>
-          <w:i w:val="0"/>
-          <w:sz w:val="22"/>
-        </w:rPr>
-        <w:t>00</w:t>
-      </w:r>
-    </w:p>
-    <w:p>
-      <w:pPr>
-        <w:tabs>
-          <w:tab w:pos="6480" w:val="right" w:leader="dot"/>
-        </w:tabs>
-        <w:spacing w:before="40" w:after="80" w:line="312" w:lineRule="auto"/>
-        <w:jc w:val="both"/>
-        <w:ind w:left="0" w:firstLine="288"/>
-      </w:pPr>
-      <w:r>
-        <w:rPr>
-          <w:rFonts w:ascii="Georgia" w:hAnsi="Georgia" w:cs="Georgia"/>
-          <w:b w:val="0"/>
-          <w:i w:val="0"/>
-          <w:sz w:val="22"/>
-        </w:rPr>
-        <w:t>Chapter 6: Script: Salary and Promotion Disappointment</w:t>
-      </w:r>
-      <w:r>
-        <w:rPr>
-          <w:rFonts w:ascii="Georgia" w:hAnsi="Georgia" w:cs="Georgia"/>
-          <w:b w:val="0"/>
-          <w:i w:val="0"/>
-          <w:sz w:val="22"/>
-        </w:rPr>
-        <w:tab/>
-      </w:r>
-      <w:r>
-        <w:rPr>
-          <w:rFonts w:ascii="Georgia" w:hAnsi="Georgia" w:cs="Georgia"/>
-          <w:b w:val="0"/>
-          <w:i w:val="0"/>
-          <w:sz w:val="22"/>
-        </w:rPr>
-        <w:t>00</w:t>
-      </w:r>
-    </w:p>
-    <w:p>
-      <w:pPr>
-        <w:tabs>
-          <w:tab w:pos="6480" w:val="right" w:leader="dot"/>
-        </w:tabs>
-        <w:spacing w:before="40" w:after="80" w:line="312" w:lineRule="auto"/>
-        <w:jc w:val="both"/>
-        <w:ind w:left="0" w:firstLine="288"/>
-      </w:pPr>
-      <w:r>
-        <w:rPr>
-          <w:rFonts w:ascii="Georgia" w:hAnsi="Georgia" w:cs="Georgia"/>
-          <w:b w:val="0"/>
-          <w:i w:val="0"/>
-          <w:sz w:val="22"/>
-        </w:rPr>
-        <w:t>Chapter 7: Script: Letting Someone Go</w:t>
-      </w:r>
-      <w:r>
-        <w:rPr>
-          <w:rFonts w:ascii="Georgia" w:hAnsi="Georgia" w:cs="Georgia"/>
-          <w:b w:val="0"/>
-          <w:i w:val="0"/>
-          <w:sz w:val="22"/>
-        </w:rPr>
-        <w:tab/>
-      </w:r>
-      <w:r>
-        <w:rPr>
-          <w:rFonts w:ascii="Georgia" w:hAnsi="Georgia" w:cs="Georgia"/>
-          <w:b w:val="0"/>
-          <w:i w:val="0"/>
-          <w:sz w:val="22"/>
-        </w:rPr>
-        <w:t>00</w:t>
-      </w:r>
-    </w:p>
-    <w:p>
-      <w:pPr>
-        <w:tabs>
-          <w:tab w:pos="6480" w:val="right" w:leader="dot"/>
-        </w:tabs>
-        <w:spacing w:before="40" w:after="80" w:line="312" w:lineRule="auto"/>
-        <w:jc w:val="both"/>
-        <w:ind w:left="0" w:firstLine="288"/>
-      </w:pPr>
-      <w:r>
-        <w:rPr>
-          <w:rFonts w:ascii="Georgia" w:hAnsi="Georgia" w:cs="Georgia"/>
-          <w:b w:val="0"/>
-          <w:i w:val="0"/>
-          <w:sz w:val="22"/>
-        </w:rPr>
-        <w:t>Chapter 8: Script: Addressing Team Conflict</w:t>
-      </w:r>
-      <w:r>
-        <w:rPr>
-          <w:rFonts w:ascii="Georgia" w:hAnsi="Georgia" w:cs="Georgia"/>
-          <w:b w:val="0"/>
-          <w:i w:val="0"/>
-          <w:sz w:val="22"/>
-        </w:rPr>
-        <w:tab/>
-      </w:r>
-      <w:r>
-        <w:rPr>
-          <w:rFonts w:ascii="Georgia" w:hAnsi="Georgia" w:cs="Georgia"/>
-          <w:b w:val="0"/>
-          <w:i w:val="0"/>
-          <w:sz w:val="22"/>
-        </w:rPr>
-        <w:t>00</w:t>
-      </w:r>
-    </w:p>
-    <w:p>
-      <w:pPr>
-        <w:tabs>
-          <w:tab w:pos="6480" w:val="right" w:leader="dot"/>
-        </w:tabs>
-        <w:spacing w:before="40" w:after="80" w:line="312" w:lineRule="auto"/>
-        <w:jc w:val="both"/>
-        <w:ind w:left="0" w:firstLine="288"/>
-      </w:pPr>
-      <w:r>
-        <w:rPr>
-          <w:rFonts w:ascii="Georgia" w:hAnsi="Georgia" w:cs="Georgia"/>
-          <w:b w:val="0"/>
-          <w:i w:val="0"/>
-          <w:sz w:val="22"/>
-        </w:rPr>
-        <w:t>Chapter 9: Script: The "Are You OK?" Burnout Check-in</w:t>
-      </w:r>
-      <w:r>
-        <w:rPr>
-          <w:rFonts w:ascii="Georgia" w:hAnsi="Georgia" w:cs="Georgia"/>
-          <w:b w:val="0"/>
-          <w:i w:val="0"/>
-          <w:sz w:val="22"/>
-        </w:rPr>
-        <w:tab/>
-      </w:r>
-      <w:r>
-        <w:rPr>
-          <w:rFonts w:ascii="Georgia" w:hAnsi="Georgia" w:cs="Georgia"/>
-          <w:b w:val="0"/>
-          <w:i w:val="0"/>
-          <w:sz w:val="22"/>
-        </w:rPr>
-        <w:t>00</w:t>
-      </w:r>
-    </w:p>
-    <w:p>
-      <w:pPr>
-        <w:tabs>
-          <w:tab w:pos="6480" w:val="right" w:leader="dot"/>
-        </w:tabs>
-        <w:spacing w:before="40" w:after="80" w:line="312" w:lineRule="auto"/>
-        <w:jc w:val="both"/>
-        <w:ind w:left="0" w:firstLine="288"/>
-      </w:pPr>
-      <w:r>
-        <w:rPr>
-          <w:rFonts w:ascii="Georgia" w:hAnsi="Georgia" w:cs="Georgia"/>
-          <w:b w:val="0"/>
-          <w:i w:val="0"/>
-          <w:sz w:val="22"/>
-        </w:rPr>
-        <w:t>Chapter 10: Scripts for Remote and Hybrid Teams</w:t>
-      </w:r>
-      <w:r>
-        <w:rPr>
-          <w:rFonts w:ascii="Georgia" w:hAnsi="Georgia" w:cs="Georgia"/>
-          <w:b w:val="0"/>
-          <w:i w:val="0"/>
-          <w:sz w:val="22"/>
-        </w:rPr>
-        <w:tab/>
-      </w:r>
-      <w:r>
-        <w:rPr>
-          <w:rFonts w:ascii="Georgia" w:hAnsi="Georgia" w:cs="Georgia"/>
-          <w:b w:val="0"/>
-          <w:i w:val="0"/>
-          <w:sz w:val="22"/>
-        </w:rPr>
-        <w:t>00</w:t>
-      </w:r>
-    </w:p>
-    <w:p>
-      <w:pPr>
-        <w:tabs>
-          <w:tab w:pos="6480" w:val="right" w:leader="dot"/>
-        </w:tabs>
-        <w:spacing w:before="40" w:after="80" w:line="312" w:lineRule="auto"/>
-        <w:jc w:val="both"/>
-        <w:ind w:left="0" w:firstLine="288"/>
-      </w:pPr>
-      <w:r>
-        <w:rPr>
-          <w:rFonts w:ascii="Georgia" w:hAnsi="Georgia" w:cs="Georgia"/>
-          <w:b w:val="0"/>
-          <w:i w:val="0"/>
-          <w:sz w:val="22"/>
-        </w:rPr>
-        <w:t>Chapter 11: After the Conversation: The Follow-up Framework</w:t>
-      </w:r>
-      <w:r>
-        <w:rPr>
-          <w:rFonts w:ascii="Georgia" w:hAnsi="Georgia" w:cs="Georgia"/>
-          <w:b w:val="0"/>
-          <w:i w:val="0"/>
-          <w:sz w:val="22"/>
-        </w:rPr>
-        <w:tab/>
-      </w:r>
-      <w:r>
-        <w:rPr>
-          <w:rFonts w:ascii="Georgia" w:hAnsi="Georgia" w:cs="Georgia"/>
-          <w:b w:val="0"/>
-          <w:i w:val="0"/>
-          <w:sz w:val="22"/>
-        </w:rPr>
-        <w:t>00</w:t>
-      </w:r>
-    </w:p>
-    <w:p>
-      <w:pPr>
-        <w:tabs>
-          <w:tab w:pos="6480" w:val="right" w:leader="dot"/>
-        </w:tabs>
-        <w:spacing w:before="40" w:after="80" w:line="312" w:lineRule="auto"/>
-        <w:jc w:val="both"/>
-        <w:ind w:left="0" w:firstLine="288"/>
-      </w:pPr>
-      <w:r>
-        <w:rPr>
-          <w:rFonts w:ascii="Georgia" w:hAnsi="Georgia" w:cs="Georgia"/>
-          <w:b w:val="0"/>
-          <w:i w:val="0"/>
-          <w:sz w:val="22"/>
-        </w:rPr>
-        <w:t>Chapter 12: Common Mistakes and How to Avoid Them</w:t>
-      </w:r>
-      <w:r>
-        <w:rPr>
-          <w:rFonts w:ascii="Georgia" w:hAnsi="Georgia" w:cs="Georgia"/>
-          <w:b w:val="0"/>
-          <w:i w:val="0"/>
-          <w:sz w:val="22"/>
-        </w:rPr>
-        <w:tab/>
-      </w:r>
-      <w:r>
-        <w:rPr>
-          <w:rFonts w:ascii="Georgia" w:hAnsi="Georgia" w:cs="Georgia"/>
-          <w:b w:val="0"/>
-          <w:i w:val="0"/>
-          <w:sz w:val="22"/>
-        </w:rPr>
-        <w:t>00</w:t>
-      </w:r>
-    </w:p>
-    <w:p>
-      <w:pPr>
-        <w:tabs>
-          <w:tab w:pos="6480" w:val="right" w:leader="dot"/>
-        </w:tabs>
-        <w:spacing w:before="40" w:after="80" w:line="312" w:lineRule="auto"/>
-        <w:jc w:val="both"/>
-        <w:ind w:left="0" w:firstLine="288"/>
-      </w:pPr>
-      <w:r>
-        <w:rPr>
-          <w:rFonts w:ascii="Georgia" w:hAnsi="Georgia" w:cs="Georgia"/>
-          <w:b w:val="0"/>
-          <w:i w:val="0"/>
-          <w:sz w:val="22"/>
-        </w:rPr>
-        <w:t>Chapter 13: Quick Reference Card</w:t>
-      </w:r>
-      <w:r>
-        <w:rPr>
-          <w:rFonts w:ascii="Georgia" w:hAnsi="Georgia" w:cs="Georgia"/>
-          <w:b w:val="0"/>
-          <w:i w:val="0"/>
-          <w:sz w:val="22"/>
-        </w:rPr>
-        <w:tab/>
-      </w:r>
-      <w:r>
-        <w:rPr>
-          <w:rFonts w:ascii="Georgia" w:hAnsi="Georgia" w:cs="Georgia"/>
-          <w:b w:val="0"/>
-          <w:i w:val="0"/>
-          <w:sz w:val="22"/>
-        </w:rPr>
-        <w:t>00</w:t>
-      </w:r>
-    </w:p>
-    <w:p>
-      <w:pPr>
-        <w:tabs>
-          <w:tab w:pos="6480" w:val="right" w:leader="dot"/>
-        </w:tabs>
-        <w:spacing w:before="40" w:after="80" w:line="312" w:lineRule="auto"/>
-        <w:jc w:val="both"/>
-        <w:ind w:left="0" w:firstLine="288"/>
-      </w:pPr>
-      <w:r>
-        <w:rPr>
-          <w:rFonts w:ascii="Georgia" w:hAnsi="Georgia" w:cs="Georgia"/>
-          <w:b w:val="0"/>
-          <w:i w:val="0"/>
-          <w:sz w:val="22"/>
-        </w:rPr>
-        <w:t>About the Author</w:t>
-      </w:r>
-      <w:r>
-        <w:rPr>
-          <w:rFonts w:ascii="Georgia" w:hAnsi="Georgia" w:cs="Georgia"/>
-          <w:b w:val="0"/>
-          <w:i w:val="0"/>
-          <w:sz w:val="22"/>
-        </w:rPr>
-        <w:tab/>
-      </w:r>
-      <w:r>
-        <w:rPr>
-          <w:rFonts w:ascii="Georgia" w:hAnsi="Georgia" w:cs="Georgia"/>
-          <w:b w:val="0"/>
-          <w:i w:val="0"/>
-          <w:sz w:val="22"/>
-        </w:rPr>
-        <w:t>00</w:t>
-      </w:r>
-    </w:p>
-    <w:p>
-      <w:pPr>
-        <w:tabs>
-          <w:tab w:pos="6480" w:val="right" w:leader="dot"/>
-        </w:tabs>
-        <w:spacing w:before="40" w:after="80" w:line="312" w:lineRule="auto"/>
-        <w:jc w:val="both"/>
-        <w:ind w:left="0" w:firstLine="288"/>
-      </w:pPr>
-      <w:r>
-        <w:rPr>
-          <w:rFonts w:ascii="Georgia" w:hAnsi="Georgia" w:cs="Georgia"/>
-          <w:b w:val="0"/>
-          <w:i w:val="0"/>
-          <w:sz w:val="22"/>
-        </w:rPr>
-        <w:t>Also by Lana Wray</w:t>
-      </w:r>
-      <w:r>
-        <w:rPr>
-          <w:rFonts w:ascii="Georgia" w:hAnsi="Georgia" w:cs="Georgia"/>
-          <w:b w:val="0"/>
-          <w:i w:val="0"/>
-          <w:sz w:val="22"/>
-        </w:rPr>
-        <w:tab/>
-      </w:r>
-      <w:r>
-        <w:rPr>
-          <w:rFonts w:ascii="Georgia" w:hAnsi="Georgia" w:cs="Georgia"/>
-          <w:b w:val="0"/>
-          <w:i w:val="0"/>
-          <w:sz w:val="22"/>
-        </w:rPr>
-        <w:t>00</w:t>
-      </w:r>
-    </w:p>
-    <w:p>
+          <w:bCs/>
+        </w:rPr>
+        <w:t xml:space="preserve">Contents</w:t>
+      </w:r>
+    </w:p>
+    <w:p>
+      <w:pPr>
+        <w:rPr>
+          <w:sz w:val="22"/>
+          <w:szCs w:val="22"/>
+        </w:rPr>
+        <w:ind w:left="0" w:firstLine="0"/>
+        <w:spacing w:after="0" w:before="0" w:line="240" w:lineRule="auto"/>
+      </w:pPr>
+    </w:p>
+    <w:p>
+      <w:pPr>
+        <w:jc w:val="left"/>
+        <w:ind w:left="0" w:firstLine="0"/>
+        <w:spacing w:after="0" w:before="0" w:line="240" w:lineRule="auto"/>
+      </w:pPr>
+      <w:r>
+        <w:rPr>
+          <w:rFonts w:ascii="Georgia" w:hAnsi="Georgia" w:cs="Georgia"/>
+          <w:sz w:val="22"/>
+          <w:szCs w:val="22"/>
+        </w:rPr>
+        <w:t xml:space="preserve">Chapter 1: Introduction: Why Difficult Conversations Feel So Hard</w:t>
+      </w:r>
+    </w:p>
+    <w:p>
+      <w:pPr>
+        <w:jc w:val="left"/>
+        <w:ind w:left="0" w:firstLine="0"/>
+        <w:spacing w:after="0" w:before="0" w:line="240" w:lineRule="auto"/>
+      </w:pPr>
+      <w:r>
+        <w:rPr>
+          <w:rFonts w:ascii="Georgia" w:hAnsi="Georgia" w:cs="Georgia"/>
+          <w:sz w:val="22"/>
+          <w:szCs w:val="22"/>
+        </w:rPr>
+        <w:t xml:space="preserve">Chapter 2: The CLEAR Framework</w:t>
+      </w:r>
+    </w:p>
+    <w:p>
+      <w:pPr>
+        <w:jc w:val="left"/>
+        <w:ind w:left="0" w:firstLine="0"/>
+        <w:spacing w:after="0" w:before="0" w:line="240" w:lineRule="auto"/>
+      </w:pPr>
+      <w:r>
+        <w:rPr>
+          <w:rFonts w:ascii="Georgia" w:hAnsi="Georgia" w:cs="Georgia"/>
+          <w:sz w:val="22"/>
+          <w:szCs w:val="22"/>
+        </w:rPr>
+        <w:t xml:space="preserve">Chapter 3: Script: The Performance Improvement Conversation</w:t>
+      </w:r>
+    </w:p>
+    <w:p>
+      <w:pPr>
+        <w:jc w:val="left"/>
+        <w:ind w:left="0" w:firstLine="0"/>
+        <w:spacing w:after="0" w:before="0" w:line="240" w:lineRule="auto"/>
+      </w:pPr>
+      <w:r>
+        <w:rPr>
+          <w:rFonts w:ascii="Georgia" w:hAnsi="Georgia" w:cs="Georgia"/>
+          <w:sz w:val="22"/>
+          <w:szCs w:val="22"/>
+        </w:rPr>
+        <w:t xml:space="preserve">Chapter 4: Script: Delivering Negative Feedback</w:t>
+      </w:r>
+    </w:p>
+    <w:p>
+      <w:pPr>
+        <w:jc w:val="left"/>
+        <w:ind w:left="0" w:firstLine="0"/>
+        <w:spacing w:after="0" w:before="0" w:line="240" w:lineRule="auto"/>
+      </w:pPr>
+      <w:r>
+        <w:rPr>
+          <w:rFonts w:ascii="Georgia" w:hAnsi="Georgia" w:cs="Georgia"/>
+          <w:sz w:val="22"/>
+          <w:szCs w:val="22"/>
+        </w:rPr>
+        <w:t xml:space="preserve">Chapter 5: Script: Addressing Attendance and Behavior Issues</w:t>
+      </w:r>
+    </w:p>
+    <w:p>
+      <w:pPr>
+        <w:jc w:val="left"/>
+        <w:ind w:left="0" w:firstLine="0"/>
+        <w:spacing w:after="0" w:before="0" w:line="240" w:lineRule="auto"/>
+      </w:pPr>
+      <w:r>
+        <w:rPr>
+          <w:rFonts w:ascii="Georgia" w:hAnsi="Georgia" w:cs="Georgia"/>
+          <w:sz w:val="22"/>
+          <w:szCs w:val="22"/>
+        </w:rPr>
+        <w:t xml:space="preserve">Chapter 6: Script: Salary and Promotion Disappointment</w:t>
+      </w:r>
+    </w:p>
+    <w:p>
+      <w:pPr>
+        <w:jc w:val="left"/>
+        <w:ind w:left="0" w:firstLine="0"/>
+        <w:spacing w:after="0" w:before="0" w:line="240" w:lineRule="auto"/>
+      </w:pPr>
+      <w:r>
+        <w:rPr>
+          <w:rFonts w:ascii="Georgia" w:hAnsi="Georgia" w:cs="Georgia"/>
+          <w:sz w:val="22"/>
+          <w:szCs w:val="22"/>
+        </w:rPr>
+        <w:t xml:space="preserve">Chapter 7: Script: Letting Someone Go</w:t>
+      </w:r>
+    </w:p>
+    <w:p>
+      <w:pPr>
+        <w:jc w:val="left"/>
+        <w:ind w:left="0" w:firstLine="0"/>
+        <w:spacing w:after="0" w:before="0" w:line="240" w:lineRule="auto"/>
+      </w:pPr>
+      <w:r>
+        <w:rPr>
+          <w:rFonts w:ascii="Georgia" w:hAnsi="Georgia" w:cs="Georgia"/>
+          <w:sz w:val="22"/>
+          <w:szCs w:val="22"/>
+        </w:rPr>
+        <w:t xml:space="preserve">Chapter 8: Script: Addressing Team Conflict</w:t>
+      </w:r>
+    </w:p>
+    <w:p>
+      <w:pPr>
+        <w:jc w:val="left"/>
+        <w:ind w:left="0" w:firstLine="0"/>
+        <w:spacing w:after="0" w:before="0" w:line="240" w:lineRule="auto"/>
+      </w:pPr>
+      <w:r>
+        <w:rPr>
+          <w:rFonts w:ascii="Georgia" w:hAnsi="Georgia" w:cs="Georgia"/>
+          <w:sz w:val="22"/>
+          <w:szCs w:val="22"/>
+        </w:rPr>
+        <w:t xml:space="preserve">Chapter 9: Script: The “Are You OK?” Burnout Check-in</w:t>
+      </w:r>
+    </w:p>
+    <w:p>
+      <w:pPr>
+        <w:jc w:val="left"/>
+        <w:ind w:left="0" w:firstLine="0"/>
+        <w:spacing w:after="0" w:before="0" w:line="240" w:lineRule="auto"/>
+      </w:pPr>
+      <w:r>
+        <w:rPr>
+          <w:rFonts w:ascii="Georgia" w:hAnsi="Georgia" w:cs="Georgia"/>
+          <w:sz w:val="22"/>
+          <w:szCs w:val="22"/>
+        </w:rPr>
+        <w:t xml:space="preserve">Chapter 10: Scripts for Remote and Hybrid Teams</w:t>
+      </w:r>
+    </w:p>
+    <w:p>
+      <w:pPr>
+        <w:jc w:val="left"/>
+        <w:ind w:left="0" w:firstLine="0"/>
+        <w:spacing w:after="0" w:before="0" w:line="240" w:lineRule="auto"/>
+      </w:pPr>
+      <w:r>
+        <w:rPr>
+          <w:rFonts w:ascii="Georgia" w:hAnsi="Georgia" w:cs="Georgia"/>
+          <w:sz w:val="22"/>
+          <w:szCs w:val="22"/>
+        </w:rPr>
+        <w:t xml:space="preserve">Chapter 11: After the Conversation: The Follow-up Framework</w:t>
+      </w:r>
+    </w:p>
+    <w:p>
+      <w:pPr>
+        <w:jc w:val="left"/>
+        <w:ind w:left="0" w:firstLine="0"/>
+        <w:spacing w:after="0" w:before="0" w:line="240" w:lineRule="auto"/>
+      </w:pPr>
+      <w:r>
+        <w:rPr>
+          <w:rFonts w:ascii="Georgia" w:hAnsi="Georgia" w:cs="Georgia"/>
+          <w:sz w:val="22"/>
+          <w:szCs w:val="22"/>
+        </w:rPr>
+        <w:t xml:space="preserve">Chapter 12: Common Mistakes and How to Avoid Them</w:t>
+      </w:r>
+    </w:p>
+    <w:p>
+      <w:pPr>
+        <w:jc w:val="left"/>
+        <w:ind w:left="0" w:firstLine="0"/>
+        <w:spacing w:after="0" w:before="0" w:line="240" w:lineRule="auto"/>
+      </w:pPr>
+      <w:r>
+        <w:rPr>
+          <w:rFonts w:ascii="Georgia" w:hAnsi="Georgia" w:cs="Georgia"/>
+          <w:sz w:val="22"/>
+          <w:szCs w:val="22"/>
+        </w:rPr>
+        <w:t xml:space="preserve">Chapter 13: Quick Reference Card</w:t>
+      </w:r>
+    </w:p>
+    <w:p>
+      <w:pPr>
+        <w:jc w:val="left"/>
+        <w:ind w:left="0" w:firstLine="0"/>
+        <w:spacing w:after="0" w:before="0" w:line="240" w:lineRule="auto"/>
+      </w:pPr>
+      <w:r>
+        <w:rPr>
+          <w:rFonts w:ascii="Georgia" w:hAnsi="Georgia" w:cs="Georgia"/>
+          <w:sz w:val="22"/>
+          <w:szCs w:val="22"/>
+        </w:rPr>
+        <w:t xml:space="preserve">About the Author</w:t>
+      </w:r>
+    </w:p>
+    <w:p>
+      <w:pPr>
+        <w:ind w:left="0" w:firstLine="0"/>
+        <w:spacing w:after="0" w:before="0" w:line="240" w:lineRule="auto"/>
+      </w:pPr>
       <w:r>
         <w:br w:type="page"/>
       </w:r>
@@ -1403,6 +1509,7 @@
           <w:cols w:space="720"/>
           <w:docGrid w:linePitch="360"/>
         </w:sectPr>
+        <w:ind w:left="0" w:firstLine="0"/>
       </w:pPr>
     </w:p>
     <w:p>
@@ -13903,7 +14010,11 @@
         </w:tc>
       </w:tr>
     </w:tbl>
-    <w:p/>
+    <w:p>
+      <w:pPr>
+        <w:ind w:left="0" w:firstLine="0"/>
+      </w:pPr>
+    </w:p>
     <w:p>
       <w:pPr>
         <w:keepNext/>
@@ -14503,7 +14614,11 @@
         </w:tc>
       </w:tr>
     </w:tbl>
-    <w:p/>
+    <w:p>
+      <w:pPr>
+        <w:ind w:left="0" w:firstLine="0"/>
+      </w:pPr>
+    </w:p>
     <w:p>
       <w:pPr>
         <w:keepNext/>
@@ -15227,7 +15342,11 @@
         </w:tc>
       </w:tr>
     </w:tbl>
-    <w:p/>
+    <w:p>
+      <w:pPr>
+        <w:ind w:left="0" w:firstLine="0"/>
+      </w:pPr>
+    </w:p>
     <w:p>
       <w:pPr>
         <w:keepNext/>
@@ -16444,7 +16563,11 @@
         </w:tc>
       </w:tr>
     </w:tbl>
-    <w:p/>
+    <w:p>
+      <w:pPr>
+        <w:ind w:left="0" w:firstLine="0"/>
+      </w:pPr>
+    </w:p>
     <w:p>
       <w:pPr>
         <w:keepNext/>
@@ -17875,7 +17998,11 @@
         </w:tc>
       </w:tr>
     </w:tbl>
-    <w:p/>
+    <w:p>
+      <w:pPr>
+        <w:ind w:left="0" w:firstLine="0"/>
+      </w:pPr>
+    </w:p>
     <w:p>
       <w:pPr>
         <w:keepNext/>
@@ -18289,7 +18416,11 @@
         </w:tc>
       </w:tr>
     </w:tbl>
-    <w:p/>
+    <w:p>
+      <w:pPr>
+        <w:ind w:left="0" w:firstLine="0"/>
+      </w:pPr>
+    </w:p>
     <w:p>
       <w:pPr>
         <w:keepNext/>
@@ -18693,7 +18824,11 @@
         </w:tc>
       </w:tr>
     </w:tbl>
-    <w:p/>
+    <w:p>
+      <w:pPr>
+        <w:ind w:left="0" w:firstLine="0"/>
+      </w:pPr>
+    </w:p>
     <w:p>
       <w:pPr>
         <w:keepNext/>
@@ -19621,7 +19756,11 @@
         </w:tc>
       </w:tr>
     </w:tbl>
-    <w:p/>
+    <w:p>
+      <w:pPr>
+        <w:ind w:left="0" w:firstLine="0"/>
+      </w:pPr>
+    </w:p>
     <w:p>
       <w:pPr>
         <w:keepNext/>
@@ -20737,7 +20876,11 @@
         </w:tc>
       </w:tr>
     </w:tbl>
-    <w:p/>
+    <w:p>
+      <w:pPr>
+        <w:ind w:left="0" w:firstLine="0"/>
+      </w:pPr>
+    </w:p>
     <w:p>
       <w:pPr>
         <w:keepNext/>
@@ -20973,6 +21116,7 @@
     <w:p>
       <w:pPr>
         <w:spacing w:before="0" w:after="0"/>
+        <w:ind w:left="0" w:firstLine="0"/>
       </w:pPr>
       <w:r>
         <w:rPr>
@@ -21036,6 +21180,7 @@
     <w:p>
       <w:pPr>
         <w:spacing w:before="0" w:after="0"/>
+        <w:ind w:left="0" w:firstLine="0"/>
       </w:pPr>
       <w:r>
         <w:rPr>
@@ -21378,7 +21523,8 @@
     <w:pPr>
       <w:keepNext/>
       <w:keepLines/>
-      <w:spacing w:before="480" w:after="0"/>
+      <w:spacing w:before="720" w:after="0"/>
+      <w:jc w:val="left"/>
       <w:outlineLvl w:val="0"/>
     </w:pPr>
     <w:rPr>

</xml_diff>

<commit_message>
Paperback: Word TOC field + Heading 1 styles for chapters + LEFT headings
</commit_message>
<xml_diff>
--- a/kdp-files/difficult_conversations_paperback.docx
+++ b/kdp-files/difficult_conversations_paperback.docx
@@ -1274,231 +1274,25 @@
     </w:p>
     <w:p>
       <w:pPr>
-        <w:rPr>
-          <w:sz w:val="22"/>
-          <w:szCs w:val="22"/>
-        </w:rPr>
-        <w:ind w:left="0" w:firstLine="0"/>
-        <w:spacing w:after="0" w:before="0" w:line="240" w:lineRule="auto"/>
-      </w:pPr>
-    </w:p>
-    <w:p>
-      <w:pPr>
-        <w:jc w:val="left"/>
-        <w:ind w:left="0" w:firstLine="0"/>
-        <w:spacing w:after="0" w:before="0" w:line="240" w:lineRule="auto"/>
-      </w:pPr>
-      <w:r>
-        <w:rPr>
-          <w:rFonts w:ascii="Georgia" w:hAnsi="Georgia" w:cs="Georgia"/>
-          <w:sz w:val="22"/>
-          <w:szCs w:val="22"/>
-        </w:rPr>
-        <w:t xml:space="preserve">Chapter 1: Introduction: Why Difficult Conversations Feel So Hard</w:t>
-      </w:r>
-    </w:p>
-    <w:p>
-      <w:pPr>
-        <w:jc w:val="left"/>
-        <w:ind w:left="0" w:firstLine="0"/>
-        <w:spacing w:after="0" w:before="0" w:line="240" w:lineRule="auto"/>
-      </w:pPr>
-      <w:r>
-        <w:rPr>
-          <w:rFonts w:ascii="Georgia" w:hAnsi="Georgia" w:cs="Georgia"/>
-          <w:sz w:val="22"/>
-          <w:szCs w:val="22"/>
-        </w:rPr>
-        <w:t xml:space="preserve">Chapter 2: The CLEAR Framework</w:t>
-      </w:r>
-    </w:p>
-    <w:p>
-      <w:pPr>
-        <w:jc w:val="left"/>
-        <w:ind w:left="0" w:firstLine="0"/>
-        <w:spacing w:after="0" w:before="0" w:line="240" w:lineRule="auto"/>
-      </w:pPr>
-      <w:r>
-        <w:rPr>
-          <w:rFonts w:ascii="Georgia" w:hAnsi="Georgia" w:cs="Georgia"/>
-          <w:sz w:val="22"/>
-          <w:szCs w:val="22"/>
-        </w:rPr>
-        <w:t xml:space="preserve">Chapter 3: Script: The Performance Improvement Conversation</w:t>
-      </w:r>
-    </w:p>
-    <w:p>
-      <w:pPr>
-        <w:jc w:val="left"/>
-        <w:ind w:left="0" w:firstLine="0"/>
-        <w:spacing w:after="0" w:before="0" w:line="240" w:lineRule="auto"/>
-      </w:pPr>
-      <w:r>
-        <w:rPr>
-          <w:rFonts w:ascii="Georgia" w:hAnsi="Georgia" w:cs="Georgia"/>
-          <w:sz w:val="22"/>
-          <w:szCs w:val="22"/>
-        </w:rPr>
-        <w:t xml:space="preserve">Chapter 4: Script: Delivering Negative Feedback</w:t>
-      </w:r>
-    </w:p>
-    <w:p>
-      <w:pPr>
-        <w:jc w:val="left"/>
-        <w:ind w:left="0" w:firstLine="0"/>
-        <w:spacing w:after="0" w:before="0" w:line="240" w:lineRule="auto"/>
-      </w:pPr>
-      <w:r>
-        <w:rPr>
-          <w:rFonts w:ascii="Georgia" w:hAnsi="Georgia" w:cs="Georgia"/>
-          <w:sz w:val="22"/>
-          <w:szCs w:val="22"/>
-        </w:rPr>
-        <w:t xml:space="preserve">Chapter 5: Script: Addressing Attendance and Behavior Issues</w:t>
-      </w:r>
-    </w:p>
-    <w:p>
-      <w:pPr>
-        <w:jc w:val="left"/>
-        <w:ind w:left="0" w:firstLine="0"/>
-        <w:spacing w:after="0" w:before="0" w:line="240" w:lineRule="auto"/>
-      </w:pPr>
-      <w:r>
-        <w:rPr>
-          <w:rFonts w:ascii="Georgia" w:hAnsi="Georgia" w:cs="Georgia"/>
-          <w:sz w:val="22"/>
-          <w:szCs w:val="22"/>
-        </w:rPr>
-        <w:t xml:space="preserve">Chapter 6: Script: Salary and Promotion Disappointment</w:t>
-      </w:r>
-    </w:p>
-    <w:p>
-      <w:pPr>
-        <w:jc w:val="left"/>
-        <w:ind w:left="0" w:firstLine="0"/>
-        <w:spacing w:after="0" w:before="0" w:line="240" w:lineRule="auto"/>
-      </w:pPr>
-      <w:r>
-        <w:rPr>
-          <w:rFonts w:ascii="Georgia" w:hAnsi="Georgia" w:cs="Georgia"/>
-          <w:sz w:val="22"/>
-          <w:szCs w:val="22"/>
-        </w:rPr>
-        <w:t xml:space="preserve">Chapter 7: Script: Letting Someone Go</w:t>
-      </w:r>
-    </w:p>
-    <w:p>
-      <w:pPr>
-        <w:jc w:val="left"/>
-        <w:ind w:left="0" w:firstLine="0"/>
-        <w:spacing w:after="0" w:before="0" w:line="240" w:lineRule="auto"/>
-      </w:pPr>
-      <w:r>
-        <w:rPr>
-          <w:rFonts w:ascii="Georgia" w:hAnsi="Georgia" w:cs="Georgia"/>
-          <w:sz w:val="22"/>
-          <w:szCs w:val="22"/>
-        </w:rPr>
-        <w:t xml:space="preserve">Chapter 8: Script: Addressing Team Conflict</w:t>
-      </w:r>
-    </w:p>
-    <w:p>
-      <w:pPr>
-        <w:jc w:val="left"/>
-        <w:ind w:left="0" w:firstLine="0"/>
-        <w:spacing w:after="0" w:before="0" w:line="240" w:lineRule="auto"/>
-      </w:pPr>
-      <w:r>
-        <w:rPr>
-          <w:rFonts w:ascii="Georgia" w:hAnsi="Georgia" w:cs="Georgia"/>
-          <w:sz w:val="22"/>
-          <w:szCs w:val="22"/>
-        </w:rPr>
-        <w:t xml:space="preserve">Chapter 9: Script: The “Are You OK?” Burnout Check-in</w:t>
-      </w:r>
-    </w:p>
-    <w:p>
-      <w:pPr>
-        <w:jc w:val="left"/>
-        <w:ind w:left="0" w:firstLine="0"/>
-        <w:spacing w:after="0" w:before="0" w:line="240" w:lineRule="auto"/>
-      </w:pPr>
-      <w:r>
-        <w:rPr>
-          <w:rFonts w:ascii="Georgia" w:hAnsi="Georgia" w:cs="Georgia"/>
-          <w:sz w:val="22"/>
-          <w:szCs w:val="22"/>
-        </w:rPr>
-        <w:t xml:space="preserve">Chapter 10: Scripts for Remote and Hybrid Teams</w:t>
-      </w:r>
-    </w:p>
-    <w:p>
-      <w:pPr>
-        <w:jc w:val="left"/>
-        <w:ind w:left="0" w:firstLine="0"/>
-        <w:spacing w:after="0" w:before="0" w:line="240" w:lineRule="auto"/>
-      </w:pPr>
-      <w:r>
-        <w:rPr>
-          <w:rFonts w:ascii="Georgia" w:hAnsi="Georgia" w:cs="Georgia"/>
-          <w:sz w:val="22"/>
-          <w:szCs w:val="22"/>
-        </w:rPr>
-        <w:t xml:space="preserve">Chapter 11: After the Conversation: The Follow-up Framework</w:t>
-      </w:r>
-    </w:p>
-    <w:p>
-      <w:pPr>
-        <w:jc w:val="left"/>
-        <w:ind w:left="0" w:firstLine="0"/>
-        <w:spacing w:after="0" w:before="0" w:line="240" w:lineRule="auto"/>
-      </w:pPr>
-      <w:r>
-        <w:rPr>
-          <w:rFonts w:ascii="Georgia" w:hAnsi="Georgia" w:cs="Georgia"/>
-          <w:sz w:val="22"/>
-          <w:szCs w:val="22"/>
-        </w:rPr>
-        <w:t xml:space="preserve">Chapter 12: Common Mistakes and How to Avoid Them</w:t>
-      </w:r>
-    </w:p>
-    <w:p>
-      <w:pPr>
-        <w:jc w:val="left"/>
-        <w:ind w:left="0" w:firstLine="0"/>
-        <w:spacing w:after="0" w:before="0" w:line="240" w:lineRule="auto"/>
-      </w:pPr>
-      <w:r>
-        <w:rPr>
-          <w:rFonts w:ascii="Georgia" w:hAnsi="Georgia" w:cs="Georgia"/>
-          <w:sz w:val="22"/>
-          <w:szCs w:val="22"/>
-        </w:rPr>
-        <w:t xml:space="preserve">Chapter 13: Quick Reference Card</w:t>
-      </w:r>
-    </w:p>
-    <w:p>
-      <w:pPr>
-        <w:jc w:val="left"/>
-        <w:ind w:left="0" w:firstLine="0"/>
-        <w:spacing w:after="0" w:before="0" w:line="240" w:lineRule="auto"/>
-      </w:pPr>
-      <w:r>
-        <w:rPr>
-          <w:rFonts w:ascii="Georgia" w:hAnsi="Georgia" w:cs="Georgia"/>
-          <w:sz w:val="22"/>
-          <w:szCs w:val="22"/>
-        </w:rPr>
-        <w:t xml:space="preserve">About the Author</w:t>
-      </w:r>
-    </w:p>
-    <w:p>
-      <w:pPr>
-        <w:ind w:left="0" w:firstLine="0"/>
-        <w:spacing w:after="0" w:before="0" w:line="240" w:lineRule="auto"/>
-      </w:pPr>
-      <w:r>
-        <w:br w:type="page"/>
+        <w:spacing w:before="240"/>
+      </w:pPr>
+      <w:r>
+        <w:fldChar w:fldCharType="begin"/>
+      </w:r>
+      <w:r>
+        <w:instrText xml:space="preserve"> TOC \o "1-1" \h \z \u </w:instrText>
+      </w:r>
+      <w:r>
+        <w:fldChar w:fldCharType="separate"/>
+      </w:r>
+      <w:r>
+        <w:rPr>
+          <w:sz w:val="22"/>
+        </w:rPr>
+        <w:t>[Right-click → Update Field to generate Table of Contents]</w:t>
+      </w:r>
+      <w:r>
+        <w:fldChar w:fldCharType="end"/>
       </w:r>
     </w:p>
     <w:p>
@@ -1514,10 +1308,11 @@
     </w:p>
     <w:p>
       <w:pPr>
+        <w:pStyle w:val="Heading1"/>
         <w:keepNext/>
         <w:pageBreakBefore/>
-        <w:spacing w:before="720" w:after="360" w:line="276" w:lineRule="auto"/>
-        <w:jc w:val="both"/>
+        <w:spacing w:before="720" w:after="240" w:line="276" w:lineRule="auto"/>
+        <w:jc w:val="left"/>
         <w:ind w:left="0" w:firstLine="288"/>
       </w:pPr>
       <w:r>
@@ -1525,6 +1320,7 @@
           <w:rFonts w:ascii="Georgia" w:hAnsi="Georgia" w:cs="Georgia"/>
           <w:b/>
           <w:i w:val="0"/>
+          <w:color w:val="000000"/>
           <w:sz w:val="36"/>
         </w:rPr>
         <w:t>Chapter 1: Introduction: Why Difficult Conversations Feel So Hard</w:t>
@@ -2996,10 +2792,11 @@
     </w:p>
     <w:p>
       <w:pPr>
+        <w:pStyle w:val="Heading1"/>
         <w:keepNext/>
         <w:pageBreakBefore/>
-        <w:spacing w:before="720" w:after="360" w:line="276" w:lineRule="auto"/>
-        <w:jc w:val="both"/>
+        <w:spacing w:before="720" w:after="240" w:line="276" w:lineRule="auto"/>
+        <w:jc w:val="left"/>
         <w:ind w:left="0" w:firstLine="288"/>
       </w:pPr>
       <w:r>
@@ -3007,6 +2804,7 @@
           <w:rFonts w:ascii="Georgia" w:hAnsi="Georgia" w:cs="Georgia"/>
           <w:b/>
           <w:i w:val="0"/>
+          <w:color w:val="000000"/>
           <w:sz w:val="36"/>
         </w:rPr>
         <w:t>Chapter 2: The CLEAR Framework</w:t>
@@ -4818,10 +4616,11 @@
     </w:p>
     <w:p>
       <w:pPr>
+        <w:pStyle w:val="Heading1"/>
         <w:keepNext/>
         <w:pageBreakBefore/>
-        <w:spacing w:before="720" w:after="360" w:line="276" w:lineRule="auto"/>
-        <w:jc w:val="both"/>
+        <w:spacing w:before="720" w:after="240" w:line="276" w:lineRule="auto"/>
+        <w:jc w:val="left"/>
         <w:ind w:left="0" w:firstLine="288"/>
       </w:pPr>
       <w:r>
@@ -4829,6 +4628,7 @@
           <w:rFonts w:ascii="Georgia" w:hAnsi="Georgia" w:cs="Georgia"/>
           <w:b/>
           <w:i w:val="0"/>
+          <w:color w:val="000000"/>
           <w:sz w:val="36"/>
         </w:rPr>
         <w:t>Chapter 3: Script: The Performance Improvement Conversation</w:t>
@@ -5524,10 +5324,11 @@
     </w:p>
     <w:p>
       <w:pPr>
+        <w:pStyle w:val="Heading1"/>
         <w:keepNext/>
         <w:pageBreakBefore/>
-        <w:spacing w:before="720" w:after="360" w:line="276" w:lineRule="auto"/>
-        <w:jc w:val="both"/>
+        <w:spacing w:before="720" w:after="240" w:line="276" w:lineRule="auto"/>
+        <w:jc w:val="left"/>
         <w:ind w:left="0" w:firstLine="288"/>
       </w:pPr>
       <w:r>
@@ -5535,6 +5336,7 @@
           <w:rFonts w:ascii="Georgia" w:hAnsi="Georgia" w:cs="Georgia"/>
           <w:b/>
           <w:i w:val="0"/>
+          <w:color w:val="000000"/>
           <w:sz w:val="36"/>
         </w:rPr>
         <w:t>Chapter 4: Script: Delivering Negative Feedback</w:t>
@@ -6217,10 +6019,11 @@
     </w:p>
     <w:p>
       <w:pPr>
+        <w:pStyle w:val="Heading1"/>
         <w:keepNext/>
         <w:pageBreakBefore/>
-        <w:spacing w:before="720" w:after="360" w:line="276" w:lineRule="auto"/>
-        <w:jc w:val="both"/>
+        <w:spacing w:before="720" w:after="240" w:line="276" w:lineRule="auto"/>
+        <w:jc w:val="left"/>
         <w:ind w:left="0" w:firstLine="288"/>
       </w:pPr>
       <w:r>
@@ -6228,6 +6031,7 @@
           <w:rFonts w:ascii="Georgia" w:hAnsi="Georgia" w:cs="Georgia"/>
           <w:b/>
           <w:i w:val="0"/>
+          <w:color w:val="000000"/>
           <w:sz w:val="36"/>
         </w:rPr>
         <w:t>Chapter 5: Script: Addressing Attendance and Behavior Issues</w:t>
@@ -7078,10 +6882,11 @@
     </w:p>
     <w:p>
       <w:pPr>
+        <w:pStyle w:val="Heading1"/>
         <w:keepNext/>
         <w:pageBreakBefore/>
-        <w:spacing w:before="720" w:after="360" w:line="276" w:lineRule="auto"/>
-        <w:jc w:val="both"/>
+        <w:spacing w:before="720" w:after="240" w:line="276" w:lineRule="auto"/>
+        <w:jc w:val="left"/>
         <w:ind w:left="0" w:firstLine="288"/>
       </w:pPr>
       <w:r>
@@ -7089,6 +6894,7 @@
           <w:rFonts w:ascii="Georgia" w:hAnsi="Georgia" w:cs="Georgia"/>
           <w:b/>
           <w:i w:val="0"/>
+          <w:color w:val="000000"/>
           <w:sz w:val="36"/>
         </w:rPr>
         <w:t>Chapter 6: Script: Salary and Promotion Disappointment</w:t>
@@ -7866,10 +7672,11 @@
     </w:p>
     <w:p>
       <w:pPr>
+        <w:pStyle w:val="Heading1"/>
         <w:keepNext/>
         <w:pageBreakBefore/>
-        <w:spacing w:before="720" w:after="360" w:line="276" w:lineRule="auto"/>
-        <w:jc w:val="both"/>
+        <w:spacing w:before="720" w:after="240" w:line="276" w:lineRule="auto"/>
+        <w:jc w:val="left"/>
         <w:ind w:left="0" w:firstLine="288"/>
       </w:pPr>
       <w:r>
@@ -7877,6 +7684,7 @@
           <w:rFonts w:ascii="Georgia" w:hAnsi="Georgia" w:cs="Georgia"/>
           <w:b/>
           <w:i w:val="0"/>
+          <w:color w:val="000000"/>
           <w:sz w:val="36"/>
         </w:rPr>
         <w:t>Chapter 7: Script: Letting Someone Go</w:t>
@@ -8757,10 +8565,11 @@
     </w:p>
     <w:p>
       <w:pPr>
+        <w:pStyle w:val="Heading1"/>
         <w:keepNext/>
         <w:pageBreakBefore/>
-        <w:spacing w:before="720" w:after="360" w:line="276" w:lineRule="auto"/>
-        <w:jc w:val="both"/>
+        <w:spacing w:before="720" w:after="240" w:line="276" w:lineRule="auto"/>
+        <w:jc w:val="left"/>
         <w:ind w:left="0" w:firstLine="288"/>
       </w:pPr>
       <w:r>
@@ -8768,6 +8577,7 @@
           <w:rFonts w:ascii="Georgia" w:hAnsi="Georgia" w:cs="Georgia"/>
           <w:b/>
           <w:i w:val="0"/>
+          <w:color w:val="000000"/>
           <w:sz w:val="36"/>
         </w:rPr>
         <w:t>Chapter 8: Script: Addressing Team Conflict</w:t>
@@ -9568,10 +9378,11 @@
     </w:p>
     <w:p>
       <w:pPr>
+        <w:pStyle w:val="Heading1"/>
         <w:keepNext/>
         <w:pageBreakBefore/>
-        <w:spacing w:before="720" w:after="360" w:line="276" w:lineRule="auto"/>
-        <w:jc w:val="both"/>
+        <w:spacing w:before="720" w:after="240" w:line="276" w:lineRule="auto"/>
+        <w:jc w:val="left"/>
         <w:ind w:left="0" w:firstLine="288"/>
       </w:pPr>
       <w:r>
@@ -9579,6 +9390,7 @@
           <w:rFonts w:ascii="Georgia" w:hAnsi="Georgia" w:cs="Georgia"/>
           <w:b/>
           <w:i w:val="0"/>
+          <w:color w:val="000000"/>
           <w:sz w:val="36"/>
         </w:rPr>
         <w:t>Chapter 9: Script: The "Are You OK?" Burnout Check-in</w:t>
@@ -10487,10 +10299,11 @@
     </w:p>
     <w:p>
       <w:pPr>
+        <w:pStyle w:val="Heading1"/>
         <w:keepNext/>
         <w:pageBreakBefore/>
-        <w:spacing w:before="720" w:after="360" w:line="276" w:lineRule="auto"/>
-        <w:jc w:val="both"/>
+        <w:spacing w:before="720" w:after="240" w:line="276" w:lineRule="auto"/>
+        <w:jc w:val="left"/>
         <w:ind w:left="0" w:firstLine="288"/>
       </w:pPr>
       <w:r>
@@ -10498,6 +10311,7 @@
           <w:rFonts w:ascii="Georgia" w:hAnsi="Georgia" w:cs="Georgia"/>
           <w:b/>
           <w:i w:val="0"/>
+          <w:color w:val="000000"/>
           <w:sz w:val="36"/>
         </w:rPr>
         <w:t>Chapter 10: Scripts for Remote and Hybrid Teams</w:t>
@@ -15349,10 +15163,11 @@
     </w:p>
     <w:p>
       <w:pPr>
+        <w:pStyle w:val="Heading1"/>
         <w:keepNext/>
         <w:pageBreakBefore/>
-        <w:spacing w:before="720" w:after="360" w:line="276" w:lineRule="auto"/>
-        <w:jc w:val="both"/>
+        <w:spacing w:before="720" w:after="240" w:line="276" w:lineRule="auto"/>
+        <w:jc w:val="left"/>
         <w:ind w:left="0" w:firstLine="288"/>
       </w:pPr>
       <w:r>
@@ -15360,6 +15175,7 @@
           <w:rFonts w:ascii="Georgia" w:hAnsi="Georgia" w:cs="Georgia"/>
           <w:b/>
           <w:i w:val="0"/>
+          <w:color w:val="000000"/>
           <w:sz w:val="36"/>
         </w:rPr>
         <w:t>Chapter 11: After the Conversation: The Follow-up Framework</w:t>
@@ -16655,10 +16471,11 @@
     </w:p>
     <w:p>
       <w:pPr>
+        <w:pStyle w:val="Heading1"/>
         <w:keepNext/>
         <w:pageBreakBefore/>
-        <w:spacing w:before="720" w:after="360" w:line="276" w:lineRule="auto"/>
-        <w:jc w:val="both"/>
+        <w:spacing w:before="720" w:after="240" w:line="276" w:lineRule="auto"/>
+        <w:jc w:val="left"/>
         <w:ind w:left="0" w:firstLine="288"/>
       </w:pPr>
       <w:r>
@@ -16666,6 +16483,7 @@
           <w:rFonts w:ascii="Georgia" w:hAnsi="Georgia" w:cs="Georgia"/>
           <w:b/>
           <w:i w:val="0"/>
+          <w:color w:val="000000"/>
           <w:sz w:val="36"/>
         </w:rPr>
         <w:t>Chapter 12: Common Mistakes and How to Avoid Them</w:t>
@@ -17537,10 +17355,11 @@
     </w:p>
     <w:p>
       <w:pPr>
+        <w:pStyle w:val="Heading1"/>
         <w:keepNext/>
         <w:pageBreakBefore/>
-        <w:spacing w:before="720" w:after="360" w:line="276" w:lineRule="auto"/>
-        <w:jc w:val="both"/>
+        <w:spacing w:before="720" w:after="240" w:line="276" w:lineRule="auto"/>
+        <w:jc w:val="left"/>
         <w:ind w:left="0" w:firstLine="288"/>
       </w:pPr>
       <w:r>
@@ -17548,6 +17367,7 @@
           <w:rFonts w:ascii="Georgia" w:hAnsi="Georgia" w:cs="Georgia"/>
           <w:b/>
           <w:i w:val="0"/>
+          <w:color w:val="000000"/>
           <w:sz w:val="36"/>
         </w:rPr>
         <w:t>Chapter 13: Quick Reference Card</w:t>
@@ -21015,10 +20835,11 @@
     </w:p>
     <w:p>
       <w:pPr>
+        <w:pStyle w:val="Heading1"/>
         <w:keepNext/>
         <w:pageBreakBefore/>
-        <w:spacing w:before="720" w:after="360" w:line="276" w:lineRule="auto"/>
-        <w:jc w:val="both"/>
+        <w:spacing w:before="720" w:after="240" w:line="276" w:lineRule="auto"/>
+        <w:jc w:val="left"/>
         <w:ind w:left="0" w:firstLine="288"/>
       </w:pPr>
       <w:r>
@@ -21026,6 +20847,7 @@
           <w:rFonts w:ascii="Georgia" w:hAnsi="Georgia" w:cs="Georgia"/>
           <w:b/>
           <w:i w:val="0"/>
+          <w:color w:val="000000"/>
           <w:sz w:val="36"/>
         </w:rPr>
         <w:t>About the Author</w:t>

</xml_diff>

<commit_message>
Paperback: remove numId from styles.xml (bullet source), fix Note indent
</commit_message>
<xml_diff>
--- a/kdp-files/difficult_conversations_paperback.docx
+++ b/kdp-files/difficult_conversations_paperback.docx
@@ -1227,15 +1227,15 @@
           <w:sz w:val="22"/>
           <w:szCs w:val="22"/>
         </w:rPr>
-        <w:ind w:left="0" w:firstLine="0"/>
         <w:spacing w:after="0" w:before="0" w:line="240" w:lineRule="auto"/>
-      </w:pPr>
-    </w:p>
-    <w:p>
-      <w:pPr>
-        <w:jc w:val="both"/>
-        <w:ind w:left="0" w:firstLine="0"/>
+        <w:ind w:left="0" w:firstLine="288"/>
+      </w:pPr>
+    </w:p>
+    <w:p>
+      <w:pPr>
+        <w:jc w:val="both"/>
         <w:spacing w:after="0" w:before="0" w:line="240" w:lineRule="auto"/>
+        <w:ind w:left="0" w:firstLine="288"/>
       </w:pPr>
       <w:r>
         <w:rPr>
@@ -4975,7 +4975,6 @@
           <w:i w:val="0"/>
           <w:sz w:val="22"/>
         </w:rPr>
-        <w:t xml:space="preserve">• </w:t>
       </w:r>
       <w:r>
         <w:rPr>
@@ -5000,7 +4999,6 @@
           <w:i w:val="0"/>
           <w:sz w:val="22"/>
         </w:rPr>
-        <w:t xml:space="preserve">• </w:t>
       </w:r>
       <w:r>
         <w:rPr>
@@ -5025,7 +5023,6 @@
           <w:i w:val="0"/>
           <w:sz w:val="22"/>
         </w:rPr>
-        <w:t xml:space="preserve">• </w:t>
       </w:r>
       <w:r>
         <w:rPr>
@@ -5050,7 +5047,6 @@
           <w:i w:val="0"/>
           <w:sz w:val="22"/>
         </w:rPr>
-        <w:t xml:space="preserve">• </w:t>
       </w:r>
       <w:r>
         <w:rPr>
@@ -5075,7 +5071,6 @@
           <w:i w:val="0"/>
           <w:sz w:val="22"/>
         </w:rPr>
-        <w:t xml:space="preserve">• </w:t>
       </w:r>
       <w:r>
         <w:rPr>
@@ -5667,7 +5662,6 @@
           <w:i w:val="0"/>
           <w:sz w:val="22"/>
         </w:rPr>
-        <w:t xml:space="preserve">• </w:t>
       </w:r>
       <w:r>
         <w:rPr>
@@ -5692,7 +5686,6 @@
           <w:i w:val="0"/>
           <w:sz w:val="22"/>
         </w:rPr>
-        <w:t xml:space="preserve">• </w:t>
       </w:r>
       <w:r>
         <w:rPr>
@@ -5717,7 +5710,6 @@
           <w:i w:val="0"/>
           <w:sz w:val="22"/>
         </w:rPr>
-        <w:t xml:space="preserve">• </w:t>
       </w:r>
       <w:r>
         <w:rPr>
@@ -5742,7 +5734,6 @@
           <w:i w:val="0"/>
           <w:sz w:val="22"/>
         </w:rPr>
-        <w:t xml:space="preserve">• </w:t>
       </w:r>
       <w:r>
         <w:rPr>
@@ -5767,7 +5758,6 @@
           <w:i w:val="0"/>
           <w:sz w:val="22"/>
         </w:rPr>
-        <w:t xml:space="preserve">• </w:t>
       </w:r>
       <w:r>
         <w:rPr>
@@ -6480,7 +6470,6 @@
           <w:i w:val="0"/>
           <w:sz w:val="22"/>
         </w:rPr>
-        <w:t xml:space="preserve">• </w:t>
       </w:r>
       <w:r>
         <w:rPr>
@@ -6505,7 +6494,6 @@
           <w:i w:val="0"/>
           <w:sz w:val="22"/>
         </w:rPr>
-        <w:t xml:space="preserve">• </w:t>
       </w:r>
       <w:r>
         <w:rPr>
@@ -6530,7 +6518,6 @@
           <w:i w:val="0"/>
           <w:sz w:val="22"/>
         </w:rPr>
-        <w:t xml:space="preserve">• </w:t>
       </w:r>
       <w:r>
         <w:rPr>
@@ -6555,7 +6542,6 @@
           <w:i w:val="0"/>
           <w:sz w:val="22"/>
         </w:rPr>
-        <w:t xml:space="preserve">• </w:t>
       </w:r>
       <w:r>
         <w:rPr>
@@ -6580,7 +6566,6 @@
           <w:i w:val="0"/>
           <w:sz w:val="22"/>
         </w:rPr>
-        <w:t xml:space="preserve">• </w:t>
       </w:r>
       <w:r>
         <w:rPr>
@@ -7225,7 +7210,6 @@
           <w:i w:val="0"/>
           <w:sz w:val="22"/>
         </w:rPr>
-        <w:t xml:space="preserve">• </w:t>
       </w:r>
       <w:r>
         <w:rPr>
@@ -7250,7 +7234,6 @@
           <w:i w:val="0"/>
           <w:sz w:val="22"/>
         </w:rPr>
-        <w:t xml:space="preserve">• </w:t>
       </w:r>
       <w:r>
         <w:rPr>
@@ -7275,7 +7258,6 @@
           <w:i w:val="0"/>
           <w:sz w:val="22"/>
         </w:rPr>
-        <w:t xml:space="preserve">• </w:t>
       </w:r>
       <w:r>
         <w:rPr>
@@ -7300,7 +7282,6 @@
           <w:i w:val="0"/>
           <w:sz w:val="22"/>
         </w:rPr>
-        <w:t xml:space="preserve">• </w:t>
       </w:r>
       <w:r>
         <w:rPr>
@@ -7325,7 +7306,6 @@
           <w:i w:val="0"/>
           <w:sz w:val="22"/>
         </w:rPr>
-        <w:t xml:space="preserve">• </w:t>
       </w:r>
       <w:r>
         <w:rPr>
@@ -7350,7 +7330,6 @@
           <w:i w:val="0"/>
           <w:sz w:val="22"/>
         </w:rPr>
-        <w:t xml:space="preserve">• </w:t>
       </w:r>
       <w:r>
         <w:rPr>
@@ -8064,7 +8043,6 @@
           <w:i w:val="0"/>
           <w:sz w:val="22"/>
         </w:rPr>
-        <w:t xml:space="preserve">• </w:t>
       </w:r>
       <w:r>
         <w:rPr>
@@ -8089,7 +8067,6 @@
           <w:i w:val="0"/>
           <w:sz w:val="22"/>
         </w:rPr>
-        <w:t xml:space="preserve">• </w:t>
       </w:r>
       <w:r>
         <w:rPr>
@@ -8114,7 +8091,6 @@
           <w:i w:val="0"/>
           <w:sz w:val="22"/>
         </w:rPr>
-        <w:t xml:space="preserve">• </w:t>
       </w:r>
       <w:r>
         <w:rPr>
@@ -8139,7 +8115,6 @@
           <w:i w:val="0"/>
           <w:sz w:val="22"/>
         </w:rPr>
-        <w:t xml:space="preserve">• </w:t>
       </w:r>
       <w:r>
         <w:rPr>
@@ -8164,7 +8139,6 @@
           <w:i w:val="0"/>
           <w:sz w:val="22"/>
         </w:rPr>
-        <w:t xml:space="preserve">• </w:t>
       </w:r>
       <w:r>
         <w:rPr>
@@ -8189,7 +8163,6 @@
           <w:i w:val="0"/>
           <w:sz w:val="22"/>
         </w:rPr>
-        <w:t xml:space="preserve">• </w:t>
       </w:r>
       <w:r>
         <w:rPr>
@@ -8974,7 +8947,6 @@
           <w:i w:val="0"/>
           <w:sz w:val="22"/>
         </w:rPr>
-        <w:t xml:space="preserve">• </w:t>
       </w:r>
       <w:r>
         <w:rPr>
@@ -8999,7 +8971,6 @@
           <w:i w:val="0"/>
           <w:sz w:val="22"/>
         </w:rPr>
-        <w:t xml:space="preserve">• </w:t>
       </w:r>
       <w:r>
         <w:rPr>
@@ -9024,7 +8995,6 @@
           <w:i w:val="0"/>
           <w:sz w:val="22"/>
         </w:rPr>
-        <w:t xml:space="preserve">• </w:t>
       </w:r>
       <w:r>
         <w:rPr>
@@ -9049,7 +9019,6 @@
           <w:i w:val="0"/>
           <w:sz w:val="22"/>
         </w:rPr>
-        <w:t xml:space="preserve">• </w:t>
       </w:r>
       <w:r>
         <w:rPr>
@@ -9074,7 +9043,6 @@
           <w:i w:val="0"/>
           <w:sz w:val="22"/>
         </w:rPr>
-        <w:t xml:space="preserve">• </w:t>
       </w:r>
       <w:r>
         <w:rPr>
@@ -9803,7 +9771,6 @@
           <w:i w:val="0"/>
           <w:sz w:val="22"/>
         </w:rPr>
-        <w:t xml:space="preserve">• </w:t>
       </w:r>
       <w:r>
         <w:rPr>
@@ -9828,7 +9795,6 @@
           <w:i w:val="0"/>
           <w:sz w:val="22"/>
         </w:rPr>
-        <w:t xml:space="preserve">• </w:t>
       </w:r>
       <w:r>
         <w:rPr>
@@ -9853,7 +9819,6 @@
           <w:i w:val="0"/>
           <w:sz w:val="22"/>
         </w:rPr>
-        <w:t xml:space="preserve">• </w:t>
       </w:r>
       <w:r>
         <w:rPr>
@@ -9878,7 +9843,6 @@
           <w:i w:val="0"/>
           <w:sz w:val="22"/>
         </w:rPr>
-        <w:t xml:space="preserve">• </w:t>
       </w:r>
       <w:r>
         <w:rPr>
@@ -9903,7 +9867,6 @@
           <w:i w:val="0"/>
           <w:sz w:val="22"/>
         </w:rPr>
-        <w:t xml:space="preserve">• </w:t>
       </w:r>
       <w:r>
         <w:rPr>
@@ -9928,7 +9891,6 @@
           <w:i w:val="0"/>
           <w:sz w:val="22"/>
         </w:rPr>
-        <w:t xml:space="preserve">• </w:t>
       </w:r>
       <w:r>
         <w:rPr>
@@ -21672,11 +21634,7 @@
     <w:uiPriority w:val="11"/>
     <w:qFormat/>
     <w:rsid w:val="00FC693F"/>
-    <w:pPr>
-      <w:numPr>
-        <w:ilvl w:val="1"/>
-      </w:numPr>
-    </w:pPr>
+    <w:pPr/>
     <w:rPr>
       <w:rFonts w:asciiTheme="majorHAnsi" w:eastAsiaTheme="majorEastAsia" w:hAnsiTheme="majorHAnsi" w:cstheme="majorBidi"/>
       <w:i/>
@@ -21816,9 +21774,6 @@
     <w:unhideWhenUsed/>
     <w:rsid w:val="00326F90"/>
     <w:pPr>
-      <w:numPr>
-        <w:numId w:val="1"/>
-      </w:numPr>
       <w:contextualSpacing/>
     </w:pPr>
   </w:style>
@@ -21829,9 +21784,6 @@
     <w:unhideWhenUsed/>
     <w:rsid w:val="00326F90"/>
     <w:pPr>
-      <w:numPr>
-        <w:numId w:val="2"/>
-      </w:numPr>
       <w:contextualSpacing/>
     </w:pPr>
   </w:style>
@@ -21842,9 +21794,6 @@
     <w:unhideWhenUsed/>
     <w:rsid w:val="00326F90"/>
     <w:pPr>
-      <w:numPr>
-        <w:numId w:val="3"/>
-      </w:numPr>
       <w:contextualSpacing/>
     </w:pPr>
   </w:style>
@@ -21855,9 +21804,6 @@
     <w:unhideWhenUsed/>
     <w:rsid w:val="00326F90"/>
     <w:pPr>
-      <w:numPr>
-        <w:numId w:val="5"/>
-      </w:numPr>
       <w:contextualSpacing/>
     </w:pPr>
   </w:style>
@@ -21868,9 +21814,6 @@
     <w:unhideWhenUsed/>
     <w:rsid w:val="0029639D"/>
     <w:pPr>
-      <w:numPr>
-        <w:numId w:val="6"/>
-      </w:numPr>
       <w:contextualSpacing/>
     </w:pPr>
   </w:style>
@@ -21881,9 +21824,6 @@
     <w:unhideWhenUsed/>
     <w:rsid w:val="0029639D"/>
     <w:pPr>
-      <w:numPr>
-        <w:numId w:val="7"/>
-      </w:numPr>
       <w:contextualSpacing/>
     </w:pPr>
   </w:style>
@@ -33475,9 +33415,6 @@
     <w:qFormat/>
     <w:rsid w:val="00FC693F"/>
     <w:pPr>
-      <w:numPr>
-        <w:ilvl w:val="1"/>
-      </w:numPr>
     </w:pPr>
     <w:rPr>
       <w:rFonts w:asciiTheme="majorHAnsi" w:eastAsiaTheme="majorEastAsia" w:hAnsiTheme="majorHAnsi" w:cstheme="majorBidi"/>
@@ -33618,9 +33555,6 @@
     <w:unhideWhenUsed/>
     <w:rsid w:val="00326F90"/>
     <w:pPr>
-      <w:numPr>
-        <w:numId w:val="1"/>
-      </w:numPr>
       <w:contextualSpacing/>
     </w:pPr>
   </w:style>
@@ -33631,9 +33565,6 @@
     <w:unhideWhenUsed/>
     <w:rsid w:val="00326F90"/>
     <w:pPr>
-      <w:numPr>
-        <w:numId w:val="2"/>
-      </w:numPr>
       <w:contextualSpacing/>
     </w:pPr>
   </w:style>
@@ -33644,9 +33575,6 @@
     <w:unhideWhenUsed/>
     <w:rsid w:val="00326F90"/>
     <w:pPr>
-      <w:numPr>
-        <w:numId w:val="3"/>
-      </w:numPr>
       <w:contextualSpacing/>
     </w:pPr>
   </w:style>
@@ -33657,9 +33585,6 @@
     <w:unhideWhenUsed/>
     <w:rsid w:val="00326F90"/>
     <w:pPr>
-      <w:numPr>
-        <w:numId w:val="5"/>
-      </w:numPr>
       <w:contextualSpacing/>
     </w:pPr>
   </w:style>
@@ -33670,9 +33595,6 @@
     <w:unhideWhenUsed/>
     <w:rsid w:val="0029639D"/>
     <w:pPr>
-      <w:numPr>
-        <w:numId w:val="6"/>
-      </w:numPr>
       <w:contextualSpacing/>
     </w:pPr>
   </w:style>
@@ -33683,9 +33605,6 @@
     <w:unhideWhenUsed/>
     <w:rsid w:val="0029639D"/>
     <w:pPr>
-      <w:numPr>
-        <w:numId w:val="7"/>
-      </w:numPr>
       <w:contextualSpacing/>
     </w:pPr>
   </w:style>

</xml_diff>

<commit_message>
Paperback: remove spaceBefore from chapter headings (0pt)
</commit_message>
<xml_diff>
--- a/kdp-files/difficult_conversations_paperback.docx
+++ b/kdp-files/difficult_conversations_paperback.docx
@@ -1311,7 +1311,7 @@
         <w:pStyle w:val="Heading1"/>
         <w:keepNext/>
         <w:pageBreakBefore/>
-        <w:spacing w:before="720" w:after="240" w:line="276" w:lineRule="auto"/>
+        <w:spacing w:before="0" w:after="240" w:line="276" w:lineRule="auto"/>
         <w:jc w:val="left"/>
         <w:ind w:left="0" w:firstLine="288"/>
       </w:pPr>
@@ -2795,7 +2795,7 @@
         <w:pStyle w:val="Heading1"/>
         <w:keepNext/>
         <w:pageBreakBefore/>
-        <w:spacing w:before="720" w:after="240" w:line="276" w:lineRule="auto"/>
+        <w:spacing w:before="0" w:after="240" w:line="276" w:lineRule="auto"/>
         <w:jc w:val="left"/>
         <w:ind w:left="0" w:firstLine="288"/>
       </w:pPr>
@@ -4619,7 +4619,7 @@
         <w:pStyle w:val="Heading1"/>
         <w:keepNext/>
         <w:pageBreakBefore/>
-        <w:spacing w:before="720" w:after="240" w:line="276" w:lineRule="auto"/>
+        <w:spacing w:before="0" w:after="240" w:line="276" w:lineRule="auto"/>
         <w:jc w:val="left"/>
         <w:ind w:left="0" w:firstLine="288"/>
       </w:pPr>
@@ -5322,7 +5322,7 @@
         <w:pStyle w:val="Heading1"/>
         <w:keepNext/>
         <w:pageBreakBefore/>
-        <w:spacing w:before="720" w:after="240" w:line="276" w:lineRule="auto"/>
+        <w:spacing w:before="0" w:after="240" w:line="276" w:lineRule="auto"/>
         <w:jc w:val="left"/>
         <w:ind w:left="0" w:firstLine="288"/>
       </w:pPr>
@@ -6012,7 +6012,7 @@
         <w:pStyle w:val="Heading1"/>
         <w:keepNext/>
         <w:pageBreakBefore/>
-        <w:spacing w:before="720" w:after="240" w:line="276" w:lineRule="auto"/>
+        <w:spacing w:before="0" w:after="240" w:line="276" w:lineRule="auto"/>
         <w:jc w:val="left"/>
         <w:ind w:left="0" w:firstLine="288"/>
       </w:pPr>
@@ -6870,7 +6870,7 @@
         <w:pStyle w:val="Heading1"/>
         <w:keepNext/>
         <w:pageBreakBefore/>
-        <w:spacing w:before="720" w:after="240" w:line="276" w:lineRule="auto"/>
+        <w:spacing w:before="0" w:after="240" w:line="276" w:lineRule="auto"/>
         <w:jc w:val="left"/>
         <w:ind w:left="0" w:firstLine="288"/>
       </w:pPr>
@@ -7654,7 +7654,7 @@
         <w:pStyle w:val="Heading1"/>
         <w:keepNext/>
         <w:pageBreakBefore/>
-        <w:spacing w:before="720" w:after="240" w:line="276" w:lineRule="auto"/>
+        <w:spacing w:before="0" w:after="240" w:line="276" w:lineRule="auto"/>
         <w:jc w:val="left"/>
         <w:ind w:left="0" w:firstLine="288"/>
       </w:pPr>
@@ -8541,7 +8541,7 @@
         <w:pStyle w:val="Heading1"/>
         <w:keepNext/>
         <w:pageBreakBefore/>
-        <w:spacing w:before="720" w:after="240" w:line="276" w:lineRule="auto"/>
+        <w:spacing w:before="0" w:after="240" w:line="276" w:lineRule="auto"/>
         <w:jc w:val="left"/>
         <w:ind w:left="0" w:firstLine="288"/>
       </w:pPr>
@@ -9349,7 +9349,7 @@
         <w:pStyle w:val="Heading1"/>
         <w:keepNext/>
         <w:pageBreakBefore/>
-        <w:spacing w:before="720" w:after="240" w:line="276" w:lineRule="auto"/>
+        <w:spacing w:before="0" w:after="240" w:line="276" w:lineRule="auto"/>
         <w:jc w:val="left"/>
         <w:ind w:left="0" w:firstLine="288"/>
       </w:pPr>
@@ -10264,7 +10264,7 @@
         <w:pStyle w:val="Heading1"/>
         <w:keepNext/>
         <w:pageBreakBefore/>
-        <w:spacing w:before="720" w:after="240" w:line="276" w:lineRule="auto"/>
+        <w:spacing w:before="0" w:after="240" w:line="276" w:lineRule="auto"/>
         <w:jc w:val="left"/>
         <w:ind w:left="0" w:firstLine="288"/>
       </w:pPr>
@@ -15129,7 +15129,7 @@
         <w:pStyle w:val="Heading1"/>
         <w:keepNext/>
         <w:pageBreakBefore/>
-        <w:spacing w:before="720" w:after="240" w:line="276" w:lineRule="auto"/>
+        <w:spacing w:before="0" w:after="240" w:line="276" w:lineRule="auto"/>
         <w:jc w:val="left"/>
         <w:ind w:left="0" w:firstLine="288"/>
       </w:pPr>
@@ -16437,7 +16437,7 @@
         <w:pStyle w:val="Heading1"/>
         <w:keepNext/>
         <w:pageBreakBefore/>
-        <w:spacing w:before="720" w:after="240" w:line="276" w:lineRule="auto"/>
+        <w:spacing w:before="0" w:after="240" w:line="276" w:lineRule="auto"/>
         <w:jc w:val="left"/>
         <w:ind w:left="0" w:firstLine="288"/>
       </w:pPr>
@@ -17321,7 +17321,7 @@
         <w:pStyle w:val="Heading1"/>
         <w:keepNext/>
         <w:pageBreakBefore/>
-        <w:spacing w:before="720" w:after="240" w:line="276" w:lineRule="auto"/>
+        <w:spacing w:before="0" w:after="240" w:line="276" w:lineRule="auto"/>
         <w:jc w:val="left"/>
         <w:ind w:left="0" w:firstLine="288"/>
       </w:pPr>
@@ -20802,7 +20802,7 @@
         <w:pStyle w:val="Heading1"/>
         <w:keepNext/>
         <w:pageBreakBefore/>
-        <w:spacing w:before="720" w:after="240" w:line="276" w:lineRule="auto"/>
+        <w:spacing w:before="0" w:after="240" w:line="276" w:lineRule="auto"/>
         <w:jc w:val="left"/>
         <w:ind w:left="0" w:firstLine="288"/>
       </w:pPr>
@@ -21309,7 +21309,7 @@
     <w:pPr>
       <w:keepNext/>
       <w:keepLines/>
-      <w:spacing w:before="720" w:after="0"/>
+      <w:spacing w:before="0" w:after="0"/>
       <w:jc w:val="left"/>
       <w:outlineLvl w:val="0"/>
     </w:pPr>

</xml_diff>

<commit_message>
Paperback: mirror margins ON (inside 0.75", outside 0.5")
</commit_message>
<xml_diff>
--- a/kdp-files/difficult_conversations_paperback.docx
+++ b/kdp-files/difficult_conversations_paperback.docx
@@ -1299,9 +1299,10 @@
       <w:pPr>
         <w:sectPr>
           <w:pgSz w:w="8640" w:h="12960"/>
-          <w:pgMar w:top="1080" w:right="720" w:bottom="1080" w:left="720" w:header="720" w:footer="720" w:gutter="0"/>
+          <w:pgMar w:top="1080" w:right="720" w:bottom="1080" w:left="1080" w:header="720" w:footer="720" w:gutter="0"/>
           <w:cols w:space="720"/>
           <w:docGrid w:linePitch="360"/>
+          <w:mirrorMargins/>
         </w:sectPr>
         <w:ind w:left="0" w:firstLine="0"/>
       </w:pPr>
@@ -20998,10 +20999,11 @@
       <w:headerReference w:type="default" r:id="rId10"/>
       <w:footerReference w:type="default" r:id="rId11"/>
       <w:pgSz w:w="8640" w:h="12960"/>
-      <w:pgMar w:top="1080" w:right="720" w:bottom="1080" w:left="720" w:header="720" w:footer="720" w:gutter="0"/>
+      <w:pgMar w:top="1080" w:right="720" w:bottom="1080" w:left="1080" w:header="720" w:footer="720" w:gutter="0"/>
       <w:cols w:space="720"/>
       <w:docGrid w:linePitch="360"/>
       <w:titlePg/>
+      <w:mirrorMargins/>
     </w:sectPr>
   </w:body>
 </w:document>

</xml_diff>

<commit_message>
Paperback: all text black #000000 (was 52 gray #333333 runs)
</commit_message>
<xml_diff>
--- a/kdp-files/difficult_conversations_paperback.docx
+++ b/kdp-files/difficult_conversations_paperback.docx
@@ -4728,7 +4728,7 @@
           <w:rFonts w:ascii="Georgia" w:hAnsi="Georgia" w:cs="Georgia"/>
           <w:b w:val="0"/>
           <w:i/>
-          <w:color w:val="333333"/>
+          <w:color w:val="000000"/>
           <w:sz w:val="21"/>
         </w:rPr>
         <w:t>Thanks for sitting down with me, Alex. I want to have an honest conversation with you because I respect you and I'm invested in your success here. This might be uncomfortable, but my intention is to work through this together.</w:t>
@@ -4777,7 +4777,7 @@
           <w:rFonts w:ascii="Georgia" w:hAnsi="Georgia" w:cs="Georgia"/>
           <w:b w:val="0"/>
           <w:i/>
-          <w:color w:val="333333"/>
+          <w:color w:val="000000"/>
           <w:sz w:val="21"/>
         </w:rPr>
         <w:t>Over the past month, I've noticed a few things I want to talk through. The Henderson report was submitted five days late, the data in the Q3 analysis had several errors that the client caught before we did, and you've missed two of our last four team standups without notice. I want to make sure I'm seeing the full picture — can you help me understand what's been going on?</w:t>
@@ -4842,7 +4842,7 @@
           <w:rFonts w:ascii="Georgia" w:hAnsi="Georgia" w:cs="Georgia"/>
           <w:b w:val="0"/>
           <w:i/>
-          <w:color w:val="333333"/>
+          <w:color w:val="000000"/>
           <w:sz w:val="21"/>
         </w:rPr>
         <w:t>It sounds like you've been dealing with a lot — and I appreciate you sharing that with me.</w:t>
@@ -4891,7 +4891,7 @@
           <w:rFonts w:ascii="Georgia" w:hAnsi="Georgia" w:cs="Georgia"/>
           <w:b w:val="0"/>
           <w:i/>
-          <w:color w:val="333333"/>
+          <w:color w:val="000000"/>
           <w:sz w:val="21"/>
         </w:rPr>
         <w:t>I hear you, and I genuinely empathize with what you're going through. At the same time, I have a responsibility to be honest with you: the current level of work isn't meeting the standard we need, and if it continues, it's going to create bigger problems for you and for the team. I'd rather address it now while we can course-correct.</w:t>
@@ -4940,7 +4940,7 @@
           <w:rFonts w:ascii="Georgia" w:hAnsi="Georgia" w:cs="Georgia"/>
           <w:b w:val="0"/>
           <w:i/>
-          <w:color w:val="333333"/>
+          <w:color w:val="000000"/>
           <w:sz w:val="21"/>
         </w:rPr>
         <w:t>Here's what I'd like to do. Let's put together a 30-day plan — together. I want to hear from you what you think would help. More structure? Different priorities? Adjusted timelines? I'll commit to checking in with you weekly, not to micromanage, but to make sure you have what you need. What do you think?</w:t>
@@ -5431,7 +5431,7 @@
           <w:rFonts w:ascii="Georgia" w:hAnsi="Georgia" w:cs="Georgia"/>
           <w:b w:val="0"/>
           <w:i/>
-          <w:color w:val="333333"/>
+          <w:color w:val="000000"/>
           <w:sz w:val="21"/>
         </w:rPr>
         <w:t>Jordan, do you have 15 minutes? I want to talk about the Whitfield presentation while it's still fresh. I've got some observations I'd like to share, and I'd like to hear your take on it too.</w:t>
@@ -5480,7 +5480,7 @@
           <w:rFonts w:ascii="Georgia" w:hAnsi="Georgia" w:cs="Georgia"/>
           <w:b w:val="0"/>
           <w:i/>
-          <w:color w:val="333333"/>
+          <w:color w:val="000000"/>
           <w:sz w:val="21"/>
         </w:rPr>
         <w:t>I noticed a few things during the presentation. The financial projections on slides 8 and 9 didn't match the numbers in the handout, and when the client asked about it, the response was more of an improvisation than a clear explanation. The client followed up with me afterward expressing concern about accuracy. I know that's not the impression you intended to make.</w:t>
@@ -5529,7 +5529,7 @@
           <w:rFonts w:ascii="Georgia" w:hAnsi="Georgia" w:cs="Georgia"/>
           <w:b w:val="0"/>
           <w:i/>
-          <w:color w:val="333333"/>
+          <w:color w:val="000000"/>
           <w:sz w:val="21"/>
         </w:rPr>
         <w:t>What was your experience of how it went?</w:t>
@@ -5578,7 +5578,7 @@
           <w:rFonts w:ascii="Georgia" w:hAnsi="Georgia" w:cs="Georgia"/>
           <w:b w:val="0"/>
           <w:i/>
-          <w:color w:val="333333"/>
+          <w:color w:val="000000"/>
           <w:sz w:val="21"/>
         </w:rPr>
         <w:t>I appreciate your honesty. Here's what I want to focus on: I know you're capable of much stronger work than what showed up yesterday. I've seen it. So let's figure out what happened and how to prevent it.</w:t>
@@ -5627,7 +5627,7 @@
           <w:rFonts w:ascii="Georgia" w:hAnsi="Georgia" w:cs="Georgia"/>
           <w:b w:val="0"/>
           <w:i/>
-          <w:color w:val="333333"/>
+          <w:color w:val="000000"/>
           <w:sz w:val="21"/>
         </w:rPr>
         <w:t>What would help you feel more prepared next time? Would a dry run with me or someone on the team the day before be useful? I want to set you up to succeed on these.</w:t>
@@ -6137,7 +6137,7 @@
           <w:rFonts w:ascii="Georgia" w:hAnsi="Georgia" w:cs="Georgia"/>
           <w:b w:val="0"/>
           <w:i/>
-          <w:color w:val="333333"/>
+          <w:color w:val="000000"/>
           <w:sz w:val="21"/>
         </w:rPr>
         <w:t>Sam, I want to check in with you on something I've been noticing. I want to approach this with curiosity, not judgment, because I think there might be more to the story than what I'm seeing on the surface.</w:t>
@@ -6186,7 +6186,7 @@
           <w:rFonts w:ascii="Georgia" w:hAnsi="Georgia" w:cs="Georgia"/>
           <w:b w:val="0"/>
           <w:i/>
-          <w:color w:val="333333"/>
+          <w:color w:val="000000"/>
           <w:sz w:val="21"/>
         </w:rPr>
         <w:t>Over the past three weeks, you've missed three of our last five morning standups and were offline during core hours on four days. Our team's core collaboration window is 9 to 1 PM across time zones. You also left the sprint review early on Tuesday without explanation, and I noticed you weren't on the team call yesterday. I want to understand what's going on.</w:t>
@@ -6386,7 +6386,7 @@
           <w:rFonts w:ascii="Georgia" w:hAnsi="Georgia" w:cs="Georgia"/>
           <w:b w:val="0"/>
           <w:i/>
-          <w:color w:val="333333"/>
+          <w:color w:val="000000"/>
           <w:sz w:val="21"/>
         </w:rPr>
         <w:t>Thank you for telling me that. I had no idea, and I'm glad you shared it. Let's figure out how to handle both things — supporting you and making sure the team isn't impacted.</w:t>
@@ -6435,7 +6435,7 @@
           <w:rFonts w:ascii="Georgia" w:hAnsi="Georgia" w:cs="Georgia"/>
           <w:b w:val="0"/>
           <w:i/>
-          <w:color w:val="333333"/>
+          <w:color w:val="000000"/>
           <w:sz w:val="21"/>
         </w:rPr>
         <w:t>I hear you, and I respect that. At the same time, consistent attendance during core hours is part of what the team relies on. When you're not there, it affects standups, it affects collaboration, and honestly, it affects how the team perceives fairness. I need us to get this back on track. What would that look like for you?</w:t>
@@ -6979,7 +6979,7 @@
           <w:rFonts w:ascii="Georgia" w:hAnsi="Georgia" w:cs="Georgia"/>
           <w:b w:val="0"/>
           <w:i/>
-          <w:color w:val="333333"/>
+          <w:color w:val="000000"/>
           <w:sz w:val="21"/>
         </w:rPr>
         <w:t>Morgan, I want to talk honestly with you about your compensation request. You deserve a thoughtful response, not a quick email, so I wanted us to sit down together.</w:t>
@@ -7028,7 +7028,7 @@
           <w:rFonts w:ascii="Georgia" w:hAnsi="Georgia" w:cs="Georgia"/>
           <w:b w:val="0"/>
           <w:i/>
-          <w:color w:val="333333"/>
+          <w:color w:val="000000"/>
           <w:sz w:val="21"/>
         </w:rPr>
         <w:t>I've reviewed your request carefully and advocated for you in our planning discussions. The decision this cycle is that we're not able to move forward with the promotion right now. I know that's not what you wanted to hear, and I don't want to sugarcoat it.</w:t>
@@ -7077,7 +7077,7 @@
           <w:rFonts w:ascii="Georgia" w:hAnsi="Georgia" w:cs="Georgia"/>
           <w:b w:val="0"/>
           <w:i/>
-          <w:color w:val="333333"/>
+          <w:color w:val="000000"/>
           <w:sz w:val="21"/>
         </w:rPr>
         <w:t>There are two factors at play. First, there's an organizational budget constraint this quarter that's affecting everyone, not just you — and I want to be transparent about that. Second, and more importantly for your growth, there are a couple of areas where I'd like to see you stretch before you move into that next level. Specifically, leading cross-functional initiatives end-to-end and mentoring more junior team members. These are the criteria the leadership team looks at for that level.</w:t>
@@ -7126,7 +7126,7 @@
           <w:rFonts w:ascii="Georgia" w:hAnsi="Georgia" w:cs="Georgia"/>
           <w:b w:val="0"/>
           <w:i/>
-          <w:color w:val="333333"/>
+          <w:color w:val="000000"/>
           <w:sz w:val="21"/>
         </w:rPr>
         <w:t>I know this is frustrating, especially when you've been working as hard as you have. Your effort is not in question — I want to be very clear about that.</w:t>
@@ -7175,7 +7175,7 @@
           <w:rFonts w:ascii="Georgia" w:hAnsi="Georgia" w:cs="Georgia"/>
           <w:b w:val="0"/>
           <w:i/>
-          <w:color w:val="333333"/>
+          <w:color w:val="000000"/>
           <w:sz w:val="21"/>
         </w:rPr>
         <w:t>Here's what I want to commit to: let's build a specific development plan together. I want to map out exactly what 'ready for promotion' looks like so there's no ambiguity. And I'm going to commit to revisiting this with you in six months — not as a vague promise, but as a specific date on the calendar. Can we do that?</w:t>
@@ -7796,7 +7796,7 @@
           <w:rFonts w:ascii="Georgia" w:hAnsi="Georgia" w:cs="Georgia"/>
           <w:b w:val="0"/>
           <w:i/>
-          <w:color w:val="333333"/>
+          <w:color w:val="000000"/>
           <w:sz w:val="21"/>
         </w:rPr>
         <w:t>Riley, thank you for coming in. I need to share some difficult news with you. We've made the decision to end your employment, effective today. I know this is a shock, and I want to walk through everything with you.</w:t>
@@ -7861,7 +7861,7 @@
           <w:rFonts w:ascii="Georgia" w:hAnsi="Georgia" w:cs="Georgia"/>
           <w:b w:val="0"/>
           <w:i/>
-          <w:color w:val="333333"/>
+          <w:color w:val="000000"/>
           <w:sz w:val="21"/>
         </w:rPr>
         <w:t>As we discussed during our performance improvement process over the past 90 days, there were specific areas where we needed to see significant progress — particularly in project delivery timelines and stakeholder communication. Despite the support and resources we put in place, we haven't seen the sustained improvement that's needed for this role. This is a business decision, and it's final.</w:t>
@@ -7910,7 +7910,7 @@
           <w:rFonts w:ascii="Georgia" w:hAnsi="Georgia" w:cs="Georgia"/>
           <w:b w:val="0"/>
           <w:i/>
-          <w:color w:val="333333"/>
+          <w:color w:val="000000"/>
           <w:sz w:val="21"/>
         </w:rPr>
         <w:t>I want you to know that I don't take this lightly. This is the hardest part of my job, and I recognize this affects your life in a significant way. You've contributed real things to this team, and that's not erased by this decision.</w:t>
@@ -7959,7 +7959,7 @@
           <w:rFonts w:ascii="Georgia" w:hAnsi="Georgia" w:cs="Georgia"/>
           <w:b w:val="0"/>
           <w:i/>
-          <w:color w:val="333333"/>
+          <w:color w:val="000000"/>
           <w:sz w:val="21"/>
         </w:rPr>
         <w:t>HR is here to walk you through the details — your severance package, benefits continuation, and how the transition will work. I want to make sure all your questions get answered today.</w:t>
@@ -8008,7 +8008,7 @@
           <w:rFonts w:ascii="Georgia" w:hAnsi="Georgia" w:cs="Georgia"/>
           <w:b w:val="0"/>
           <w:i/>
-          <w:color w:val="333333"/>
+          <w:color w:val="000000"/>
           <w:sz w:val="21"/>
         </w:rPr>
         <w:t>I wish you genuinely well, Riley. I mean that.</w:t>
@@ -8666,7 +8666,7 @@
           <w:rFonts w:ascii="Georgia" w:hAnsi="Georgia" w:cs="Georgia"/>
           <w:b w:val="0"/>
           <w:i/>
-          <w:color w:val="333333"/>
+          <w:color w:val="000000"/>
           <w:sz w:val="21"/>
         </w:rPr>
         <w:t>Taylor, I want to have a candid conversation with you about something I've been observing on the team. I've noticed some tension between you and Jamie, and I want to hear your perspective before I jump to any conclusions. What's been going on from your point of view?</w:t>
@@ -8699,7 +8699,7 @@
           <w:rFonts w:ascii="Georgia" w:hAnsi="Georgia" w:cs="Georgia"/>
           <w:b w:val="0"/>
           <w:i/>
-          <w:color w:val="333333"/>
+          <w:color w:val="000000"/>
           <w:sz w:val="21"/>
         </w:rPr>
         <w:t>Thank you for sharing that. I hear your frustration, and I understand why you feel that way. I'm going to talk with Jamie separately as well, because I want to understand both sides. Then I'd like to bring you both together to work through this — not to assign blame, but to find a path forward. Are you open to that?</w:t>
@@ -8748,7 +8748,7 @@
           <w:rFonts w:ascii="Georgia" w:hAnsi="Georgia" w:cs="Georgia"/>
           <w:b w:val="0"/>
           <w:i/>
-          <w:color w:val="333333"/>
+          <w:color w:val="000000"/>
           <w:sz w:val="21"/>
         </w:rPr>
         <w:t>Thank you both for being here. I want to set some ground rules for this conversation. First, this isn't a trial — I'm not here to decide who's right. Second, each of you will have uninterrupted time to share your perspective. Third, the goal is to leave with a workable agreement, not to rehash every frustration. Sound fair?</w:t>
@@ -8765,7 +8765,7 @@
           <w:rFonts w:ascii="Georgia" w:hAnsi="Georgia" w:cs="Georgia"/>
           <w:b w:val="0"/>
           <w:i/>
-          <w:color w:val="333333"/>
+          <w:color w:val="000000"/>
           <w:sz w:val="21"/>
         </w:rPr>
         <w:t>Taylor, would you start? Share what's been challenging for you, focused on specific situations rather than generalizations.</w:t>
@@ -8798,7 +8798,7 @@
           <w:rFonts w:ascii="Georgia" w:hAnsi="Georgia" w:cs="Georgia"/>
           <w:b w:val="0"/>
           <w:i/>
-          <w:color w:val="333333"/>
+          <w:color w:val="000000"/>
           <w:sz w:val="21"/>
         </w:rPr>
         <w:t>Jamie, before you respond, I'd like you to reflect back what you heard Taylor say — not to agree with it, just to show that you heard it.</w:t>
@@ -8863,7 +8863,7 @@
           <w:rFonts w:ascii="Georgia" w:hAnsi="Georgia" w:cs="Georgia"/>
           <w:b w:val="0"/>
           <w:i/>
-          <w:color w:val="333333"/>
+          <w:color w:val="000000"/>
           <w:sz w:val="21"/>
         </w:rPr>
         <w:t>Here's what I'm hearing from both of you: you both care about the quality of this project and you both feel your contributions aren't being fully recognized. Is that fair? So the conflict isn't really about whether the work matters — it's about how you're working together on it. Let's focus there.</w:t>
@@ -8912,7 +8912,7 @@
           <w:rFonts w:ascii="Georgia" w:hAnsi="Georgia" w:cs="Georgia"/>
           <w:b w:val="0"/>
           <w:i/>
-          <w:color w:val="333333"/>
+          <w:color w:val="000000"/>
           <w:sz w:val="21"/>
         </w:rPr>
         <w:t>What's one specific thing each of you could do differently in the next two weeks that would improve how you work together? I'm not asking for a personality overhaul — just one concrete change.</w:t>
@@ -9474,7 +9474,7 @@
           <w:rFonts w:ascii="Georgia" w:hAnsi="Georgia" w:cs="Georgia"/>
           <w:b w:val="0"/>
           <w:i/>
-          <w:color w:val="333333"/>
+          <w:color w:val="000000"/>
           <w:sz w:val="21"/>
         </w:rPr>
         <w:t>Casey, I wanted to check in with you — not about any project or deliverable, just about you. I've noticed you've seemed a bit more drained lately, and I wanted to ask: how are you really doing?</w:t>
@@ -9556,7 +9556,7 @@
           <w:rFonts w:ascii="Georgia" w:hAnsi="Georgia" w:cs="Georgia"/>
           <w:b w:val="0"/>
           <w:i/>
-          <w:color w:val="333333"/>
+          <w:color w:val="000000"/>
           <w:sz w:val="21"/>
         </w:rPr>
         <w:t>Okay. I hear you. I just want you to know that if there ever is something going on — work-related or not — I'm here to listen. No judgment, no consequences for being honest. I ask because I've seen a shift in your energy over the past few weeks, and I care about your wellbeing, not just your output.</w:t>
@@ -9605,7 +9605,7 @@
           <w:rFonts w:ascii="Georgia" w:hAnsi="Georgia" w:cs="Georgia"/>
           <w:b w:val="0"/>
           <w:i/>
-          <w:color w:val="333333"/>
+          <w:color w:val="000000"/>
           <w:sz w:val="21"/>
         </w:rPr>
         <w:t>Thank you for trusting me with that. That takes courage. I don't have all the answers, but I want to help. Let me ask: what's weighing on you most right now? Is it workload? Is it something outside of work? Is it everything at once?</w:t>
@@ -9670,7 +9670,7 @@
           <w:rFonts w:ascii="Georgia" w:hAnsi="Georgia" w:cs="Georgia"/>
           <w:b w:val="0"/>
           <w:i/>
-          <w:color w:val="333333"/>
+          <w:color w:val="000000"/>
           <w:sz w:val="21"/>
         </w:rPr>
         <w:t>Let's look at your plate together. I'd rather we cut or delay something now than run you into the ground. What's one thing we could take off your plate this week?</w:t>
@@ -9703,7 +9703,7 @@
           <w:rFonts w:ascii="Georgia" w:hAnsi="Georgia" w:cs="Georgia"/>
           <w:b w:val="0"/>
           <w:i/>
-          <w:color w:val="333333"/>
+          <w:color w:val="000000"/>
           <w:sz w:val="21"/>
         </w:rPr>
         <w:t>I want to respect your privacy, so I won't pry. But I do want to make sure you know about our Employee Assistance Program — it's confidential, and they can help with just about anything. Would it be useful if I sent you the details?</w:t>
@@ -9736,7 +9736,7 @@
           <w:rFonts w:ascii="Georgia" w:hAnsi="Georgia" w:cs="Georgia"/>
           <w:b w:val="0"/>
           <w:i/>
-          <w:color w:val="333333"/>
+          <w:color w:val="000000"/>
           <w:sz w:val="21"/>
         </w:rPr>
         <w:t>Burnout is real, and it's not a character flaw — it's usually a sign that someone has been giving more than they've been replenishing. What would help you recharge? Can we look at your PTO balance? Would a lighter week help?</w:t>
@@ -10554,7 +10554,7 @@
           <w:rFonts w:ascii="Georgia" w:hAnsi="Georgia" w:cs="Georgia"/>
           <w:b w:val="0"/>
           <w:i/>
-          <w:color w:val="333333"/>
+          <w:color w:val="000000"/>
           <w:sz w:val="21"/>
         </w:rPr>
         <w:t>**Signal** (tell them what kind of message this is): "Hey Alex, I want to share some thoughts on the Henderson project. This isn't urgent and nothing is wrong overall - I just want to flag something so we can get ahead of it."</w:t>
@@ -10571,7 +10571,7 @@
           <w:rFonts w:ascii="Georgia" w:hAnsi="Georgia" w:cs="Georgia"/>
           <w:b w:val="0"/>
           <w:i/>
-          <w:color w:val="333333"/>
+          <w:color w:val="000000"/>
           <w:sz w:val="21"/>
         </w:rPr>
         <w:t>**Context** (ground them in shared reality): "The client feedback from last week's sprint review was mostly positive, and I know you put a lot into the presentation."</w:t>
@@ -10588,7 +10588,7 @@
           <w:rFonts w:ascii="Georgia" w:hAnsi="Georgia" w:cs="Georgia"/>
           <w:b w:val="0"/>
           <w:i/>
-          <w:color w:val="333333"/>
+          <w:color w:val="000000"/>
           <w:sz w:val="21"/>
         </w:rPr>
         <w:t>**Specific** (name the behavior, not the person): "One thing I noticed: the two follow-up emails to the client went out without the updated timeline we discussed. That created some confusion on their end about the delivery date."</w:t>
@@ -10605,7 +10605,7 @@
           <w:rFonts w:ascii="Georgia" w:hAnsi="Georgia" w:cs="Georgia"/>
           <w:b w:val="0"/>
           <w:i/>
-          <w:color w:val="333333"/>
+          <w:color w:val="000000"/>
           <w:sz w:val="21"/>
         </w:rPr>
         <w:t>**Forward** (make it actionable, not punitive): "Going forward, can we add a quick check on follow-up emails before they go out? Happy to set up a lightweight process if that helps. Let me know what you think - no rush on replying, just wanted to get this to you while it's fresh."</w:t>
@@ -11249,7 +11249,7 @@
           <w:rFonts w:ascii="Georgia" w:hAnsi="Georgia" w:cs="Georgia"/>
           <w:b w:val="0"/>
           <w:i/>
-          <w:color w:val="333333"/>
+          <w:color w:val="000000"/>
           <w:sz w:val="21"/>
         </w:rPr>
         <w:t>Thanks for making time for this. I want to talk about something that matters to me because your work matters to me. I want to be straightforward with you, and I also want to hear your perspective - this is a two-way conversation.</w:t>
@@ -11331,7 +11331,7 @@
           <w:rFonts w:ascii="Georgia" w:hAnsi="Georgia" w:cs="Georgia"/>
           <w:b w:val="0"/>
           <w:i/>
-          <w:color w:val="333333"/>
+          <w:color w:val="000000"/>
           <w:sz w:val="21"/>
         </w:rPr>
         <w:t>Over the past three weeks, I have noticed [specific observable behavior]. For example, [concrete instance]. The impact this is having is [specific consequence]. I want to understand what is going on from your side.</w:t>
@@ -11597,7 +11597,7 @@
           <w:rFonts w:ascii="Georgia" w:hAnsi="Georgia" w:cs="Georgia"/>
           <w:b w:val="0"/>
           <w:i/>
-          <w:color w:val="333333"/>
+          <w:color w:val="000000"/>
           <w:sz w:val="21"/>
         </w:rPr>
         <w:t>I can see this is a lot to take in. That is okay. We do not need to solve this right now.</w:t>
@@ -11646,7 +11646,7 @@
           <w:rFonts w:ascii="Georgia" w:hAnsi="Georgia" w:cs="Georgia"/>
           <w:b w:val="0"/>
           <w:i/>
-          <w:color w:val="333333"/>
+          <w:color w:val="000000"/>
           <w:sz w:val="21"/>
         </w:rPr>
         <w:t>Here is what I would like us to do: [one specific next step]. Can you think about it and we can follow up [specific day]? I am on your side here.</w:t>
@@ -11986,7 +11986,7 @@
           <w:rFonts w:ascii="Georgia" w:hAnsi="Georgia" w:cs="Georgia"/>
           <w:b w:val="0"/>
           <w:i/>
-          <w:color w:val="333333"/>
+          <w:color w:val="000000"/>
           <w:sz w:val="21"/>
         </w:rPr>
         <w:t>**Anchor** (lead with what is working): "Your client relationship management this quarter has been consistently strong. The way you handled the Mercer escalation in January showed real maturity and composure under pressure."</w:t>
@@ -12003,7 +12003,7 @@
           <w:rFonts w:ascii="Georgia" w:hAnsi="Georgia" w:cs="Georgia"/>
           <w:b w:val="0"/>
           <w:i/>
-          <w:color w:val="333333"/>
+          <w:color w:val="000000"/>
           <w:sz w:val="21"/>
         </w:rPr>
         <w:t>**Evidence** (specific observation, not judgment): "The area where I see the most opportunity for growth is in project documentation. In three of our last five deliverables, key details were missing from the handoff documents - specifically timeline updates and dependency mapping. This created rework for the QA team and delayed two client deliveries."</w:t>
@@ -12020,7 +12020,7 @@
           <w:rFonts w:ascii="Georgia" w:hAnsi="Georgia" w:cs="Georgia"/>
           <w:b w:val="0"/>
           <w:i/>
-          <w:color w:val="333333"/>
+          <w:color w:val="000000"/>
           <w:sz w:val="21"/>
         </w:rPr>
         <w:t>**Path** (what success looks like): "For Q2, I would like to see complete handoff documentation on every deliverable, using the template we discussed in February. I am confident you can do this - the quality of your client-facing work tells me the skill is there. Let us make sure the internal processes match."</w:t>
@@ -12499,7 +12499,7 @@
           <w:rFonts w:ascii="Georgia" w:hAnsi="Georgia" w:cs="Georgia"/>
           <w:b w:val="0"/>
           <w:i/>
-          <w:color w:val="333333"/>
+          <w:color w:val="000000"/>
           <w:sz w:val="21"/>
         </w:rPr>
         <w:t>I want to talk about something that I have been noticing, and I want to start by being honest: I am part of this too. Over the past few weeks, our meetings have felt different. Less energy, less participation, more silence. I am not here to point fingers - I am genuinely curious about what is going on, because I think we can do better and I think you all deserve better.</w:t>
@@ -12516,7 +12516,7 @@
           <w:rFonts w:ascii="Georgia" w:hAnsi="Georgia" w:cs="Georgia"/>
           <w:b w:val="0"/>
           <w:i/>
-          <w:color w:val="333333"/>
+          <w:color w:val="000000"/>
           <w:sz w:val="21"/>
         </w:rPr>
         <w:t>I have a specific ask: I would like each of you to tell me, anonymously if you prefer, one thing that would make our team meetings more worth your time. You can Slack it to me, email it, or drop it in a form I will send after this meeting. No wrong answers.</w:t>
@@ -12565,7 +12565,7 @@
           <w:rFonts w:ascii="Georgia" w:hAnsi="Georgia" w:cs="Georgia"/>
           <w:b w:val="0"/>
           <w:i/>
-          <w:color w:val="333333"/>
+          <w:color w:val="000000"/>
           <w:sz w:val="21"/>
         </w:rPr>
         <w:t>Thank you for the honest feedback. Here is what I heard: [summarize top 3 themes]. Here is what I am going to change: [specific action]. And here is what I am asking from you: [one specific request]. Let us try this for two weeks and check in again.</w:t>
@@ -15401,7 +15401,7 @@
           <w:rFonts w:ascii="Georgia" w:hAnsi="Georgia" w:cs="Georgia"/>
           <w:b w:val="0"/>
           <w:i/>
-          <w:color w:val="333333"/>
+          <w:color w:val="000000"/>
           <w:sz w:val="21"/>
         </w:rPr>
         <w:t>Hi Alex — I wanted to follow up on our conversation from yesterday. Here's my summary of what we discussed and agreed to: [bullet points]. Let me know if I missed anything or if you'd frame anything differently. Our next check-in is scheduled for [date]. I'm here if you need anything before then.</w:t>

</xml_diff>

<commit_message>
Paperback: chapters start on right (odd/recto) page
</commit_message>
<xml_diff>
--- a/kdp-files/difficult_conversations_paperback.docx
+++ b/kdp-files/difficult_conversations_paperback.docx
@@ -1297,21 +1297,18 @@
     </w:p>
     <w:p>
       <w:pPr>
+        <w:ind w:left="0" w:firstLine="0"/>
         <w:sectPr>
+          <w:type w:val="oddPage"/>
           <w:pgSz w:w="8640" w:h="12960"/>
           <w:pgMar w:top="1080" w:right="720" w:bottom="1080" w:left="1080" w:header="720" w:footer="720" w:gutter="0"/>
-          <w:cols w:space="720"/>
-          <w:docGrid w:linePitch="360"/>
-          <w:mirrorMargins/>
         </w:sectPr>
-        <w:ind w:left="0" w:firstLine="0"/>
       </w:pPr>
     </w:p>
     <w:p>
       <w:pPr>
         <w:pStyle w:val="Heading1"/>
         <w:keepNext/>
-        <w:pageBreakBefore/>
         <w:spacing w:before="0" w:after="240" w:line="276" w:lineRule="auto"/>
         <w:jc w:val="left"/>
         <w:ind w:left="0" w:firstLine="288"/>
@@ -2780,6 +2777,11 @@
         <w:spacing w:before="0" w:after="120" w:line="276" w:lineRule="auto"/>
         <w:jc w:val="both"/>
         <w:ind w:left="0" w:firstLine="288"/>
+        <w:sectPr>
+          <w:type w:val="oddPage"/>
+          <w:pgSz w:w="8640" w:h="12960"/>
+          <w:pgMar w:top="1080" w:right="720" w:bottom="1080" w:left="1080" w:header="720" w:footer="720" w:gutter="0"/>
+        </w:sectPr>
       </w:pPr>
       <w:r>
         <w:rPr>
@@ -2795,7 +2797,6 @@
       <w:pPr>
         <w:pStyle w:val="Heading1"/>
         <w:keepNext/>
-        <w:pageBreakBefore/>
         <w:spacing w:before="0" w:after="240" w:line="276" w:lineRule="auto"/>
         <w:jc w:val="left"/>
         <w:ind w:left="0" w:firstLine="288"/>
@@ -4604,6 +4605,11 @@
         <w:spacing w:before="0" w:after="120" w:line="276" w:lineRule="auto"/>
         <w:jc w:val="both"/>
         <w:ind w:left="0" w:firstLine="288"/>
+        <w:sectPr>
+          <w:type w:val="oddPage"/>
+          <w:pgSz w:w="8640" w:h="12960"/>
+          <w:pgMar w:top="1080" w:right="720" w:bottom="1080" w:left="1080" w:header="720" w:footer="720" w:gutter="0"/>
+        </w:sectPr>
       </w:pPr>
       <w:r>
         <w:rPr>
@@ -4619,7 +4625,6 @@
       <w:pPr>
         <w:pStyle w:val="Heading1"/>
         <w:keepNext/>
-        <w:pageBreakBefore/>
         <w:spacing w:before="0" w:after="240" w:line="276" w:lineRule="auto"/>
         <w:jc w:val="left"/>
         <w:ind w:left="0" w:firstLine="288"/>
@@ -5289,6 +5294,11 @@
         <w:spacing w:before="0" w:after="120" w:line="276" w:lineRule="auto"/>
         <w:jc w:val="both"/>
         <w:ind w:left="288" w:firstLine="0"/>
+        <w:sectPr>
+          <w:type w:val="oddPage"/>
+          <w:pgSz w:w="8640" w:h="12960"/>
+          <w:pgMar w:top="1080" w:right="720" w:bottom="1080" w:left="1080" w:header="720" w:footer="720" w:gutter="0"/>
+        </w:sectPr>
       </w:pPr>
       <w:r>
         <w:rPr>
@@ -5322,7 +5332,6 @@
       <w:pPr>
         <w:pStyle w:val="Heading1"/>
         <w:keepNext/>
-        <w:pageBreakBefore/>
         <w:spacing w:before="0" w:after="240" w:line="276" w:lineRule="auto"/>
         <w:jc w:val="left"/>
         <w:ind w:left="0" w:firstLine="288"/>
@@ -5961,6 +5970,11 @@
         <w:spacing w:before="0" w:after="120" w:line="276" w:lineRule="auto"/>
         <w:jc w:val="both"/>
         <w:ind w:left="288" w:firstLine="0"/>
+        <w:sectPr>
+          <w:type w:val="oddPage"/>
+          <w:pgSz w:w="8640" w:h="12960"/>
+          <w:pgMar w:top="1080" w:right="720" w:bottom="1080" w:left="1080" w:header="720" w:footer="720" w:gutter="0"/>
+        </w:sectPr>
       </w:pPr>
       <w:r>
         <w:rPr>
@@ -6012,7 +6026,6 @@
       <w:pPr>
         <w:pStyle w:val="Heading1"/>
         <w:keepNext/>
-        <w:pageBreakBefore/>
         <w:spacing w:before="0" w:after="240" w:line="276" w:lineRule="auto"/>
         <w:jc w:val="left"/>
         <w:ind w:left="0" w:firstLine="288"/>
@@ -6837,6 +6850,11 @@
         <w:spacing w:before="0" w:after="120" w:line="276" w:lineRule="auto"/>
         <w:jc w:val="both"/>
         <w:ind w:left="288" w:firstLine="0"/>
+        <w:sectPr>
+          <w:type w:val="oddPage"/>
+          <w:pgSz w:w="8640" w:h="12960"/>
+          <w:pgMar w:top="1080" w:right="720" w:bottom="1080" w:left="1080" w:header="720" w:footer="720" w:gutter="0"/>
+        </w:sectPr>
       </w:pPr>
       <w:r>
         <w:rPr>
@@ -6870,7 +6888,6 @@
       <w:pPr>
         <w:pStyle w:val="Heading1"/>
         <w:keepNext/>
-        <w:pageBreakBefore/>
         <w:spacing w:before="0" w:after="240" w:line="276" w:lineRule="auto"/>
         <w:jc w:val="left"/>
         <w:ind w:left="0" w:firstLine="288"/>
@@ -7621,6 +7638,11 @@
         <w:spacing w:before="0" w:after="120" w:line="276" w:lineRule="auto"/>
         <w:jc w:val="both"/>
         <w:ind w:left="288" w:firstLine="0"/>
+        <w:sectPr>
+          <w:type w:val="oddPage"/>
+          <w:pgSz w:w="8640" w:h="12960"/>
+          <w:pgMar w:top="1080" w:right="720" w:bottom="1080" w:left="1080" w:header="720" w:footer="720" w:gutter="0"/>
+        </w:sectPr>
       </w:pPr>
       <w:r>
         <w:rPr>
@@ -7654,7 +7676,6 @@
       <w:pPr>
         <w:pStyle w:val="Heading1"/>
         <w:keepNext/>
-        <w:pageBreakBefore/>
         <w:spacing w:before="0" w:after="240" w:line="276" w:lineRule="auto"/>
         <w:jc w:val="left"/>
         <w:ind w:left="0" w:firstLine="288"/>
@@ -8508,6 +8529,11 @@
         <w:spacing w:before="0" w:after="120" w:line="276" w:lineRule="auto"/>
         <w:jc w:val="both"/>
         <w:ind w:left="288" w:firstLine="0"/>
+        <w:sectPr>
+          <w:type w:val="oddPage"/>
+          <w:pgSz w:w="8640" w:h="12960"/>
+          <w:pgMar w:top="1080" w:right="720" w:bottom="1080" w:left="1080" w:header="720" w:footer="720" w:gutter="0"/>
+        </w:sectPr>
       </w:pPr>
       <w:r>
         <w:rPr>
@@ -8541,7 +8567,6 @@
       <w:pPr>
         <w:pStyle w:val="Heading1"/>
         <w:keepNext/>
-        <w:pageBreakBefore/>
         <w:spacing w:before="0" w:after="240" w:line="276" w:lineRule="auto"/>
         <w:jc w:val="left"/>
         <w:ind w:left="0" w:firstLine="288"/>
@@ -9316,6 +9341,11 @@
         <w:spacing w:before="0" w:after="120" w:line="276" w:lineRule="auto"/>
         <w:jc w:val="both"/>
         <w:ind w:left="288" w:firstLine="0"/>
+        <w:sectPr>
+          <w:type w:val="oddPage"/>
+          <w:pgSz w:w="8640" w:h="12960"/>
+          <w:pgMar w:top="1080" w:right="720" w:bottom="1080" w:left="1080" w:header="720" w:footer="720" w:gutter="0"/>
+        </w:sectPr>
       </w:pPr>
       <w:r>
         <w:rPr>
@@ -9349,7 +9379,6 @@
       <w:pPr>
         <w:pStyle w:val="Heading1"/>
         <w:keepNext/>
-        <w:pageBreakBefore/>
         <w:spacing w:before="0" w:after="240" w:line="276" w:lineRule="auto"/>
         <w:jc w:val="left"/>
         <w:ind w:left="0" w:firstLine="288"/>
@@ -10231,6 +10260,11 @@
         <w:spacing w:before="0" w:after="120" w:line="276" w:lineRule="auto"/>
         <w:jc w:val="both"/>
         <w:ind w:left="288" w:firstLine="0"/>
+        <w:sectPr>
+          <w:type w:val="oddPage"/>
+          <w:pgSz w:w="8640" w:h="12960"/>
+          <w:pgMar w:top="1080" w:right="720" w:bottom="1080" w:left="1080" w:header="720" w:footer="720" w:gutter="0"/>
+        </w:sectPr>
       </w:pPr>
       <w:r>
         <w:rPr>
@@ -10264,7 +10298,6 @@
       <w:pPr>
         <w:pStyle w:val="Heading1"/>
         <w:keepNext/>
-        <w:pageBreakBefore/>
         <w:spacing w:before="0" w:after="240" w:line="276" w:lineRule="auto"/>
         <w:jc w:val="left"/>
         <w:ind w:left="0" w:firstLine="288"/>
@@ -15123,13 +15156,17 @@
     <w:p>
       <w:pPr>
         <w:ind w:left="0" w:firstLine="0"/>
+        <w:sectPr>
+          <w:type w:val="oddPage"/>
+          <w:pgSz w:w="8640" w:h="12960"/>
+          <w:pgMar w:top="1080" w:right="720" w:bottom="1080" w:left="1080" w:header="720" w:footer="720" w:gutter="0"/>
+        </w:sectPr>
       </w:pPr>
     </w:p>
     <w:p>
       <w:pPr>
         <w:pStyle w:val="Heading1"/>
         <w:keepNext/>
-        <w:pageBreakBefore/>
         <w:spacing w:before="0" w:after="240" w:line="276" w:lineRule="auto"/>
         <w:jc w:val="left"/>
         <w:ind w:left="0" w:firstLine="288"/>
@@ -16422,6 +16459,11 @@
         <w:spacing w:before="0" w:after="120" w:line="276" w:lineRule="auto"/>
         <w:jc w:val="both"/>
         <w:ind w:left="0" w:firstLine="288"/>
+        <w:sectPr>
+          <w:type w:val="oddPage"/>
+          <w:pgSz w:w="8640" w:h="12960"/>
+          <w:pgMar w:top="1080" w:right="720" w:bottom="1080" w:left="1080" w:header="720" w:footer="720" w:gutter="0"/>
+        </w:sectPr>
       </w:pPr>
       <w:r>
         <w:rPr>
@@ -16437,7 +16479,6 @@
       <w:pPr>
         <w:pStyle w:val="Heading1"/>
         <w:keepNext/>
-        <w:pageBreakBefore/>
         <w:spacing w:before="0" w:after="240" w:line="276" w:lineRule="auto"/>
         <w:jc w:val="left"/>
         <w:ind w:left="0" w:firstLine="288"/>
@@ -17289,6 +17330,11 @@
         <w:spacing w:before="0" w:after="120" w:line="276" w:lineRule="auto"/>
         <w:jc w:val="both"/>
         <w:ind w:left="0" w:firstLine="288"/>
+        <w:sectPr>
+          <w:type w:val="oddPage"/>
+          <w:pgSz w:w="8640" w:h="12960"/>
+          <w:pgMar w:top="1080" w:right="720" w:bottom="1080" w:left="1080" w:header="720" w:footer="720" w:gutter="0"/>
+        </w:sectPr>
       </w:pPr>
       <w:r>
         <w:rPr>
@@ -17321,7 +17367,6 @@
       <w:pPr>
         <w:pStyle w:val="Heading1"/>
         <w:keepNext/>
-        <w:pageBreakBefore/>
         <w:spacing w:before="0" w:after="240" w:line="276" w:lineRule="auto"/>
         <w:jc w:val="left"/>
         <w:ind w:left="0" w:firstLine="288"/>
@@ -20787,6 +20832,11 @@
         <w:spacing w:before="0" w:after="120" w:line="276" w:lineRule="auto"/>
         <w:jc w:val="both"/>
         <w:ind w:left="0" w:firstLine="288"/>
+        <w:sectPr>
+          <w:type w:val="oddPage"/>
+          <w:pgSz w:w="8640" w:h="12960"/>
+          <w:pgMar w:top="1080" w:right="720" w:bottom="1080" w:left="1080" w:header="720" w:footer="720" w:gutter="0"/>
+        </w:sectPr>
       </w:pPr>
       <w:r>
         <w:rPr>
@@ -20802,7 +20852,6 @@
       <w:pPr>
         <w:pStyle w:val="Heading1"/>
         <w:keepNext/>
-        <w:pageBreakBefore/>
         <w:spacing w:before="0" w:after="240" w:line="276" w:lineRule="auto"/>
         <w:jc w:val="left"/>
         <w:ind w:left="0" w:firstLine="288"/>

</xml_diff>

<commit_message>
Paperback: restore page numbers in all chapter sections
</commit_message>
<xml_diff>
--- a/kdp-files/difficult_conversations_paperback.docx
+++ b/kdp-files/difficult_conversations_paperback.docx
@@ -1299,6 +1299,9 @@
       <w:pPr>
         <w:ind w:left="0" w:firstLine="0"/>
         <w:sectPr>
+          <w:headerReference w:type="default" r:id="rId10"/>
+          <w:headerReference w:type="even" r:id="rId9"/>
+          <w:footerReference w:type="default" r:id="rId11"/>
           <w:type w:val="oddPage"/>
           <w:pgSz w:w="8640" w:h="12960"/>
           <w:pgMar w:top="1080" w:right="720" w:bottom="1080" w:left="1080" w:header="720" w:footer="720" w:gutter="0"/>
@@ -2778,6 +2781,9 @@
         <w:jc w:val="both"/>
         <w:ind w:left="0" w:firstLine="288"/>
         <w:sectPr>
+          <w:headerReference w:type="default" r:id="rId10"/>
+          <w:headerReference w:type="even" r:id="rId9"/>
+          <w:footerReference w:type="default" r:id="rId11"/>
           <w:type w:val="oddPage"/>
           <w:pgSz w:w="8640" w:h="12960"/>
           <w:pgMar w:top="1080" w:right="720" w:bottom="1080" w:left="1080" w:header="720" w:footer="720" w:gutter="0"/>
@@ -4606,6 +4612,9 @@
         <w:jc w:val="both"/>
         <w:ind w:left="0" w:firstLine="288"/>
         <w:sectPr>
+          <w:headerReference w:type="default" r:id="rId10"/>
+          <w:headerReference w:type="even" r:id="rId9"/>
+          <w:footerReference w:type="default" r:id="rId11"/>
           <w:type w:val="oddPage"/>
           <w:pgSz w:w="8640" w:h="12960"/>
           <w:pgMar w:top="1080" w:right="720" w:bottom="1080" w:left="1080" w:header="720" w:footer="720" w:gutter="0"/>
@@ -5295,6 +5304,9 @@
         <w:jc w:val="both"/>
         <w:ind w:left="288" w:firstLine="0"/>
         <w:sectPr>
+          <w:headerReference w:type="default" r:id="rId10"/>
+          <w:headerReference w:type="even" r:id="rId9"/>
+          <w:footerReference w:type="default" r:id="rId11"/>
           <w:type w:val="oddPage"/>
           <w:pgSz w:w="8640" w:h="12960"/>
           <w:pgMar w:top="1080" w:right="720" w:bottom="1080" w:left="1080" w:header="720" w:footer="720" w:gutter="0"/>
@@ -5971,6 +5983,9 @@
         <w:jc w:val="both"/>
         <w:ind w:left="288" w:firstLine="0"/>
         <w:sectPr>
+          <w:headerReference w:type="default" r:id="rId10"/>
+          <w:headerReference w:type="even" r:id="rId9"/>
+          <w:footerReference w:type="default" r:id="rId11"/>
           <w:type w:val="oddPage"/>
           <w:pgSz w:w="8640" w:h="12960"/>
           <w:pgMar w:top="1080" w:right="720" w:bottom="1080" w:left="1080" w:header="720" w:footer="720" w:gutter="0"/>
@@ -6851,6 +6866,9 @@
         <w:jc w:val="both"/>
         <w:ind w:left="288" w:firstLine="0"/>
         <w:sectPr>
+          <w:headerReference w:type="default" r:id="rId10"/>
+          <w:headerReference w:type="even" r:id="rId9"/>
+          <w:footerReference w:type="default" r:id="rId11"/>
           <w:type w:val="oddPage"/>
           <w:pgSz w:w="8640" w:h="12960"/>
           <w:pgMar w:top="1080" w:right="720" w:bottom="1080" w:left="1080" w:header="720" w:footer="720" w:gutter="0"/>
@@ -7639,6 +7657,9 @@
         <w:jc w:val="both"/>
         <w:ind w:left="288" w:firstLine="0"/>
         <w:sectPr>
+          <w:headerReference w:type="default" r:id="rId10"/>
+          <w:headerReference w:type="even" r:id="rId9"/>
+          <w:footerReference w:type="default" r:id="rId11"/>
           <w:type w:val="oddPage"/>
           <w:pgSz w:w="8640" w:h="12960"/>
           <w:pgMar w:top="1080" w:right="720" w:bottom="1080" w:left="1080" w:header="720" w:footer="720" w:gutter="0"/>
@@ -8530,6 +8551,9 @@
         <w:jc w:val="both"/>
         <w:ind w:left="288" w:firstLine="0"/>
         <w:sectPr>
+          <w:headerReference w:type="default" r:id="rId10"/>
+          <w:headerReference w:type="even" r:id="rId9"/>
+          <w:footerReference w:type="default" r:id="rId11"/>
           <w:type w:val="oddPage"/>
           <w:pgSz w:w="8640" w:h="12960"/>
           <w:pgMar w:top="1080" w:right="720" w:bottom="1080" w:left="1080" w:header="720" w:footer="720" w:gutter="0"/>
@@ -9342,6 +9366,9 @@
         <w:jc w:val="both"/>
         <w:ind w:left="288" w:firstLine="0"/>
         <w:sectPr>
+          <w:headerReference w:type="default" r:id="rId10"/>
+          <w:headerReference w:type="even" r:id="rId9"/>
+          <w:footerReference w:type="default" r:id="rId11"/>
           <w:type w:val="oddPage"/>
           <w:pgSz w:w="8640" w:h="12960"/>
           <w:pgMar w:top="1080" w:right="720" w:bottom="1080" w:left="1080" w:header="720" w:footer="720" w:gutter="0"/>
@@ -10261,6 +10288,9 @@
         <w:jc w:val="both"/>
         <w:ind w:left="288" w:firstLine="0"/>
         <w:sectPr>
+          <w:headerReference w:type="default" r:id="rId10"/>
+          <w:headerReference w:type="even" r:id="rId9"/>
+          <w:footerReference w:type="default" r:id="rId11"/>
           <w:type w:val="oddPage"/>
           <w:pgSz w:w="8640" w:h="12960"/>
           <w:pgMar w:top="1080" w:right="720" w:bottom="1080" w:left="1080" w:header="720" w:footer="720" w:gutter="0"/>
@@ -15157,6 +15187,9 @@
       <w:pPr>
         <w:ind w:left="0" w:firstLine="0"/>
         <w:sectPr>
+          <w:headerReference w:type="default" r:id="rId10"/>
+          <w:headerReference w:type="even" r:id="rId9"/>
+          <w:footerReference w:type="default" r:id="rId11"/>
           <w:type w:val="oddPage"/>
           <w:pgSz w:w="8640" w:h="12960"/>
           <w:pgMar w:top="1080" w:right="720" w:bottom="1080" w:left="1080" w:header="720" w:footer="720" w:gutter="0"/>
@@ -16460,6 +16493,9 @@
         <w:jc w:val="both"/>
         <w:ind w:left="0" w:firstLine="288"/>
         <w:sectPr>
+          <w:headerReference w:type="default" r:id="rId10"/>
+          <w:headerReference w:type="even" r:id="rId9"/>
+          <w:footerReference w:type="default" r:id="rId11"/>
           <w:type w:val="oddPage"/>
           <w:pgSz w:w="8640" w:h="12960"/>
           <w:pgMar w:top="1080" w:right="720" w:bottom="1080" w:left="1080" w:header="720" w:footer="720" w:gutter="0"/>
@@ -17331,6 +17367,9 @@
         <w:jc w:val="both"/>
         <w:ind w:left="0" w:firstLine="288"/>
         <w:sectPr>
+          <w:headerReference w:type="default" r:id="rId10"/>
+          <w:headerReference w:type="even" r:id="rId9"/>
+          <w:footerReference w:type="default" r:id="rId11"/>
           <w:type w:val="oddPage"/>
           <w:pgSz w:w="8640" w:h="12960"/>
           <w:pgMar w:top="1080" w:right="720" w:bottom="1080" w:left="1080" w:header="720" w:footer="720" w:gutter="0"/>
@@ -20833,6 +20872,9 @@
         <w:jc w:val="both"/>
         <w:ind w:left="0" w:firstLine="288"/>
         <w:sectPr>
+          <w:headerReference w:type="default" r:id="rId10"/>
+          <w:headerReference w:type="even" r:id="rId9"/>
+          <w:footerReference w:type="default" r:id="rId11"/>
           <w:type w:val="oddPage"/>
           <w:pgSz w:w="8640" w:h="12960"/>
           <w:pgMar w:top="1080" w:right="720" w:bottom="1080" w:left="1080" w:header="720" w:footer="720" w:gutter="0"/>

</xml_diff>

<commit_message>
Paperback: replace ❌ emoji with ✗ (print-safe ballot X)
</commit_message>
<xml_diff>
--- a/kdp-files/difficult_conversations_paperback.docx
+++ b/kdp-files/difficult_conversations_paperback.docx
@@ -4998,7 +4998,7 @@
           <w:i w:val="0"/>
           <w:sz w:val="22"/>
         </w:rPr>
-        <w:t>❌ "You've really been dropping the ball lately." → Character judgment, triggers shame.</w:t>
+        <w:t>✗ "You've really been dropping the ball lately." → Character judgment, triggers shame.</w:t>
       </w:r>
     </w:p>
     <w:p>
@@ -5022,7 +5022,7 @@
           <w:i w:val="0"/>
           <w:sz w:val="22"/>
         </w:rPr>
-        <w:t>❌ "Everyone on the team has noticed." → Social threat, implies gossip.</w:t>
+        <w:t>✗ "Everyone on the team has noticed." → Social threat, implies gossip.</w:t>
       </w:r>
     </w:p>
     <w:p>
@@ -5046,7 +5046,7 @@
           <w:i w:val="0"/>
           <w:sz w:val="22"/>
         </w:rPr>
-        <w:t>❌ "I don't know what's going on with you." → Sounds like you've given up.</w:t>
+        <w:t>✗ "I don't know what's going on with you." → Sounds like you've given up.</w:t>
       </w:r>
     </w:p>
     <w:p>
@@ -5070,7 +5070,7 @@
           <w:i w:val="0"/>
           <w:sz w:val="22"/>
         </w:rPr>
-        <w:t>❌ "This is your last chance." → Unless it literally is a final warning with HR documentation. Empty threats destroy trust.</w:t>
+        <w:t>✗ "This is your last chance." → Unless it literally is a final warning with HR documentation. Empty threats destroy trust.</w:t>
       </w:r>
     </w:p>
     <w:p>
@@ -5094,7 +5094,7 @@
           <w:i w:val="0"/>
           <w:sz w:val="22"/>
         </w:rPr>
-        <w:t>❌ "I'm not sure you're cut out for this role." → Nuclear-level status threat. Almost impossible to recover from.</w:t>
+        <w:t>✗ "I'm not sure you're cut out for this role." → Nuclear-level status threat. Almost impossible to recover from.</w:t>
       </w:r>
     </w:p>
     <w:p>
@@ -5692,7 +5692,7 @@
           <w:i w:val="0"/>
           <w:sz w:val="22"/>
         </w:rPr>
-        <w:t>❌ "That presentation was a disaster." → Global, catastrophic language. Triggers shame spiral.</w:t>
+        <w:t>✗ "That presentation was a disaster." → Global, catastrophic language. Triggers shame spiral.</w:t>
       </w:r>
     </w:p>
     <w:p>
@@ -5716,7 +5716,7 @@
           <w:i w:val="0"/>
           <w:sz w:val="22"/>
         </w:rPr>
-        <w:t>❌ "The client was really upset." → Amplifying third-party disapproval feels like social exile.</w:t>
+        <w:t>✗ "The client was really upset." → Amplifying third-party disapproval feels like social exile.</w:t>
       </w:r>
     </w:p>
     <w:p>
@@ -5740,7 +5740,7 @@
           <w:i w:val="0"/>
           <w:sz w:val="22"/>
         </w:rPr>
-        <w:t>❌ "You should have been more prepared." → Hindsight judgment. They already know.</w:t>
+        <w:t>✗ "You should have been more prepared." → Hindsight judgment. They already know.</w:t>
       </w:r>
     </w:p>
     <w:p>
@@ -5764,7 +5764,7 @@
           <w:i w:val="0"/>
           <w:sz w:val="22"/>
         </w:rPr>
-        <w:t>❌ "I'm disappointed in you." → "In you" makes it about identity, not behavior. Say "in the outcome" if you must.</w:t>
+        <w:t>✗ "I'm disappointed in you." → "In you" makes it about identity, not behavior. Say "in the outcome" if you must.</w:t>
       </w:r>
     </w:p>
     <w:p>
@@ -5788,7 +5788,7 @@
           <w:i w:val="0"/>
           <w:sz w:val="22"/>
         </w:rPr>
-        <w:t>❌ Starting with a compliment sandwich ("Great energy, but...") → People see through it. It makes every future compliment suspect.</w:t>
+        <w:t>✗ Starting with a compliment sandwich ("Great energy, but...") → People see through it. It makes every future compliment suspect.</w:t>
       </w:r>
     </w:p>
     <w:p>
@@ -6507,7 +6507,7 @@
           <w:i w:val="0"/>
           <w:sz w:val="22"/>
         </w:rPr>
-        <w:t>❌ "Are you even committed to this job?" → Questioning someone's commitment is a profound status and identity threat.</w:t>
+        <w:t>✗ "Are you even committed to this job?" → Questioning someone's commitment is a profound status and identity threat.</w:t>
       </w:r>
     </w:p>
     <w:p>
@@ -6531,7 +6531,7 @@
           <w:i w:val="0"/>
           <w:sz w:val="22"/>
         </w:rPr>
-        <w:t>❌ "Other people have complained about you." → Anonymous criticism feels like betrayal. If there are complaints, own the feedback as the manager.</w:t>
+        <w:t>✗ "Other people have complained about you." → Anonymous criticism feels like betrayal. If there are complaints, own the feedback as the manager.</w:t>
       </w:r>
     </w:p>
     <w:p>
@@ -6555,7 +6555,7 @@
           <w:i w:val="0"/>
           <w:sz w:val="22"/>
         </w:rPr>
-        <w:t>❌ "You need to be here at 9, period." → Starting with the demand before understanding the context makes you an adversary, not a partner.</w:t>
+        <w:t>✗ "You need to be here at 9, period." → Starting with the demand before understanding the context makes you an adversary, not a partner.</w:t>
       </w:r>
     </w:p>
     <w:p>
@@ -6579,7 +6579,7 @@
           <w:i w:val="0"/>
           <w:sz w:val="22"/>
         </w:rPr>
-        <w:t>❌ "I've been keeping track." → Makes it sound like surveillance. Say "I've noticed" — it's softer and equally honest.</w:t>
+        <w:t>✗ "I've been keeping track." → Makes it sound like surveillance. Say "I've noticed" — it's softer and equally honest.</w:t>
       </w:r>
     </w:p>
     <w:p>
@@ -6603,7 +6603,7 @@
           <w:i w:val="0"/>
           <w:sz w:val="22"/>
         </w:rPr>
-        <w:t>❌ "This is really unfair to the rest of the team." → Guilt-based manipulation. State the impact neutrally.</w:t>
+        <w:t>✗ "This is really unfair to the rest of the team." → Guilt-based manipulation. State the impact neutrally.</w:t>
       </w:r>
     </w:p>
     <w:p>
@@ -7254,7 +7254,7 @@
           <w:i w:val="0"/>
           <w:sz w:val="22"/>
         </w:rPr>
-        <w:t>❌ "It's not in the budget." (Full stop, with no further context.) → Feels like a wall, not an explanation.</w:t>
+        <w:t>✗ "It's not in the budget." (Full stop, with no further context.) → Feels like a wall, not an explanation.</w:t>
       </w:r>
     </w:p>
     <w:p>
@@ -7278,7 +7278,7 @@
           <w:i w:val="0"/>
           <w:sz w:val="22"/>
         </w:rPr>
-        <w:t>❌ "Maybe next year." → Vague. Creates uncertainty, which the brain processes as threat.</w:t>
+        <w:t>✗ "Maybe next year." → Vague. Creates uncertainty, which the brain processes as threat.</w:t>
       </w:r>
     </w:p>
     <w:p>
@@ -7302,7 +7302,7 @@
           <w:i w:val="0"/>
           <w:sz w:val="22"/>
         </w:rPr>
-        <w:t>❌ "You're doing great, it's just timing." → If they're "doing great," why no promotion? This creates cognitive dissonance.</w:t>
+        <w:t>✗ "You're doing great, it's just timing." → If they're "doing great," why no promotion? This creates cognitive dissonance.</w:t>
       </w:r>
     </w:p>
     <w:p>
@@ -7326,7 +7326,7 @@
           <w:i w:val="0"/>
           <w:sz w:val="22"/>
         </w:rPr>
-        <w:t>❌ "Lots of people don't get promoted this cycle." → Minimizing. They don't care about lots of people right now.</w:t>
+        <w:t>✗ "Lots of people don't get promoted this cycle." → Minimizing. They don't care about lots of people right now.</w:t>
       </w:r>
     </w:p>
     <w:p>
@@ -7350,7 +7350,7 @@
           <w:i w:val="0"/>
           <w:sz w:val="22"/>
         </w:rPr>
-        <w:t>❌ "You should be grateful for what you have." → Patronizing and tone-deaf. Shuts down the conversation immediately.</w:t>
+        <w:t>✗ "You should be grateful for what you have." → Patronizing and tone-deaf. Shuts down the conversation immediately.</w:t>
       </w:r>
     </w:p>
     <w:p>
@@ -7374,7 +7374,7 @@
           <w:i w:val="0"/>
           <w:sz w:val="22"/>
         </w:rPr>
-        <w:t>❌ "I fought for you but leadership said no." → Throwing leadership under the bus undermines the organization and your own authority.</w:t>
+        <w:t>✗ "I fought for you but leadership said no." → Throwing leadership under the bus undermines the organization and your own authority.</w:t>
       </w:r>
     </w:p>
     <w:p>
@@ -8094,7 +8094,7 @@
           <w:i w:val="0"/>
           <w:sz w:val="22"/>
         </w:rPr>
-        <w:t>❌ "This is really hard for me too." → It's exponentially harder for them. Don't center your discomfort.</w:t>
+        <w:t>✗ "This is really hard for me too." → It's exponentially harder for them. Don't center your discomfort.</w:t>
       </w:r>
     </w:p>
     <w:p>
@@ -8118,7 +8118,7 @@
           <w:i w:val="0"/>
           <w:sz w:val="22"/>
         </w:rPr>
-        <w:t>❌ "We're going in a different direction." → Corporate jargon that dehumanizes the moment. Be real.</w:t>
+        <w:t>✗ "We're going in a different direction." → Corporate jargon that dehumanizes the moment. Be real.</w:t>
       </w:r>
     </w:p>
     <w:p>
@@ -8142,7 +8142,7 @@
           <w:i w:val="0"/>
           <w:sz w:val="22"/>
         </w:rPr>
-        <w:t>❌ "I'm sure you'll land on your feet." → Premature optimism. They haven't processed the loss yet.</w:t>
+        <w:t>✗ "I'm sure you'll land on your feet." → Premature optimism. They haven't processed the loss yet.</w:t>
       </w:r>
     </w:p>
     <w:p>
@@ -8166,7 +8166,7 @@
           <w:i w:val="0"/>
           <w:sz w:val="22"/>
         </w:rPr>
-        <w:t>❌ "If it were up to me..." → You're the manager. As far as they're concerned, it was up to you. Don't deflect.</w:t>
+        <w:t>✗ "If it were up to me..." → You're the manager. As far as they're concerned, it was up to you. Don't deflect.</w:t>
       </w:r>
     </w:p>
     <w:p>
@@ -8190,7 +8190,7 @@
           <w:i w:val="0"/>
           <w:sz w:val="22"/>
         </w:rPr>
-        <w:t>❌ "We can still be friends." → Inappropriate. The power dynamic makes this uncomfortable.</w:t>
+        <w:t>✗ "We can still be friends." → Inappropriate. The power dynamic makes this uncomfortable.</w:t>
       </w:r>
     </w:p>
     <w:p>
@@ -8214,7 +8214,7 @@
           <w:i w:val="0"/>
           <w:sz w:val="22"/>
         </w:rPr>
-        <w:t>❌ Any criticism of their work in this moment. → The feedback phase is over. This is not a teaching moment. This is a human moment.</w:t>
+        <w:t>✗ Any criticism of their work in this moment. → The feedback phase is over. This is not a teaching moment. This is a human moment.</w:t>
       </w:r>
     </w:p>
     <w:p>
@@ -9005,7 +9005,7 @@
           <w:i w:val="0"/>
           <w:sz w:val="22"/>
         </w:rPr>
-        <w:t>❌ "You two need to figure this out." → Abdicating your role. They've already tried and failed.</w:t>
+        <w:t>✗ "You two need to figure this out." → Abdicating your role. They've already tried and failed.</w:t>
       </w:r>
     </w:p>
     <w:p>
@@ -9029,7 +9029,7 @@
           <w:i w:val="0"/>
           <w:sz w:val="22"/>
         </w:rPr>
-        <w:t>❌ "I'm sure it's a misunderstanding." → Minimizing. The conflict is real to them.</w:t>
+        <w:t>✗ "I'm sure it's a misunderstanding." → Minimizing. The conflict is real to them.</w:t>
       </w:r>
     </w:p>
     <w:p>
@@ -9053,7 +9053,7 @@
           <w:i w:val="0"/>
           <w:sz w:val="22"/>
         </w:rPr>
-        <w:t>❌ "Taylor says you did X — is that true?" → Playing prosecutor. This isn't a deposition.</w:t>
+        <w:t>✗ "Taylor says you did X — is that true?" → Playing prosecutor. This isn't a deposition.</w:t>
       </w:r>
     </w:p>
     <w:p>
@@ -9077,7 +9077,7 @@
           <w:i w:val="0"/>
           <w:sz w:val="22"/>
         </w:rPr>
-        <w:t>❌ "Who started this?" → Irrelevant and childish framing. It doesn't matter who started it.</w:t>
+        <w:t>✗ "Who started this?" → Irrelevant and childish framing. It doesn't matter who started it.</w:t>
       </w:r>
     </w:p>
     <w:p>
@@ -9101,7 +9101,7 @@
           <w:i w:val="0"/>
           <w:sz w:val="22"/>
         </w:rPr>
-        <w:t>❌ "You're both professionals, act like it." → Shaming. This guarantees the conflict goes underground instead of resolving.</w:t>
+        <w:t>✗ "You're both professionals, act like it." → Shaming. This guarantees the conflict goes underground instead of resolving.</w:t>
       </w:r>
     </w:p>
     <w:p>
@@ -9836,7 +9836,7 @@
           <w:i w:val="0"/>
           <w:sz w:val="22"/>
         </w:rPr>
-        <w:t>❌ "You seem off." → Vague and slightly clinical. Makes them feel observed like a specimen.</w:t>
+        <w:t>✗ "You seem off." → Vague and slightly clinical. Makes them feel observed like a specimen.</w:t>
       </w:r>
     </w:p>
     <w:p>
@@ -9860,7 +9860,7 @@
           <w:i w:val="0"/>
           <w:sz w:val="22"/>
         </w:rPr>
-        <w:t>❌ "Is everything okay at home?" → Too invasive. Let them volunteer personal details.</w:t>
+        <w:t>✗ "Is everything okay at home?" → Too invasive. Let them volunteer personal details.</w:t>
       </w:r>
     </w:p>
     <w:p>
@@ -9884,7 +9884,7 @@
           <w:i w:val="0"/>
           <w:sz w:val="22"/>
         </w:rPr>
-        <w:t>❌ "You need to take better care of yourself." → Patronizing. They know. That's like telling someone with insomnia to just sleep.</w:t>
+        <w:t>✗ "You need to take better care of yourself." → Patronizing. They know. That's like telling someone with insomnia to just sleep.</w:t>
       </w:r>
     </w:p>
     <w:p>
@@ -9908,7 +9908,7 @@
           <w:i w:val="0"/>
           <w:sz w:val="22"/>
         </w:rPr>
-        <w:t>❌ "We all go through tough times." → Minimizing. This dismisses their specific experience.</w:t>
+        <w:t>✗ "We all go through tough times." → Minimizing. This dismisses their specific experience.</w:t>
       </w:r>
     </w:p>
     <w:p>
@@ -9932,7 +9932,7 @@
           <w:i w:val="0"/>
           <w:sz w:val="22"/>
         </w:rPr>
-        <w:t>❌ "I need you at 100%." → Makes it about your needs, not theirs. This is the opposite of what this conversation should be.</w:t>
+        <w:t>✗ "I need you at 100%." → Makes it about your needs, not theirs. This is the opposite of what this conversation should be.</w:t>
       </w:r>
     </w:p>
     <w:p>
@@ -9956,7 +9956,7 @@
           <w:i w:val="0"/>
           <w:sz w:val="22"/>
         </w:rPr>
-        <w:t>❌ "You're not going to have a breakdown on me, are you?" → Just... no.</w:t>
+        <w:t>✗ "You're not going to have a breakdown on me, are you?" → Just... no.</w:t>
       </w:r>
     </w:p>
     <w:p>

</xml_diff>

<commit_message>
Paperback: no headers on front matter + no headers on chapter first pages
</commit_message>
<xml_diff>
--- a/kdp-files/difficult_conversations_paperback.docx
+++ b/kdp-files/difficult_conversations_paperback.docx
@@ -1299,9 +1299,6 @@
       <w:pPr>
         <w:ind w:left="0" w:firstLine="0"/>
         <w:sectPr>
-          <w:headerReference w:type="default" r:id="rId10"/>
-          <w:headerReference w:type="even" r:id="rId9"/>
-          <w:footerReference w:type="default" r:id="rId11"/>
           <w:type w:val="oddPage"/>
           <w:pgSz w:w="8640" w:h="12960"/>
           <w:pgMar w:top="1080" w:right="720" w:bottom="1080" w:left="1080" w:header="720" w:footer="720" w:gutter="0"/>
@@ -2787,6 +2784,7 @@
           <w:type w:val="oddPage"/>
           <w:pgSz w:w="8640" w:h="12960"/>
           <w:pgMar w:top="1080" w:right="720" w:bottom="1080" w:left="1080" w:header="720" w:footer="720" w:gutter="0"/>
+          <w:titlePg/>
         </w:sectPr>
       </w:pPr>
       <w:r>
@@ -4618,6 +4616,7 @@
           <w:type w:val="oddPage"/>
           <w:pgSz w:w="8640" w:h="12960"/>
           <w:pgMar w:top="1080" w:right="720" w:bottom="1080" w:left="1080" w:header="720" w:footer="720" w:gutter="0"/>
+          <w:titlePg/>
         </w:sectPr>
       </w:pPr>
       <w:r>
@@ -5310,6 +5309,7 @@
           <w:type w:val="oddPage"/>
           <w:pgSz w:w="8640" w:h="12960"/>
           <w:pgMar w:top="1080" w:right="720" w:bottom="1080" w:left="1080" w:header="720" w:footer="720" w:gutter="0"/>
+          <w:titlePg/>
         </w:sectPr>
       </w:pPr>
       <w:r>
@@ -5989,6 +5989,7 @@
           <w:type w:val="oddPage"/>
           <w:pgSz w:w="8640" w:h="12960"/>
           <w:pgMar w:top="1080" w:right="720" w:bottom="1080" w:left="1080" w:header="720" w:footer="720" w:gutter="0"/>
+          <w:titlePg/>
         </w:sectPr>
       </w:pPr>
       <w:r>
@@ -6872,6 +6873,7 @@
           <w:type w:val="oddPage"/>
           <w:pgSz w:w="8640" w:h="12960"/>
           <w:pgMar w:top="1080" w:right="720" w:bottom="1080" w:left="1080" w:header="720" w:footer="720" w:gutter="0"/>
+          <w:titlePg/>
         </w:sectPr>
       </w:pPr>
       <w:r>
@@ -7663,6 +7665,7 @@
           <w:type w:val="oddPage"/>
           <w:pgSz w:w="8640" w:h="12960"/>
           <w:pgMar w:top="1080" w:right="720" w:bottom="1080" w:left="1080" w:header="720" w:footer="720" w:gutter="0"/>
+          <w:titlePg/>
         </w:sectPr>
       </w:pPr>
       <w:r>
@@ -8557,6 +8560,7 @@
           <w:type w:val="oddPage"/>
           <w:pgSz w:w="8640" w:h="12960"/>
           <w:pgMar w:top="1080" w:right="720" w:bottom="1080" w:left="1080" w:header="720" w:footer="720" w:gutter="0"/>
+          <w:titlePg/>
         </w:sectPr>
       </w:pPr>
       <w:r>
@@ -9372,6 +9376,7 @@
           <w:type w:val="oddPage"/>
           <w:pgSz w:w="8640" w:h="12960"/>
           <w:pgMar w:top="1080" w:right="720" w:bottom="1080" w:left="1080" w:header="720" w:footer="720" w:gutter="0"/>
+          <w:titlePg/>
         </w:sectPr>
       </w:pPr>
       <w:r>
@@ -10294,6 +10299,7 @@
           <w:type w:val="oddPage"/>
           <w:pgSz w:w="8640" w:h="12960"/>
           <w:pgMar w:top="1080" w:right="720" w:bottom="1080" w:left="1080" w:header="720" w:footer="720" w:gutter="0"/>
+          <w:titlePg/>
         </w:sectPr>
       </w:pPr>
       <w:r>
@@ -15193,6 +15199,7 @@
           <w:type w:val="oddPage"/>
           <w:pgSz w:w="8640" w:h="12960"/>
           <w:pgMar w:top="1080" w:right="720" w:bottom="1080" w:left="1080" w:header="720" w:footer="720" w:gutter="0"/>
+          <w:titlePg/>
         </w:sectPr>
       </w:pPr>
     </w:p>
@@ -16499,6 +16506,7 @@
           <w:type w:val="oddPage"/>
           <w:pgSz w:w="8640" w:h="12960"/>
           <w:pgMar w:top="1080" w:right="720" w:bottom="1080" w:left="1080" w:header="720" w:footer="720" w:gutter="0"/>
+          <w:titlePg/>
         </w:sectPr>
       </w:pPr>
       <w:r>
@@ -17373,6 +17381,7 @@
           <w:type w:val="oddPage"/>
           <w:pgSz w:w="8640" w:h="12960"/>
           <w:pgMar w:top="1080" w:right="720" w:bottom="1080" w:left="1080" w:header="720" w:footer="720" w:gutter="0"/>
+          <w:titlePg/>
         </w:sectPr>
       </w:pPr>
       <w:r>
@@ -20878,6 +20887,7 @@
           <w:type w:val="oddPage"/>
           <w:pgSz w:w="8640" w:h="12960"/>
           <w:pgMar w:top="1080" w:right="720" w:bottom="1080" w:left="1080" w:header="720" w:footer="720" w:gutter="0"/>
+          <w:titlePg/>
         </w:sectPr>
       </w:pPr>
       <w:r>

</xml_diff>

<commit_message>
Paperback: remove half title page, start with full title
</commit_message>
<xml_diff>
--- a/kdp-files/difficult_conversations_paperback.docx
+++ b/kdp-files/difficult_conversations_paperback.docx
@@ -2,212 +2,6 @@
 <file path=word/document.xml><?xml version="1.0" encoding="utf-8"?>
 <w:document xmlns:wpc="http://schemas.microsoft.com/office/word/2010/wordprocessingCanvas" xmlns:mo="http://schemas.microsoft.com/office/mac/office/2008/main" xmlns:mc="http://schemas.openxmlformats.org/markup-compatibility/2006" xmlns:mv="urn:schemas-microsoft-com:mac:vml" xmlns:o="urn:schemas-microsoft-com:office:office" xmlns:r="http://schemas.openxmlformats.org/officeDocument/2006/relationships" xmlns:m="http://schemas.openxmlformats.org/officeDocument/2006/math" xmlns:v="urn:schemas-microsoft-com:vml" xmlns:wp14="http://schemas.microsoft.com/office/word/2010/wordprocessingDrawing" xmlns:wp="http://schemas.openxmlformats.org/drawingml/2006/wordprocessingDrawing" xmlns:w10="urn:schemas-microsoft-com:office:word" xmlns:w="http://schemas.openxmlformats.org/wordprocessingml/2006/main" xmlns:w14="http://schemas.microsoft.com/office/word/2010/wordml" xmlns:wpg="http://schemas.microsoft.com/office/word/2010/wordprocessingGroup" xmlns:wpi="http://schemas.microsoft.com/office/word/2010/wordprocessingInk" xmlns:wne="http://schemas.microsoft.com/office/word/2006/wordml" xmlns:wps="http://schemas.microsoft.com/office/word/2010/wordprocessingShape" mc:Ignorable="w14 wp14">
   <w:body>
-    <w:p>
-      <w:pPr>
-        <w:rPr>
-          <w:sz w:val="12"/>
-          <w:szCs w:val="12"/>
-        </w:rPr>
-        <w:ind w:left="0" w:firstLine="0"/>
-        <w:spacing w:after="0" w:before="0" w:line="240" w:lineRule="auto"/>
-      </w:pPr>
-    </w:p>
-    <w:p>
-      <w:pPr>
-        <w:rPr>
-          <w:sz w:val="12"/>
-          <w:szCs w:val="12"/>
-        </w:rPr>
-        <w:ind w:left="0" w:firstLine="0"/>
-        <w:spacing w:after="0" w:before="0" w:line="240" w:lineRule="auto"/>
-      </w:pPr>
-    </w:p>
-    <w:p>
-      <w:pPr>
-        <w:rPr>
-          <w:sz w:val="12"/>
-          <w:szCs w:val="12"/>
-        </w:rPr>
-        <w:ind w:left="0" w:firstLine="0"/>
-        <w:spacing w:after="0" w:before="0" w:line="240" w:lineRule="auto"/>
-      </w:pPr>
-    </w:p>
-    <w:p>
-      <w:pPr>
-        <w:rPr>
-          <w:sz w:val="12"/>
-          <w:szCs w:val="12"/>
-        </w:rPr>
-        <w:ind w:left="0" w:firstLine="0"/>
-        <w:spacing w:after="0" w:before="0" w:line="240" w:lineRule="auto"/>
-      </w:pPr>
-    </w:p>
-    <w:p>
-      <w:pPr>
-        <w:rPr>
-          <w:sz w:val="12"/>
-          <w:szCs w:val="12"/>
-        </w:rPr>
-        <w:ind w:left="0" w:firstLine="0"/>
-        <w:spacing w:after="0" w:before="0" w:line="240" w:lineRule="auto"/>
-      </w:pPr>
-    </w:p>
-    <w:p>
-      <w:pPr>
-        <w:rPr>
-          <w:sz w:val="12"/>
-          <w:szCs w:val="12"/>
-        </w:rPr>
-        <w:ind w:left="0" w:firstLine="0"/>
-        <w:spacing w:after="0" w:before="0" w:line="240" w:lineRule="auto"/>
-      </w:pPr>
-    </w:p>
-    <w:p>
-      <w:pPr>
-        <w:rPr>
-          <w:sz w:val="12"/>
-          <w:szCs w:val="12"/>
-        </w:rPr>
-        <w:ind w:left="0" w:firstLine="0"/>
-        <w:spacing w:after="0" w:before="0" w:line="240" w:lineRule="auto"/>
-      </w:pPr>
-    </w:p>
-    <w:p>
-      <w:pPr>
-        <w:rPr>
-          <w:sz w:val="12"/>
-          <w:szCs w:val="12"/>
-        </w:rPr>
-        <w:ind w:left="0" w:firstLine="0"/>
-        <w:spacing w:after="0" w:before="0" w:line="240" w:lineRule="auto"/>
-      </w:pPr>
-    </w:p>
-    <w:p>
-      <w:pPr>
-        <w:rPr>
-          <w:sz w:val="12"/>
-          <w:szCs w:val="12"/>
-        </w:rPr>
-        <w:ind w:left="0" w:firstLine="0"/>
-        <w:spacing w:after="0" w:before="0" w:line="240" w:lineRule="auto"/>
-      </w:pPr>
-    </w:p>
-    <w:p>
-      <w:pPr>
-        <w:rPr>
-          <w:sz w:val="12"/>
-          <w:szCs w:val="12"/>
-        </w:rPr>
-        <w:ind w:left="0" w:firstLine="0"/>
-        <w:spacing w:after="0" w:before="0" w:line="240" w:lineRule="auto"/>
-      </w:pPr>
-    </w:p>
-    <w:p>
-      <w:pPr>
-        <w:rPr>
-          <w:sz w:val="12"/>
-          <w:szCs w:val="12"/>
-        </w:rPr>
-        <w:ind w:left="0" w:firstLine="0"/>
-        <w:spacing w:after="0" w:before="0" w:line="240" w:lineRule="auto"/>
-      </w:pPr>
-    </w:p>
-    <w:p>
-      <w:pPr>
-        <w:rPr>
-          <w:sz w:val="12"/>
-          <w:szCs w:val="12"/>
-        </w:rPr>
-        <w:ind w:left="0" w:firstLine="0"/>
-        <w:spacing w:after="0" w:before="0" w:line="240" w:lineRule="auto"/>
-      </w:pPr>
-    </w:p>
-    <w:p>
-      <w:pPr>
-        <w:rPr>
-          <w:sz w:val="12"/>
-          <w:szCs w:val="12"/>
-        </w:rPr>
-        <w:ind w:left="0" w:firstLine="0"/>
-        <w:spacing w:after="0" w:before="0" w:line="240" w:lineRule="auto"/>
-      </w:pPr>
-    </w:p>
-    <w:p>
-      <w:pPr>
-        <w:rPr>
-          <w:sz w:val="12"/>
-          <w:szCs w:val="12"/>
-        </w:rPr>
-        <w:ind w:left="0" w:firstLine="0"/>
-        <w:spacing w:after="0" w:before="0" w:line="240" w:lineRule="auto"/>
-      </w:pPr>
-    </w:p>
-    <w:p>
-      <w:pPr>
-        <w:rPr>
-          <w:sz w:val="12"/>
-          <w:szCs w:val="12"/>
-        </w:rPr>
-        <w:ind w:left="0" w:firstLine="0"/>
-        <w:spacing w:after="0" w:before="0" w:line="240" w:lineRule="auto"/>
-      </w:pPr>
-    </w:p>
-    <w:p>
-      <w:pPr>
-        <w:rPr>
-          <w:sz w:val="12"/>
-          <w:szCs w:val="12"/>
-        </w:rPr>
-        <w:ind w:left="0" w:firstLine="0"/>
-        <w:spacing w:after="0" w:before="0" w:line="240" w:lineRule="auto"/>
-      </w:pPr>
-    </w:p>
-    <w:p>
-      <w:pPr>
-        <w:rPr>
-          <w:sz w:val="12"/>
-          <w:szCs w:val="12"/>
-        </w:rPr>
-        <w:ind w:left="0" w:firstLine="0"/>
-        <w:spacing w:after="0" w:before="0" w:line="240" w:lineRule="auto"/>
-      </w:pPr>
-    </w:p>
-    <w:p>
-      <w:pPr>
-        <w:rPr>
-          <w:sz w:val="12"/>
-          <w:szCs w:val="12"/>
-        </w:rPr>
-        <w:ind w:left="0" w:firstLine="0"/>
-        <w:spacing w:after="0" w:before="0" w:line="240" w:lineRule="auto"/>
-      </w:pPr>
-    </w:p>
-    <w:p>
-      <w:pPr>
-        <w:jc w:val="center"/>
-        <w:ind w:left="0" w:firstLine="0"/>
-        <w:spacing w:after="0" w:before="0" w:line="240" w:lineRule="auto"/>
-      </w:pPr>
-      <w:r>
-        <w:rPr>
-          <w:rFonts w:ascii="Georgia" w:hAnsi="Georgia" w:cs="Georgia"/>
-          <w:sz w:val="32"/>
-          <w:szCs w:val="32"/>
-          <w:b/>
-          <w:bCs/>
-        </w:rPr>
-        <w:t xml:space="preserve">The Manager’s Guide to Difficult Conversations</w:t>
-      </w:r>
-    </w:p>
-    <w:p>
-      <w:pPr>
-        <w:ind w:left="0" w:firstLine="0"/>
-        <w:spacing w:after="0" w:before="0" w:line="240" w:lineRule="auto"/>
-      </w:pPr>
-      <w:r>
-        <w:br w:type="page"/>
-      </w:r>
-    </w:p>
     <w:p>
       <w:pPr>
         <w:rPr>

</xml_diff>

<commit_message>
Paperback: page numbers from front matter (except title page), continuous numbering
</commit_message>
<xml_diff>
--- a/kdp-files/difficult_conversations_paperback.docx
+++ b/kdp-files/difficult_conversations_paperback.docx
@@ -1093,9 +1093,12 @@
       <w:pPr>
         <w:ind w:left="0" w:firstLine="0"/>
         <w:sectPr>
+          <w:footerReference w:type="first" r:id="rId12"/>
+          <w:footerReference w:type="default" r:id="rId11"/>
           <w:type w:val="oddPage"/>
           <w:pgSz w:w="8640" w:h="12960"/>
           <w:pgMar w:top="1080" w:right="720" w:bottom="1080" w:left="1080" w:header="720" w:footer="720" w:gutter="0"/>
+          <w:titlePg/>
         </w:sectPr>
       </w:pPr>
     </w:p>
@@ -2580,7 +2583,6 @@
           <w:pgSz w:w="8640" w:h="12960"/>
           <w:pgMar w:top="1080" w:right="720" w:bottom="1080" w:left="1080" w:header="720" w:footer="720" w:gutter="0"/>
           <w:titlePg/>
-          <w:pgNumType w:start="1"/>
         </w:sectPr>
       </w:pPr>
       <w:r>

</xml_diff>

<commit_message>
Paperback: add even page footer (page numbers on ALL pages)
</commit_message>
<xml_diff>
--- a/kdp-files/difficult_conversations_paperback.docx
+++ b/kdp-files/difficult_conversations_paperback.docx
@@ -1093,6 +1093,7 @@
       <w:pPr>
         <w:ind w:left="0" w:firstLine="0"/>
         <w:sectPr>
+          <w:footerReference w:type="even" r:id="rId13"/>
           <w:footerReference w:type="first" r:id="rId12"/>
           <w:footerReference w:type="default" r:id="rId11"/>
           <w:type w:val="oddPage"/>
@@ -2575,6 +2576,7 @@
         <w:jc w:val="both"/>
         <w:ind w:left="0" w:firstLine="288"/>
         <w:sectPr>
+          <w:footerReference w:type="even" r:id="rId13"/>
           <w:footerReference w:type="first" r:id="rId12"/>
           <w:headerReference w:type="default" r:id="rId10"/>
           <w:headerReference w:type="even" r:id="rId9"/>
@@ -4408,6 +4410,7 @@
         <w:jc w:val="both"/>
         <w:ind w:left="0" w:firstLine="288"/>
         <w:sectPr>
+          <w:footerReference w:type="even" r:id="rId13"/>
           <w:footerReference w:type="first" r:id="rId12"/>
           <w:headerReference w:type="default" r:id="rId10"/>
           <w:headerReference w:type="even" r:id="rId9"/>
@@ -5102,6 +5105,7 @@
         <w:jc w:val="both"/>
         <w:ind w:left="288" w:firstLine="0"/>
         <w:sectPr>
+          <w:footerReference w:type="even" r:id="rId13"/>
           <w:footerReference w:type="first" r:id="rId12"/>
           <w:headerReference w:type="default" r:id="rId10"/>
           <w:headerReference w:type="even" r:id="rId9"/>
@@ -5783,6 +5787,7 @@
         <w:jc w:val="both"/>
         <w:ind w:left="288" w:firstLine="0"/>
         <w:sectPr>
+          <w:footerReference w:type="even" r:id="rId13"/>
           <w:footerReference w:type="first" r:id="rId12"/>
           <w:headerReference w:type="default" r:id="rId10"/>
           <w:headerReference w:type="even" r:id="rId9"/>
@@ -6668,6 +6673,7 @@
         <w:jc w:val="both"/>
         <w:ind w:left="288" w:firstLine="0"/>
         <w:sectPr>
+          <w:footerReference w:type="even" r:id="rId13"/>
           <w:footerReference w:type="first" r:id="rId12"/>
           <w:headerReference w:type="default" r:id="rId10"/>
           <w:headerReference w:type="even" r:id="rId9"/>
@@ -7461,6 +7467,7 @@
         <w:jc w:val="both"/>
         <w:ind w:left="288" w:firstLine="0"/>
         <w:sectPr>
+          <w:footerReference w:type="even" r:id="rId13"/>
           <w:footerReference w:type="first" r:id="rId12"/>
           <w:headerReference w:type="default" r:id="rId10"/>
           <w:headerReference w:type="even" r:id="rId9"/>
@@ -8357,6 +8364,7 @@
         <w:jc w:val="both"/>
         <w:ind w:left="288" w:firstLine="0"/>
         <w:sectPr>
+          <w:footerReference w:type="even" r:id="rId13"/>
           <w:footerReference w:type="first" r:id="rId12"/>
           <w:headerReference w:type="default" r:id="rId10"/>
           <w:headerReference w:type="even" r:id="rId9"/>
@@ -9174,6 +9182,7 @@
         <w:jc w:val="both"/>
         <w:ind w:left="288" w:firstLine="0"/>
         <w:sectPr>
+          <w:footerReference w:type="even" r:id="rId13"/>
           <w:footerReference w:type="first" r:id="rId12"/>
           <w:headerReference w:type="default" r:id="rId10"/>
           <w:headerReference w:type="even" r:id="rId9"/>
@@ -10098,6 +10107,7 @@
         <w:jc w:val="both"/>
         <w:ind w:left="288" w:firstLine="0"/>
         <w:sectPr>
+          <w:footerReference w:type="even" r:id="rId13"/>
           <w:footerReference w:type="first" r:id="rId12"/>
           <w:headerReference w:type="default" r:id="rId10"/>
           <w:headerReference w:type="even" r:id="rId9"/>
@@ -14999,6 +15009,7 @@
       <w:pPr>
         <w:ind w:left="0" w:firstLine="0"/>
         <w:sectPr>
+          <w:footerReference w:type="even" r:id="rId13"/>
           <w:footerReference w:type="first" r:id="rId12"/>
           <w:headerReference w:type="default" r:id="rId10"/>
           <w:headerReference w:type="even" r:id="rId9"/>
@@ -16307,6 +16318,7 @@
         <w:jc w:val="both"/>
         <w:ind w:left="0" w:firstLine="288"/>
         <w:sectPr>
+          <w:footerReference w:type="even" r:id="rId13"/>
           <w:footerReference w:type="first" r:id="rId12"/>
           <w:headerReference w:type="default" r:id="rId10"/>
           <w:headerReference w:type="even" r:id="rId9"/>
@@ -17183,6 +17195,7 @@
         <w:jc w:val="both"/>
         <w:ind w:left="0" w:firstLine="288"/>
         <w:sectPr>
+          <w:footerReference w:type="even" r:id="rId13"/>
           <w:footerReference w:type="first" r:id="rId12"/>
           <w:headerReference w:type="default" r:id="rId10"/>
           <w:headerReference w:type="even" r:id="rId9"/>
@@ -20690,6 +20703,7 @@
         <w:jc w:val="both"/>
         <w:ind w:left="0" w:firstLine="288"/>
         <w:sectPr>
+          <w:footerReference w:type="even" r:id="rId13"/>
           <w:footerReference w:type="first" r:id="rId12"/>
           <w:headerReference w:type="default" r:id="rId10"/>
           <w:headerReference w:type="even" r:id="rId9"/>
@@ -20906,6 +20920,7 @@
       </w:r>
     </w:p>
     <w:sectPr>
+      <w:footerReference w:type="even" r:id="rId13"/>
       <w:footerReference w:type="first" r:id="rId12"/>
       <w:headerReference w:type="even" r:id="rId9"/>
       <w:headerReference w:type="default" r:id="rId10"/>
@@ -20961,6 +20976,38 @@
 </file>
 
 <file path=word/footer2.xml><?xml version="1.0" encoding="utf-8"?>
+<w:ftr xmlns:w="http://schemas.openxmlformats.org/wordprocessingml/2006/main" xmlns:r="http://schemas.openxmlformats.org/officeDocument/2006/relationships" xmlns:mc="http://schemas.openxmlformats.org/markup-compatibility/2006">
+  <w:p>
+    <w:pPr>
+      <w:pStyle w:val="Footer"/>
+      <w:jc w:val="center"/>
+    </w:pPr>
+    <w:r>
+      <w:rPr>
+        <w:rFonts w:ascii="Georgia" w:hAnsi="Georgia"/>
+        <w:sz w:val="20"/>
+      </w:rPr>
+      <w:fldChar w:fldCharType="begin"/>
+    </w:r>
+    <w:r>
+      <w:rPr>
+        <w:rFonts w:ascii="Georgia" w:hAnsi="Georgia"/>
+        <w:sz w:val="20"/>
+      </w:rPr>
+      <w:instrText xml:space="preserve"> PAGE </w:instrText>
+    </w:r>
+    <w:r>
+      <w:rPr>
+        <w:rFonts w:ascii="Georgia" w:hAnsi="Georgia"/>
+        <w:sz w:val="20"/>
+      </w:rPr>
+      <w:fldChar w:fldCharType="end"/>
+    </w:r>
+  </w:p>
+</w:ftr>
+</file>
+
+<file path=word/footer3.xml><?xml version="1.0" encoding="utf-8"?>
 <w:ftr xmlns:w="http://schemas.openxmlformats.org/wordprocessingml/2006/main" xmlns:r="http://schemas.openxmlformats.org/officeDocument/2006/relationships" xmlns:mc="http://schemas.openxmlformats.org/markup-compatibility/2006">
   <w:p>
     <w:pPr>

</xml_diff>

<commit_message>
Paperback: no page numbers on front matter, only from chapters
</commit_message>
<xml_diff>
--- a/kdp-files/difficult_conversations_paperback.docx
+++ b/kdp-files/difficult_conversations_paperback.docx
@@ -1093,13 +1093,9 @@
       <w:pPr>
         <w:ind w:left="0" w:firstLine="0"/>
         <w:sectPr>
-          <w:footerReference w:type="even" r:id="rId13"/>
-          <w:footerReference w:type="first" r:id="rId12"/>
-          <w:footerReference w:type="default" r:id="rId11"/>
           <w:type w:val="oddPage"/>
           <w:pgSz w:w="8640" w:h="12960"/>
           <w:pgMar w:top="1080" w:right="720" w:bottom="1080" w:left="1080" w:header="720" w:footer="720" w:gutter="0"/>
-          <w:titlePg/>
           <w:pgNumType w:fmt="decimal" w:start="1"/>
         </w:sectPr>
       </w:pPr>

</xml_diff>

<commit_message>
Paperback: explicit blank page 6 between Contents and Chapter 1
</commit_message>
<xml_diff>
--- a/kdp-files/difficult_conversations_paperback.docx
+++ b/kdp-files/difficult_conversations_paperback.docx
@@ -1087,6 +1087,12 @@
       </w:r>
       <w:r>
         <w:fldChar w:fldCharType="end"/>
+      </w:r>
+    </w:p>
+    <w:p>
+      <w:pPr/>
+      <w:r>
+        <w:br w:type="page"/>
       </w:r>
     </w:p>
     <w:p>

</xml_diff>